<commit_message>
Ajusta motor de auditoria para critérios por público
</commit_message>
<xml_diff>
--- a/01-Planejamento/03-Estrategia_e_Plano/04-Matriz_Planejamento/AN02 – Matriz de planejamento.docx
+++ b/01-Planejamento/03-Estrategia_e_Plano/04-Matriz_Planejamento/AN02 – Matriz de planejamento.docx
@@ -82,7 +82,7 @@
           <w:sz w:val="20"/>
           <w:szCs w:val="20"/>
         </w:rPr>
-        <w:t>JURISDICIONADOS: 84 organizações estaduais (AGENERSA, AGERIO, AGETRANSP, ALERJ, CEASA, CECIERJ, CEDAE, CEHAB, CENTRAL, CEPERJ, CGE, CODERTE, CODIN, DEGASE, DERRJ, DETRAN, DETRO, DPGE, DRM, EMATER, EMOP, FAETEC, FAPERJ, FIA, FIPERJ, FLXIII, FMIS, FS, FSC, FTM, FUNARJ, GSI, IEEA, INEA, IOERJ, IPEM, IRM, ISP, ITERJ, IVB, JUCERJA, LOTERJ, MPERJ, PESAGRO, PGE, PROCON, PRODERJ, RIOPREVIDENCIA, RIOTRILHOS, RJPREV, SEAP, SEAPPA, SECC, SECEC, SECID, SECTI, SEDCON, SEDEC, SEDEICS, SEDSDH, SEEDUC, SEEL, SEENEMAR, SEFAZ, SEGOV, SEHAB, SEIJES, SEINFRA, SEPLAG, SEPM, SEPOL, SERGB, SES, SESP, SETD, SETRAB, SETRANS, SETUR, SUDERJ, TCE-RJ, TJRJ, TURISRIO, UENF e UERJ) e 35 prefeituras municipais (Angra dos Reis, Araruama, Armação dos Búzios, Arraial do Cabo, Barra do Piraí, Belford Roxo, Cabo Frio, Campos dos Goytacazes, Casimiro de Abreu, Duque de Caxias, Guapimirim, Itaguaí, Japeri, Macaé, Magé, Maricá, Mesquita, Niterói, Nova Friburgo, Nova Iguaçu, Paraty, Petrópolis, Porto Real, Quatis, Queimados, Quissamã, Rio das Ostras, São Gonçalo, São João da Barra, São João de Meriti, São Pedro da Aldeia, Saquarema, Seropédica, Teresópolis e Volta Redonda).</w:t>
+        <w:t>JURISDICIONADOS: 119 organizações estaduais e municipais</w:t>
       </w:r>
     </w:p>
     <w:tbl>
@@ -956,7 +956,7 @@
                 <w:sz w:val="18"/>
                 <w:szCs w:val="18"/>
               </w:rPr>
-              <w:t>- S1.1: Ausência de área, unidade, setor ou função de TIC formalmente instituída.; Referências: R1.1, P1, E1; Critérios: C1, C7; Encaminhamento: formalize a área, unidade, setor ou função de TIC em instrumento compatível com a organização, definindo vinculação e responsabilidades essenciais de modo compatível com o porte, a complexidade e a dependência tecnológica da organização</w:t>
+              <w:t>- S1.1: Ausência de área, unidade, setor ou função de TIC formalmente instituída.; Referências: R1.1, P1, E1; Critérios: C1, C7; Tipo: Recomendação; Encaminhamento: formalize a área, unidade, setor ou função de TIC em instrumento compatível com a organização, definindo vinculação e responsabilidades essenciais de modo compatível com o porte, a complexidade e a dependência tecnológica da organização</w:t>
             </w:r>
           </w:p>
           <w:p ns2:paraId="11118515" ns2:textId="02403B9E">
@@ -980,7 +980,7 @@
                 <w:sz w:val="18"/>
                 <w:szCs w:val="18"/>
               </w:rPr>
-              <w:t>- S1.2: Área de TIC sem atribuições formalmente definidas ou sem atribuições formais de gestão de TIC.; Referências: R1.2, P3, E3, P4, E4; Critérios: C2, C7; Encaminhamento: defina formalmente as atribuições da área de TIC, atentando-se, minimamente, em abranger as atividades de planejamento, coordenação, gestão e controle da TIC</w:t>
+              <w:t>- S1.2: Área de TIC sem atribuições formalmente definidas ou sem atribuições formais de gestão de TIC.; Referências: R1.2, P3, E3, P4, E4; Critérios: C2, C7; Tipo: Recomendação; Encaminhamento: defina formalmente as atribuições da área de TIC, atentando-se, minimamente, em abranger as atividades de planejamento, coordenação, gestão e controle da TIC</w:t>
             </w:r>
           </w:p>
           <w:p ns2:paraId="11118515" ns2:textId="02403B9E">
@@ -1004,7 +1004,7 @@
                 <w:sz w:val="18"/>
                 <w:szCs w:val="18"/>
               </w:rPr>
-              <w:t>- S1.3: Posicionamento organizacional inadequado da área de TIC.; Referências: R1.3, P5, E5; Critérios: C3, C6; Encaminhamento: avalie o posicionamento organizacional da área de TIC e adote, quando necessário, medidas para assegurar interlocução adequada com a alta administração e participação nas decisões estratégicas, orçamentárias, contratuais e de gestão de riscos relacionadas à tecnologia da informação.</w:t>
+              <w:t>- S1.3: Posicionamento organizacional inadequado da área de TIC.; Referências: R1.3, P5, E5; Critérios: C3, C6; Tipo: Recomendação; Encaminhamento: avalie o posicionamento organizacional da área de TIC e adote, quando necessário, medidas para assegurar interlocução adequada com a alta administração e participação nas decisões estratégicas, orçamentárias, contratuais e de gestão de riscos relacionadas à tecnologia da informação.</w:t>
             </w:r>
           </w:p>
         </w:tc>
@@ -1983,7 +1983,7 @@
                 <w:sz w:val="18"/>
                 <w:szCs w:val="18"/>
               </w:rPr>
-              <w:t>- S2.1: Ausência de objetivos, indicadores ou metas para a gestão de TIC.; Referências: R2.1, P1, E1, P2, E2; Critérios: C2; Encaminhamento: estabeleça objetivos, indicadores e metas para a gestão de TIC, de modo a possibilitar o acompanhamento periódico do desempenho da TIC pela alta administração</w:t>
+              <w:t>- S2.1: Ausência de objetivos, indicadores ou metas para a gestão de TIC.; Referências: R2.1, P1, E1, P2, E2; Critérios: C2; Tipo: Recomendação; Encaminhamento: estabeleça objetivos, indicadores e metas para a gestão de TIC, de modo a possibilitar o acompanhamento periódico do desempenho da TIC pela alta administração</w:t>
             </w:r>
           </w:p>
           <w:p ns2:paraId="11118515" ns2:textId="02403B9E">
@@ -2007,7 +2007,7 @@
                 <w:sz w:val="18"/>
                 <w:szCs w:val="18"/>
               </w:rPr>
-              <w:t>- S2.2: Comitê de TIC ou instância equivalente não instituído formalmente ou sem representação de áreas relevantes da organização.; Referências: R2.2, P3, E3, P4, E4; Critérios: C1, C3, C4; Encaminhamento: institua formalmente Comitê de TIC ou instância colegiada equivalente, compatível com o porte e a estrutura decisória da organização, definindo em seu ato constitutivo, minimamente, a participação de representantes de áreas relevantes da organização, suas competências, a periodicidade de reuniões, a forma de registro das deliberações e os mecanismos de acompanhamento dos encaminhamentos</w:t>
+              <w:t>- S2.2: Comitê de TIC ou instância equivalente não instituído formalmente ou sem representação de áreas relevantes da organização.; Referências: R2.2, P3, E3, P4, E4; Critérios: C1, C3, C4; Tipo: Determinação; Encaminhamento: institua formalmente Comitê de TIC ou instância colegiada equivalente, compatível com o porte e a estrutura decisória da organização, definindo em seu ato constitutivo, minimamente, a participação de representantes de áreas relevantes da organização, suas competências, a periodicidade de reuniões, a forma de registro das deliberações e os mecanismos de acompanhamento dos encaminhamentos</w:t>
             </w:r>
           </w:p>
           <w:p ns2:paraId="11118515" ns2:textId="02403B9E">
@@ -2031,7 +2031,7 @@
                 <w:sz w:val="18"/>
                 <w:szCs w:val="18"/>
               </w:rPr>
-              <w:t>- S2.3: Comitê de TIC ou instância equivalente sem atuação efetiva comprovada.; Referências: R2.3, P5, E5, P6, E6; Critérios: C1, C3, C4; Encaminhamento: assegure o funcionamento efetivo do Comitê de TIC ou instância colegiada equivalente, mediante o exercício das competências previstas em seu ato constitutivo, com registro das deliberações e acompanhamento dos respectivos encaminhamentos</w:t>
+              <w:t>- S2.3: Comitê de TIC ou instância equivalente sem atuação efetiva comprovada.; Referências: R2.3, P5, E5, P6, E6; Critérios: C1, C3, C4; Tipo: Determinação; Encaminhamento: assegure o funcionamento efetivo do Comitê de TIC ou instância colegiada equivalente, mediante o exercício das competências previstas em seu ato constitutivo, com registro das deliberações e acompanhamento dos respectivos encaminhamentos</w:t>
             </w:r>
           </w:p>
         </w:tc>
@@ -3261,7 +3261,7 @@
                 <w:sz w:val="18"/>
                 <w:szCs w:val="18"/>
               </w:rPr>
-              <w:t>- S3.1: Inexistência ou insuficiência do processo de planejamento de TIC para produzir e manter plano de TIC adequado.; Referências: R3.1, P1, E1, P2, E2, P3, E3; Critérios: C1, C3, C4; Encaminhamento: institua processo formal de planejamento de TIC, compatível com o porte e a complexidade da organização, que assegure a elaboração e manutenção de plano de TIC, atentando-se, minimamente, em definir etapas, responsabilidades e participação das áreas demandantes</w:t>
+              <w:t>- S3.1: Inexistência ou insuficiência do processo de planejamento de TIC para produzir e manter plano de TIC adequado.; Referências: R3.1, P1, E1, P2, E2, P3, E3; Critérios: C1, C3, C4; Tipo: Determinação; Encaminhamento: institua processo formal de planejamento de TIC, compatível com o porte e a complexidade da organização, que assegure a elaboração e manutenção de plano de TIC, atentando-se, minimamente, em definir etapas, responsabilidades e participação das áreas demandantes</w:t>
             </w:r>
           </w:p>
           <w:p ns2:paraId="11118515" ns2:textId="02403B9E">
@@ -3285,7 +3285,7 @@
                 <w:sz w:val="18"/>
                 <w:szCs w:val="18"/>
               </w:rPr>
-              <w:t>- S3.2: Ausência de aprovação formal do plano de TIC.; Referências: R3.2, P4, E4, P5, E5; Critérios: C3, C4; Encaminhamento: submeta o plano de TIC à aprovação formal do dirigente máximo ou de instância competente da alta administração, mantendo registro do respectivo ato de aprovação</w:t>
+              <w:t>- S3.2: Ausência de aprovação formal do plano de TIC.; Referências: R3.2, P4, E4, P5, E5; Critérios: C3, C4; Tipo: Determinação; Encaminhamento: submeta o plano de TIC à aprovação formal do dirigente máximo ou de instância competente da alta administração, mantendo registro do respectivo ato de aprovação</w:t>
             </w:r>
           </w:p>
           <w:p ns2:paraId="11118515" ns2:textId="02403B9E">
@@ -3309,7 +3309,7 @@
                 <w:sz w:val="18"/>
                 <w:szCs w:val="18"/>
               </w:rPr>
-              <w:t>- S3.4: Plano de TIC sem alinhamento adequado ao planejamento institucional.; Referências: R3.4, P7, E7; Critérios: C1, C3, C4; Encaminhamento: revise o plano de TIC para explicitar seu alinhamento ao planejamento institucional, às diretrizes superiores e às necessidades das áreas finalísticas e administrativas, relacionando objetivos, iniciativas, indicadores e metas de TIC aos resultados institucionais pretendidos</w:t>
+              <w:t>- S3.4: Plano de TIC sem alinhamento adequado ao planejamento institucional.; Referências: R3.4, P7, E7; Critérios: C1, C3, C4; Tipo: Determinação; Encaminhamento: revise o plano de TIC para explicitar seu alinhamento ao planejamento institucional, às diretrizes superiores e às necessidades das áreas finalísticas e administrativas, relacionando objetivos, iniciativas, indicadores e metas de TIC aos resultados institucionais pretendidos</w:t>
             </w:r>
           </w:p>
           <w:p ns2:paraId="11118515" ns2:textId="02403B9E">
@@ -3333,7 +3333,7 @@
                 <w:sz w:val="18"/>
                 <w:szCs w:val="18"/>
               </w:rPr>
-              <w:t>- S3.5: Plano de TIC não utilizado como referência para a elaboração da proposta orçamentária e do plano de contratações.; Referências: R3.5, P8, E8; Critérios: C2, C4; Encaminhamento: integre o plano de TIC à elaboração da proposta orçamentária e do plano de contratações, de maneira proporcional ao porte, à estrutura e à capacidade de planejamento da organização</w:t>
+              <w:t>- S3.5: Plano de TIC não utilizado como referência para a elaboração da proposta orçamentária e do plano de contratações.; Referências: R3.5, P8, E8; Critérios: C2, C4; Tipo: Determinação; Encaminhamento: integre o plano de TIC à elaboração da proposta orçamentária e do plano de contratações, de maneira proporcional ao porte, à estrutura e à capacidade de planejamento da organização</w:t>
             </w:r>
           </w:p>
           <w:p ns2:paraId="11118515" ns2:textId="02403B9E">
@@ -3357,7 +3357,7 @@
                 <w:sz w:val="18"/>
                 <w:szCs w:val="18"/>
               </w:rPr>
-              <w:t>- S3.6: Ausência de acompanhamento da execução do plano de TIC.; Referências: R3.6, P9, E9; Critérios: C4; Encaminhamento: estabeleça e execute rotina periódica de acompanhamento da execução do plano de TIC, promovendo sua revisão periódica e os ajustes ou atualizações necessários, com registro das principais decisões e reprogramações</w:t>
+              <w:t>- S3.6: Ausência de acompanhamento da execução do plano de TIC.; Referências: R3.6, P9, E9; Critérios: C4; Tipo: Determinação; Encaminhamento: estabeleça e execute rotina periódica de acompanhamento da execução do plano de TIC, promovendo sua revisão periódica e os ajustes ou atualizações necessários, com registro das principais decisões e reprogramações</w:t>
             </w:r>
           </w:p>
         </w:tc>
@@ -4362,7 +4362,7 @@
                 <w:sz w:val="18"/>
                 <w:szCs w:val="18"/>
               </w:rPr>
-              <w:t>- S4.1: Ausência de força de trabalho dedicada à TIC.; Referências: R4.1, P1, E1; Critérios: C2, C13; Encaminhamento: avalie a força de trabalho dedicada à TIC e adote medidas proporcionais para assegurar capacidade mínima de planejamento, gestão, proteção, contratação, fiscalização e sustentação dos serviços e ativos de TIC</w:t>
+              <w:t>- S4.1: Ausência de força de trabalho dedicada à TIC.; Referências: R4.1, P1, E1; Critérios: C2, C13; Tipo: Recomendação; Encaminhamento: avalie a força de trabalho dedicada à TIC e adote medidas proporcionais para assegurar capacidade mínima de planejamento, gestão, proteção, contratação, fiscalização e sustentação dos serviços e ativos de TIC</w:t>
             </w:r>
           </w:p>
           <w:p ns2:paraId="11118515" ns2:textId="02403B9E">
@@ -4386,7 +4386,7 @@
                 <w:sz w:val="18"/>
                 <w:szCs w:val="18"/>
               </w:rPr>
-              <w:t>- S4.2: Ausência ou insuficiência de definição documentada do quantitativo necessário de pessoal de TIC e segurança da informação.; Referências: R4.2, P2, E2; Critérios: C5, C12; Encaminhamento: estime e mantenha atualizado o quantitativo necessário de pessoal de TIC e segurança da informação, considerando o porte e a complexidade da organização, os serviços críticos, os sistemas mantidos, as contratações vigentes e os riscos relevantes</w:t>
+              <w:t>- S4.2: Ausência ou insuficiência de definição documentada do quantitativo necessário de pessoal de TIC e segurança da informação.; Referências: R4.2, P2, E2; Critérios: C5, C12; Tipo: Recomendação; Encaminhamento: estime e mantenha atualizado o quantitativo necessário de pessoal de TIC e segurança da informação, considerando o porte e a complexidade da organização, os serviços críticos, os sistemas mantidos, as contratações vigentes e os riscos relevantes</w:t>
             </w:r>
           </w:p>
           <w:p ns2:paraId="11118515" ns2:textId="02403B9E">
@@ -4410,7 +4410,7 @@
                 <w:sz w:val="18"/>
                 <w:szCs w:val="18"/>
               </w:rPr>
-              <w:t>- S4.3: Ausência de cargos ou funções formalmente atribuídos à TIC ou à segurança da informação.; Referências: R4.3, P3, E3; Critérios: C1, C2; Encaminhamento: avalie a necessidade de formalizar a atribuição de cargos ou funções à TIC e à segurança da informação e adote solução compatível com as necessidades institucionais e a capacidade administrativa da organização</w:t>
+              <w:t>- S4.3: Ausência de cargos ou funções formalmente atribuídos à TIC ou à segurança da informação.; Referências: R4.3, P3, E3; Critérios: C1, C2; Tipo: Recomendação; Encaminhamento: avalie a necessidade de formalizar a atribuição de cargos ou funções à TIC e à segurança da informação e adote solução compatível com as necessidades institucionais e a capacidade administrativa da organização</w:t>
             </w:r>
           </w:p>
           <w:p ns2:paraId="11118515" ns2:textId="02403B9E">
@@ -4434,7 +4434,7 @@
                 <w:sz w:val="18"/>
                 <w:szCs w:val="18"/>
               </w:rPr>
-              <w:t>- S4.6: Operação de TIC predominantemente terceirizada sem profissionais internos de TIC.; Referências: R4.6, P7, E7; Critérios: C6, C14; Encaminhamento: avalie o modelo de operação de TIC e adote medidas proporcionais para assegurar capacidade interna suficiente para coordenar, supervisionar e fiscalizar as atividades e os contratos de TIC executados predominantemente por terceiros, preservando responsabilização e retenção de conhecimento</w:t>
+              <w:t>- S4.6: Operação de TIC predominantemente terceirizada sem profissionais internos de TIC.; Referências: R4.6, P7, E7; Critérios: C6, C14; Tipo: Recomendação; Encaminhamento: avalie o modelo de operação de TIC e adote medidas proporcionais para assegurar capacidade interna suficiente para coordenar, supervisionar e fiscalizar as atividades e os contratos de TIC executados predominantemente por terceiros, preservando responsabilização e retenção de conhecimento</w:t>
             </w:r>
           </w:p>
         </w:tc>
@@ -6015,7 +6015,7 @@
                 <w:sz w:val="18"/>
                 <w:szCs w:val="18"/>
               </w:rPr>
-              <w:t>- S5.1: Inexistência ou insuficiência do catálogo de serviços de TIC.; Referências: R5.1, P1, E1, P2, E2; Critérios: C2, C11, C15; Encaminhamento: institua e mantenha atualizado catálogo de serviços de TIC, atentando-se, minimamente, em identificar os serviços efetivamente prestados, seus responsáveis, usuários, condições de acesso e informações necessárias ao atendimento das áreas demandantes</w:t>
+              <w:t>- S5.1: Inexistência ou insuficiência do catálogo de serviços de TIC.; Referências: R5.1, P1, E1, P2, E2; Critérios: C2, C11, C15; Tipo: Recomendação; Encaminhamento: institua e mantenha atualizado catálogo de serviços de TIC, atentando-se, minimamente, em identificar os serviços efetivamente prestados, seus responsáveis, usuários, condições de acesso e informações necessárias ao atendimento das áreas demandantes</w:t>
             </w:r>
           </w:p>
           <w:p ns2:paraId="11118515" ns2:textId="02403B9E">
@@ -6039,7 +6039,7 @@
                 <w:sz w:val="18"/>
                 <w:szCs w:val="18"/>
               </w:rPr>
-              <w:t>- S5.2: Ausência ou fragilidade na definição e no monitoramento de níveis mínimos de serviço de TIC.; Referências: R5.2, P3, E3, P4, E4; Critérios: C3, C14; Encaminhamento: defina, acorde e monitore níveis de serviço para os serviços de TIC relevantes, estabelecendo metas e mecanismos de acompanhamento de seu cumprimento</w:t>
+              <w:t>- S5.2: Ausência ou fragilidade na definição e no monitoramento de níveis mínimos de serviço de TIC.; Referências: R5.2, P3, E3, P4, E4; Critérios: C3, C14; Tipo: Recomendação; Encaminhamento: defina, acorde e monitore níveis de serviço para os serviços de TIC relevantes, estabelecendo metas e mecanismos de acompanhamento de seu cumprimento</w:t>
             </w:r>
           </w:p>
           <w:p ns2:paraId="11118515" ns2:textId="02403B9E">
@@ -6063,7 +6063,7 @@
                 <w:sz w:val="18"/>
                 <w:szCs w:val="18"/>
               </w:rPr>
-              <w:t>- S5.3: Inventário e controle de dispositivos e softwares de TIC inexistente ou insuficiente.; Referências: R5.3, P5, E5, P6, E6; Critérios: C4, C12; Encaminhamento: estabeleça e mantenha inventário atualizado dos ativos tecnológicos sob gestão da organização, contemplando, minimamente, os dispositivos e softwares utilizados, com informações suficientes para sua identificação e controle</w:t>
+              <w:t>- S5.3: Inventário e controle de dispositivos e softwares de TIC inexistente ou insuficiente.; Referências: R5.3, P5, E5, P6, E6; Critérios: C4, C12; Tipo: Recomendação; Encaminhamento: estabeleça e mantenha inventário atualizado dos ativos tecnológicos sob gestão da organização, contemplando, minimamente, os dispositivos e softwares utilizados, com informações suficientes para sua identificação e controle</w:t>
             </w:r>
           </w:p>
           <w:p ns2:paraId="11118515" ns2:textId="02403B9E">
@@ -6087,7 +6087,7 @@
                 <w:sz w:val="18"/>
                 <w:szCs w:val="18"/>
               </w:rPr>
-              <w:t>- S5.4: Ausência ou fragilidade do processo de gestão de configuração.; Referências: R5.3, P7, E7, P8, E8; Critérios: C6, C12, C16; Encaminhamento: formalize e execute processo de gestão de configuração, atentando-se, minimamente, em manter base, ferramenta ou registro equivalente com os itens de configuração relevantes, seus responsáveis e os relacionamentos entre ativos</w:t>
+              <w:t>- S5.4: Ausência ou fragilidade do processo de gestão de configuração.; Referências: R5.3, P7, E7, P8, E8; Critérios: C6, C12, C16; Tipo: Recomendação; Encaminhamento: formalize e execute processo de gestão de configuração, atentando-se, minimamente, em manter base, ferramenta ou registro equivalente com os itens de configuração relevantes, seus responsáveis e os relacionamentos entre ativos</w:t>
             </w:r>
           </w:p>
           <w:p ns2:paraId="11118515" ns2:textId="02403B9E">
@@ -6111,7 +6111,7 @@
                 <w:sz w:val="18"/>
                 <w:szCs w:val="18"/>
               </w:rPr>
-              <w:t>- S5.5: Inexistência ou fragilidade do processo de gestão de incidentes de TIC.; Referências: R5.4, P9, E9, P10, E10, P12, E12; Critérios: C8, C13, C17; Encaminhamento: formalize e execute processo de gestão de incidentes de TIC, atentando-se, minimamente, em definir papéis, critérios de priorização e escalamento, tratamento de incidentes de serviços e de segurança da informação e registro sistemático e rastreável das ocorrências</w:t>
+              <w:t>- S5.5: Inexistência ou fragilidade do processo de gestão de incidentes de TIC.; Referências: R5.4, P9, E9, P10, E10, P12, E12; Critérios: C8, C13, C17; Tipo: Recomendação; Encaminhamento: formalize e execute processo de gestão de incidentes de TIC, atentando-se, minimamente, em definir papéis, critérios de priorização e escalamento, tratamento de incidentes de serviços e de segurança da informação e registro sistemático e rastreável das ocorrências</w:t>
             </w:r>
           </w:p>
         </w:tc>
@@ -6980,6 +6980,150 @@
               <w:t>C10: Acórdão nº 2.342/2016-TCU-Plenário, item 9.1.7 – Precedente quanto à definição, aprovação e formalização de processo de trabalho para o planejamento de cada contratação, com controles internos mínimos.</w:t>
             </w:r>
           </w:p>
+          <w:p ns2:paraId="2667BB09" ns2:textId="2C1623C1">
+            <w:pPr>
+              <w:pStyle w:val="Default"/>
+              <w:spacing w:after="60"/>
+              <w:jc w:val="both"/>
+              <w:rPr>
+                <w:bCs/>
+                <w:color w:val="auto"/>
+                <w:sz w:val="18"/>
+                <w:szCs w:val="18"/>
+                <w:vertAlign w:val="superscript"/>
+              </w:rPr>
+            </w:pPr>
+            <w:r>
+              <w:rPr>
+                <w:bCs/>
+                <w:color w:val="auto"/>
+                <w:sz w:val="18"/>
+                <w:szCs w:val="18"/>
+                <w:b/>
+              </w:rPr>
+              <w:t>Poder Executivo Estadual</w:t>
+            </w:r>
+          </w:p>
+          <w:p ns2:paraId="2667BB09" ns2:textId="2C1623C1">
+            <w:pPr>
+              <w:pStyle w:val="Default"/>
+              <w:spacing w:after="80"/>
+              <w:jc w:val="both"/>
+              <w:rPr>
+                <w:bCs/>
+                <w:color w:val="auto"/>
+                <w:sz w:val="18"/>
+                <w:szCs w:val="18"/>
+                <w:vertAlign w:val="superscript"/>
+              </w:rPr>
+              <w:ind w:left="240"/>
+            </w:pPr>
+            <w:r>
+              <w:rPr>
+                <w:bCs/>
+                <w:color w:val="auto"/>
+                <w:sz w:val="18"/>
+                <w:szCs w:val="18"/>
+              </w:rPr>
+              <w:t>C11: Decreto Estadual nº 48.816/2023, no âmbito de aplicação do ato — referência específica para a fase preparatória das contratações; não é considerado, isoladamente, fundamento suficiente para determinar a composição mínima da equipe de planejamento.</w:t>
+            </w:r>
+          </w:p>
+          <w:p ns2:paraId="2667BB09" ns2:textId="2C1623C1">
+            <w:pPr>
+              <w:pStyle w:val="Default"/>
+              <w:spacing w:after="60"/>
+              <w:jc w:val="both"/>
+              <w:rPr>
+                <w:bCs/>
+                <w:color w:val="auto"/>
+                <w:sz w:val="18"/>
+                <w:szCs w:val="18"/>
+                <w:vertAlign w:val="superscript"/>
+              </w:rPr>
+            </w:pPr>
+            <w:r>
+              <w:rPr>
+                <w:bCs/>
+                <w:color w:val="auto"/>
+                <w:sz w:val="18"/>
+                <w:szCs w:val="18"/>
+                <w:b/>
+              </w:rPr>
+              <w:t>Poder Judiciário Estadual</w:t>
+            </w:r>
+          </w:p>
+          <w:p ns2:paraId="2667BB09" ns2:textId="2C1623C1">
+            <w:pPr>
+              <w:pStyle w:val="Default"/>
+              <w:spacing w:after="80"/>
+              <w:jc w:val="both"/>
+              <w:rPr>
+                <w:bCs/>
+                <w:color w:val="auto"/>
+                <w:sz w:val="18"/>
+                <w:szCs w:val="18"/>
+                <w:vertAlign w:val="superscript"/>
+              </w:rPr>
+              <w:ind w:left="240"/>
+            </w:pPr>
+            <w:r>
+              <w:rPr>
+                <w:bCs/>
+                <w:color w:val="auto"/>
+                <w:sz w:val="18"/>
+                <w:szCs w:val="18"/>
+              </w:rPr>
+              <w:t>C12: Resolução CNJ nº 468/2022, art. 7º — a equipe de planejamento da contratação de solução de TIC deve ser formalmente instituída e conter integrantes demandante, técnico e administrativo.</w:t>
+            </w:r>
+          </w:p>
+          <w:p ns2:paraId="2667BB09" ns2:textId="2C1623C1">
+            <w:pPr>
+              <w:pStyle w:val="Default"/>
+              <w:spacing w:after="60"/>
+              <w:jc w:val="both"/>
+              <w:rPr>
+                <w:bCs/>
+                <w:color w:val="auto"/>
+                <w:sz w:val="18"/>
+                <w:szCs w:val="18"/>
+                <w:vertAlign w:val="superscript"/>
+              </w:rPr>
+            </w:pPr>
+            <w:r>
+              <w:rPr>
+                <w:bCs/>
+                <w:color w:val="auto"/>
+                <w:sz w:val="18"/>
+                <w:szCs w:val="18"/>
+                <w:b/>
+              </w:rPr>
+              <w:t>Ministério Público Estadual</w:t>
+            </w:r>
+          </w:p>
+          <w:p ns2:paraId="2667BB09" ns2:textId="2C1623C1">
+            <w:pPr>
+              <w:pStyle w:val="Default"/>
+              <w:spacing w:after="80"/>
+              <w:jc w:val="both"/>
+              <w:rPr>
+                <w:bCs/>
+                <w:color w:val="auto"/>
+                <w:sz w:val="18"/>
+                <w:szCs w:val="18"/>
+                <w:vertAlign w:val="superscript"/>
+              </w:rPr>
+              <w:ind w:left="240"/>
+            </w:pPr>
+            <w:r>
+              <w:rPr>
+                <w:bCs/>
+                <w:color w:val="auto"/>
+                <w:sz w:val="18"/>
+                <w:szCs w:val="18"/>
+              </w:rPr>
+              <w:t>C13: Resolução CNMP nº 283/2024, arts. 8º e 9º — a equipe de planejamento da contratação de solução de TIC deve ser instituída com integrante técnico, integrante requisitante e integrante administrativo.</w:t>
+            </w:r>
+          </w:p>
         </w:tc>
         <w:tc>
           <w:tcPr>
@@ -7268,7 +7412,7 @@
                 <w:sz w:val="18"/>
                 <w:szCs w:val="18"/>
               </w:rPr>
-              <w:t>- S6.1: Inexistência ou fragilidade de processo formal e padronizado para o planejamento das contratações de TIC.; Referências: R6.1, R6.2, P1, E1, P2, E2; Critérios: C1, C3, C10; Encaminhamento: formalize e padronize o processo de planejamento das contratações de TIC, definindo etapas, responsabilidades e artefatos aplicáveis, podendo adotar modelos institucionais ou centralizados já existentes e prevendo fluxos proporcionais à natureza, complexidade e risco da contratação</w:t>
+              <w:t>- S6.1: Inexistência ou fragilidade de processo formal e padronizado para o planejamento das contratações de TIC.; Referências: R6.1, R6.2, P1, E1, P2, E2; Critérios: C1, C3, C10; Tipo: Recomendação; Encaminhamento: formalize e padronize o processo de planejamento das contratações de TIC, definindo etapas, responsabilidades e artefatos aplicáveis, podendo adotar modelos institucionais ou centralizados já existentes e prevendo fluxos proporcionais à natureza, complexidade e risco da contratação</w:t>
             </w:r>
           </w:p>
           <w:p ns2:paraId="11118515" ns2:textId="02403B9E">
@@ -7292,7 +7436,7 @@
                 <w:sz w:val="18"/>
                 <w:szCs w:val="18"/>
               </w:rPr>
-              <w:t>- S6.2: Contratações de TIC sem análise prévia e aprovação técnica da área de TIC.; Referências: R6.3, P3, E3, E4; Critérios: C1, C5, C8; Encaminhamento: estabeleça a submissão das contratações de TIC à análise prévia da área de TIC, de modo a verificar a compatibilidade da solução com os padrões tecnológicos, os requisitos institucionais e a arquitetura existente, admitindo procedimentos simplificados e proporcionais à natureza, ao risco e ao valor da contratação, preservada análise técnica compatível</w:t>
+              <w:t>- S6.2: Contratações de TIC sem análise prévia e aprovação técnica da área de TIC.; Referências: R6.3, P3, E3, E4; Critérios: C1, C5, C8; Tipo: Recomendação; Encaminhamento: estabeleça a submissão das contratações de TIC à análise prévia da área de TIC, de modo a verificar a compatibilidade da solução com os padrões tecnológicos, os requisitos institucionais e a arquitetura existente, admitindo procedimentos simplificados e proporcionais à natureza, ao risco e ao valor da contratação, preservada análise técnica compatível</w:t>
             </w:r>
           </w:p>
           <w:p ns2:paraId="11118515" ns2:textId="02403B9E">
@@ -7316,7 +7460,7 @@
                 <w:sz w:val="18"/>
                 <w:szCs w:val="18"/>
               </w:rPr>
-              <w:t>- S6.3: Contratações de TIC sem alinhamento ao planejamento de TIC e ao Plano de Contratações Anual.; Referências: R6.3, P4, E5; Critérios: C1, C2, C9; Encaminhamento: assegure que as contratações de TIC sejam compatíveis com os instrumentos de planejamento de TIC e, quando elaborado, com o Plano de Contratações Anual, promovendo os ajustes ou justificativas cabíveis nos casos excepcionais</w:t>
+              <w:t>- S6.3: Contratações de TIC sem alinhamento ao planejamento de TIC e ao Plano de Contratações Anual.; Referências: R6.3, P4, E5; Critérios: C1, C2, C9; Tipo: Determinação; Encaminhamento: assegure que as contratações de TIC sejam compatíveis com os instrumentos de planejamento de TIC e, quando elaborado, com o Plano de Contratações Anual, promovendo os ajustes ou justificativas cabíveis nos casos excepcionais</w:t>
             </w:r>
           </w:p>
           <w:p ns2:paraId="11118515" ns2:textId="02403B9E">
@@ -7340,7 +7484,85 @@
                 <w:sz w:val="18"/>
                 <w:szCs w:val="18"/>
               </w:rPr>
-              <w:t>- S6.4: Contratações de TIC sem designação de equipe de planejamento com integrante técnico da área de TIC.; Referências: R6.4, P5, E6; Critérios: C1, C4, C8; Encaminhamento: designe formalmente equipe de planejamento para as contratações de TIC, atentando-se, minimamente, em assegurar a participação de integrante da área requisitante e da área técnica de TIC, com definição das responsabilidades de seus integrantes</w:t>
+              <w:t>- S6.4: Contratações de TIC sem designação de equipe de planejamento com integrante técnico da área de TIC.; Referências: R6.4, P5, E6; Critérios: C1, C4, C8; Tipo: Recomendação; Encaminhamento: designe formalmente equipe de planejamento para as contratações de TIC, atentando-se, minimamente, em assegurar a participação de integrante da área requisitante e da área técnica de TIC, com definição das responsabilidades de seus integrantes</w:t>
+            </w:r>
+          </w:p>
+          <w:p ns2:paraId="11118515" ns2:textId="02403B9E">
+            <w:pPr>
+              <w:pStyle w:val="PargrafodaLista"/>
+              <w:numPr>
+                <w:ilvl w:val="0"/>
+                <w:numId w:val="11"/>
+              </w:numPr>
+              <w:rPr>
+                <w:rFonts w:ascii="Arial" w:hAnsi="Arial" w:cs="Arial"/>
+                <w:sz w:val="18"/>
+                <w:szCs w:val="18"/>
+              </w:rPr>
+              <w:ind w:left="600"/>
+              <w:spacing w:after="100"/>
+            </w:pPr>
+            <w:r>
+              <w:rPr>
+                <w:rFonts w:ascii="Arial" w:hAnsi="Arial" w:cs="Arial"/>
+                <w:sz w:val="18"/>
+                <w:szCs w:val="18"/>
+                <w:b/>
+                <w:bCs/>
+              </w:rPr>
+              <w:t>Poder Executivo Estadual: critérios C1, C4, C11; tipo: Recomendação; encaminhamento: designe formalmente equipe de planejamento para as contratações de TIC, atentando-se, minimamente, em assegurar a participação de integrante da área requisitante e da área técnica de TIC, com definição das responsabilidades de seus integrantes</w:t>
+            </w:r>
+          </w:p>
+          <w:p ns2:paraId="11118515" ns2:textId="02403B9E">
+            <w:pPr>
+              <w:pStyle w:val="PargrafodaLista"/>
+              <w:numPr>
+                <w:ilvl w:val="0"/>
+                <w:numId w:val="11"/>
+              </w:numPr>
+              <w:rPr>
+                <w:rFonts w:ascii="Arial" w:hAnsi="Arial" w:cs="Arial"/>
+                <w:sz w:val="18"/>
+                <w:szCs w:val="18"/>
+              </w:rPr>
+              <w:ind w:left="600"/>
+              <w:spacing w:after="100"/>
+            </w:pPr>
+            <w:r>
+              <w:rPr>
+                <w:rFonts w:ascii="Arial" w:hAnsi="Arial" w:cs="Arial"/>
+                <w:sz w:val="18"/>
+                <w:szCs w:val="18"/>
+                <w:b/>
+                <w:bCs/>
+              </w:rPr>
+              <w:t>Poder Judiciário Estadual: critérios C1, C4, C12; tipo: Determinação; encaminhamento: designe formalmente equipe de planejamento para as contratações de TIC, atentando-se, minimamente, em assegurar a participação de integrante da área requisitante e da área técnica de TIC, com definição das responsabilidades de seus integrantes</w:t>
+            </w:r>
+          </w:p>
+          <w:p ns2:paraId="11118515" ns2:textId="02403B9E">
+            <w:pPr>
+              <w:pStyle w:val="PargrafodaLista"/>
+              <w:numPr>
+                <w:ilvl w:val="0"/>
+                <w:numId w:val="11"/>
+              </w:numPr>
+              <w:rPr>
+                <w:rFonts w:ascii="Arial" w:hAnsi="Arial" w:cs="Arial"/>
+                <w:sz w:val="18"/>
+                <w:szCs w:val="18"/>
+              </w:rPr>
+              <w:ind w:left="600"/>
+              <w:spacing w:after="100"/>
+            </w:pPr>
+            <w:r>
+              <w:rPr>
+                <w:rFonts w:ascii="Arial" w:hAnsi="Arial" w:cs="Arial"/>
+                <w:sz w:val="18"/>
+                <w:szCs w:val="18"/>
+                <w:b/>
+                <w:bCs/>
+              </w:rPr>
+              <w:t>Ministério Público Estadual: critérios C1, C4, C13; tipo: Determinação; encaminhamento: designe formalmente equipe de planejamento para as contratações de TIC, atentando-se, minimamente, em assegurar a participação de integrante da área requisitante e da área técnica de TIC, com definição das responsabilidades de seus integrantes</w:t>
             </w:r>
           </w:p>
         </w:tc>

</xml_diff>

<commit_message>
Integra critérios específicos aos relatórios finais
</commit_message>
<xml_diff>
--- a/01-Planejamento/03-Estrategia_e_Plano/04-Matriz_Planejamento/AN02 – Matriz de planejamento.docx
+++ b/01-Planejamento/03-Estrategia_e_Plano/04-Matriz_Planejamento/AN02 – Matriz de planejamento.docx
@@ -856,7 +856,7 @@
                 <w:sz w:val="18"/>
                 <w:szCs w:val="18"/>
               </w:rPr>
-              <w:t>C6: Decreto Estadual nº 47.278/2020 (alterado pelo Decreto nº 48.997/2024), arts. 4º e 6º, I a XI, e Portaria PRODERJ/PRE nº 825/2021, Anexo A, arts. 1º, IX, 8º e 9º — estruturação obrigatória do Sistema Estadual de TIC (SETIC), instituição dos Níveis Setoriais de TIC (NSTIC) e definição das atribuições mínimas da unidade de TIC nos órgãos e entidades do Poder Executivo Estadual.</w:t>
+              <w:t>C6: Decreto Estadual nº 48.997/2024, art. 4º — o nível setorial do SETIC deve ser representado por assessoria de informática ou setor equivalente em cada órgão ou entidade da Administração Direta e Indireta do Poder Executivo Estadual e exercer as competências de TIC previstas no dispositivo.</w:t>
             </w:r>
           </w:p>
           <w:p ns2:paraId="2667BB09" ns2:textId="2C1623C1">
@@ -907,7 +907,7 @@
                 <w:sz w:val="18"/>
                 <w:szCs w:val="18"/>
               </w:rPr>
-              <w:t>C7: Resolução CNJ nº 370/2021, arts. 21 a 23 e Ato Normativo TJ nº 32/2023, arts. 3º e 8º a 10 — dever de estruturação organizacional formal de TIC, com definição de atribuições regimentais e posicionamento compatível no Poder Judiciário Estadual.</w:t>
+              <w:t>C7: Resolução CNJ nº 370/2021, art. 21 — cada órgão do Poder Judiciário deve constituir e manter estruturas organizacionais adequadas e compatíveis com a demanda de TIC, contemplando os macroprocessos mínimos definidos no dispositivo.</w:t>
             </w:r>
           </w:p>
           <w:p ns2:paraId="2667BB09" ns2:textId="2C1623C1">
@@ -958,7 +958,32 @@
                 <w:sz w:val="18"/>
                 <w:szCs w:val="18"/>
               </w:rPr>
-              <w:t>C8: Resolução CNMP nº 171/2017, arts. 9º, 16, 18 e 33 e Resoluções GPGJ nº 2.675/2025 e nº 2.785/2026, arts. 7º a 10 e 13 — instituição formal da unidade de TIC, atribuições de gestão e posicionamento estratégico subordinado à alta administração no Ministério Público Estadual.</w:t>
+              <w:t>C8: Resolução CNMP nº 171/2017, art. 16 — a gestão de TI compete à área de TI da unidade ou do ramo do Ministério Público, à qual são atribuídas as atividades previstas no dispositivo.</w:t>
+            </w:r>
+          </w:p>
+          <w:p ns2:paraId="2667BB09" ns2:textId="2C1623C1">
+            <w:pPr>
+              <w:pStyle w:val="841"/>
+              <w:pBdr/>
+              <w:spacing w:after="80"/>
+              <w:ind w:left="240"/>
+              <w:jc w:val="both"/>
+              <w:rPr>
+                <w:bCs/>
+                <w:color w:val="auto"/>
+                <w:sz w:val="18"/>
+                <w:szCs w:val="18"/>
+                <w:vertAlign w:val="superscript"/>
+              </w:rPr>
+            </w:pPr>
+            <w:r>
+              <w:rPr>
+                <w:bCs/>
+                <w:color w:val="auto"/>
+                <w:sz w:val="18"/>
+                <w:szCs w:val="18"/>
+              </w:rPr>
+              <w:t>C9: Resolução GPGJ nº 2.675/2025, art. 1º — a Secretaria-Geral de Modernização Tecnológica e Inovação do MPRJ é diretamente subordinada ao Procurador-Geral de Justiça.</w:t>
             </w:r>
           </w:p>
         </w:tc>
@@ -1942,7 +1967,7 @@
                 <w:sz w:val="18"/>
                 <w:szCs w:val="18"/>
               </w:rPr>
-              <w:t>Poder Executivo Estadual: [C3, C6];</w:t>
+              <w:t>Ministério Público Estadual: [C3, C9];</w:t>
             </w:r>
           </w:p>
           <w:p ns2:paraId="11118515" ns2:textId="02403B9E">
@@ -1969,169 +1994,7 @@
                 <w:sz w:val="18"/>
                 <w:szCs w:val="18"/>
               </w:rPr>
-              <w:t>Tipo: Recomendação;</w:t>
-            </w:r>
-          </w:p>
-          <w:p ns2:paraId="11118515" ns2:textId="02403B9E">
-            <w:pPr>
-              <w:pStyle w:val="843"/>
-              <w:numPr>
-                <w:ilvl w:val="0"/>
-                <w:numId w:val="11"/>
-              </w:numPr>
-              <w:pBdr/>
-              <w:spacing w:after="100"/>
-              <w:ind w:left="1080"/>
-              <w:rPr>
-                <w:rFonts w:ascii="Arial" w:hAnsi="Arial" w:cs="Arial"/>
-                <w:sz w:val="18"/>
-                <w:szCs w:val="18"/>
-              </w:rPr>
-            </w:pPr>
-            <w:r>
-              <w:rPr>
-                <w:rFonts w:ascii="Arial" w:hAnsi="Arial" w:cs="Arial"/>
-                <w:b/>
-                <w:bCs/>
-                <w:sz w:val="18"/>
-                <w:szCs w:val="18"/>
-              </w:rPr>
-              <w:t>Encaminhamento: avalie o posicionamento organizacional da área de TIC e adote, quando necessário, medidas para assegurar interlocução adequada com a alta administração e participação nas decisões estratégicas, orçamentárias, contratuais e de gestão de riscos relacionadas à tecnologia da informação.</w:t>
-            </w:r>
-          </w:p>
-          <w:p ns2:paraId="11118515" ns2:textId="02403B9E">
-            <w:pPr>
-              <w:pStyle w:val="843"/>
-              <w:numPr>
-                <w:ilvl w:val="0"/>
-                <w:numId w:val="11"/>
-              </w:numPr>
-              <w:pBdr/>
-              <w:spacing w:after="40"/>
-              <w:ind w:left="720"/>
-              <w:rPr>
-                <w:rFonts w:ascii="Arial" w:hAnsi="Arial" w:cs="Arial"/>
-                <w:sz w:val="18"/>
-                <w:szCs w:val="18"/>
-              </w:rPr>
-            </w:pPr>
-            <w:r>
-              <w:rPr>
-                <w:rFonts w:ascii="Arial" w:hAnsi="Arial" w:cs="Arial"/>
-                <w:b/>
-                <w:bCs/>
-                <w:sz w:val="18"/>
-                <w:szCs w:val="18"/>
-              </w:rPr>
-              <w:t>Poder Judiciário Estadual: [C3, C7];</w:t>
-            </w:r>
-          </w:p>
-          <w:p ns2:paraId="11118515" ns2:textId="02403B9E">
-            <w:pPr>
-              <w:pStyle w:val="843"/>
-              <w:numPr>
-                <w:ilvl w:val="0"/>
-                <w:numId w:val="11"/>
-              </w:numPr>
-              <w:pBdr/>
-              <w:spacing w:after="40"/>
-              <w:ind w:left="1080"/>
-              <w:rPr>
-                <w:rFonts w:ascii="Arial" w:hAnsi="Arial" w:cs="Arial"/>
-                <w:sz w:val="18"/>
-                <w:szCs w:val="18"/>
-              </w:rPr>
-            </w:pPr>
-            <w:r>
-              <w:rPr>
-                <w:rFonts w:ascii="Arial" w:hAnsi="Arial" w:cs="Arial"/>
-                <w:b/>
-                <w:bCs/>
-                <w:sz w:val="18"/>
-                <w:szCs w:val="18"/>
-              </w:rPr>
-              <w:t>Tipo: Recomendação;</w:t>
-            </w:r>
-          </w:p>
-          <w:p ns2:paraId="11118515" ns2:textId="02403B9E">
-            <w:pPr>
-              <w:pStyle w:val="843"/>
-              <w:numPr>
-                <w:ilvl w:val="0"/>
-                <w:numId w:val="11"/>
-              </w:numPr>
-              <w:pBdr/>
-              <w:spacing w:after="100"/>
-              <w:ind w:left="1080"/>
-              <w:rPr>
-                <w:rFonts w:ascii="Arial" w:hAnsi="Arial" w:cs="Arial"/>
-                <w:sz w:val="18"/>
-                <w:szCs w:val="18"/>
-              </w:rPr>
-            </w:pPr>
-            <w:r>
-              <w:rPr>
-                <w:rFonts w:ascii="Arial" w:hAnsi="Arial" w:cs="Arial"/>
-                <w:b/>
-                <w:bCs/>
-                <w:sz w:val="18"/>
-                <w:szCs w:val="18"/>
-              </w:rPr>
-              <w:t>Encaminhamento: avalie o posicionamento organizacional da área de TIC e adote, quando necessário, medidas para assegurar interlocução adequada com a alta administração e participação nas decisões estratégicas, orçamentárias, contratuais e de gestão de riscos relacionadas à tecnologia da informação.</w:t>
-            </w:r>
-          </w:p>
-          <w:p ns2:paraId="11118515" ns2:textId="02403B9E">
-            <w:pPr>
-              <w:pStyle w:val="843"/>
-              <w:numPr>
-                <w:ilvl w:val="0"/>
-                <w:numId w:val="11"/>
-              </w:numPr>
-              <w:pBdr/>
-              <w:spacing w:after="40"/>
-              <w:ind w:left="720"/>
-              <w:rPr>
-                <w:rFonts w:ascii="Arial" w:hAnsi="Arial" w:cs="Arial"/>
-                <w:sz w:val="18"/>
-                <w:szCs w:val="18"/>
-              </w:rPr>
-            </w:pPr>
-            <w:r>
-              <w:rPr>
-                <w:rFonts w:ascii="Arial" w:hAnsi="Arial" w:cs="Arial"/>
-                <w:b/>
-                <w:bCs/>
-                <w:sz w:val="18"/>
-                <w:szCs w:val="18"/>
-              </w:rPr>
-              <w:t>Ministério Público Estadual: [C3, C8];</w:t>
-            </w:r>
-          </w:p>
-          <w:p ns2:paraId="11118515" ns2:textId="02403B9E">
-            <w:pPr>
-              <w:pStyle w:val="843"/>
-              <w:numPr>
-                <w:ilvl w:val="0"/>
-                <w:numId w:val="11"/>
-              </w:numPr>
-              <w:pBdr/>
-              <w:spacing w:after="40"/>
-              <w:ind w:left="1080"/>
-              <w:rPr>
-                <w:rFonts w:ascii="Arial" w:hAnsi="Arial" w:cs="Arial"/>
-                <w:sz w:val="18"/>
-                <w:szCs w:val="18"/>
-              </w:rPr>
-            </w:pPr>
-            <w:r>
-              <w:rPr>
-                <w:rFonts w:ascii="Arial" w:hAnsi="Arial" w:cs="Arial"/>
-                <w:b/>
-                <w:bCs/>
-                <w:sz w:val="18"/>
-                <w:szCs w:val="18"/>
-              </w:rPr>
-              <w:t>Tipo: Recomendação;</w:t>
+              <w:t>Tipo: Determinação;</w:t>
             </w:r>
           </w:p>
           <w:p ns2:paraId="11118515" ns2:textId="02403B9E">
@@ -2863,7 +2726,7 @@
                 <w:sz w:val="18"/>
                 <w:szCs w:val="18"/>
               </w:rPr>
-              <w:t>C3: Decreto nº 12.198/2024, arts. 5º e 6º, § 2º – Referência de governança digital: instituição, no âmbito da Administração Pública federal direta, autárquica e fundacional, de Comitê de Governança Digital ou colegiado equivalente com função deliberativa sobre ações de governo digital e uso de recursos de TIC, incluindo a aprovação dos instrumentos de planejamento previstos no Decreto.</w:t>
+              <w:t>C3: Decreto nº 12.198/2024, art. 6º, § 2º — referência de governança digital quanto à atribuição, a Comitê de Governança Digital ou colegiado equivalente, de deliberar sobre ações de governo digital e uso de recursos de TIC.</w:t>
             </w:r>
           </w:p>
           <w:p ns2:paraId="2667BB09" ns2:textId="2C1623C1">
@@ -2888,7 +2751,7 @@
                 <w:sz w:val="18"/>
                 <w:szCs w:val="18"/>
               </w:rPr>
-              <w:t>C4: Acórdão TCE-RJ nº 44.490/2024-PLEN, itens II.1, III.1 e V.1 – Precedente pela instituição e atuação efetiva de instância colegiada de governança de TIC, com responsabilidade pelo alinhamento das ações de TIC aos objetivos institucionais, priorização dos investimentos e monitoramento do desempenho da TIC.</w:t>
+              <w:t>C4: Acórdão TCE-RJ nº 44.490/2024-PLEN, item II.1 — precedente pela instituição e atuação efetiva de instância colegiada de governança de TIC, com responsabilidade pelo alinhamento das ações de TIC aos objetivos institucionais, pela priorização dos investimentos e pelo monitoramento do desempenho da TIC.</w:t>
             </w:r>
           </w:p>
           <w:p ns2:paraId="2667BB09" ns2:textId="2C1623C1">
@@ -2939,7 +2802,7 @@
                 <w:sz w:val="18"/>
                 <w:szCs w:val="18"/>
               </w:rPr>
-              <w:t>C5: Portaria PRODERJ/PRE nº 825/2021, Anexo C, arts. 2º, 5º, 6º, 13 e 14 e Decreto Estadual nº 46.644/2019, arts. 3º e 4º — instituição obrigatória do Comitê Permanente do PEDTIC com composição multidisciplinar, definição de metas, indicadores e registros formais das deliberações no Poder Executivo Estadual.</w:t>
+              <w:t>C5: Portaria PRODERJ/PRE nº 825/2021, Anexo C, art. 5º — cada órgão ou entidade do Poder Executivo Estadual deve instituir Comitê Permanente do PEDTIC com a composição multidisciplinar definida no dispositivo.</w:t>
             </w:r>
           </w:p>
           <w:p ns2:paraId="2667BB09" ns2:textId="2C1623C1">
@@ -2990,7 +2853,7 @@
                 <w:sz w:val="18"/>
                 <w:szCs w:val="18"/>
               </w:rPr>
-              <w:t>C6: Resolução CNJ nº 370/2021, arts. 7º, 8º, 42, 44, 46 e 48 e Atos Normativos TJ nº 27/2022 e nº 32/2023 — instituição obrigatória do Comitê de Governança de TIC (CGTIC), metas, indicadores estratégicos e reuniões periódicas no Poder Judiciário Estadual.</w:t>
+              <w:t>C6: Resolução CNJ nº 370/2021, art. 7º — cada órgão do Poder Judiciário deve constituir ou manter Comitê de Governança de TIC multidisciplinar, com a composição e as atribuições definidas no dispositivo.</w:t>
             </w:r>
           </w:p>
           <w:p ns2:paraId="2667BB09" ns2:textId="2C1623C1">
@@ -3041,7 +2904,134 @@
                 <w:sz w:val="18"/>
                 <w:szCs w:val="18"/>
               </w:rPr>
-              <w:t>C7: Resolução CNMP nº 171/2017, arts. 11 a 14 e Resoluções GPGJ nº 2.540/2023 e nº 2.785/2026 — instituição obrigatória do Comitê Estratégico de TI (CETI), metas, reuniões trimestrais e relatório anual no Ministério Público Estadual.</w:t>
+              <w:t>C7: Resolução CNMP nº 171/2017, art. 13 — cada unidade ou ramo do Ministério Público deve dispor de Comitê Estratégico de TI com a composição mínima definida no dispositivo.</w:t>
+            </w:r>
+          </w:p>
+          <w:p ns2:paraId="2667BB09" ns2:textId="2C1623C1">
+            <w:pPr>
+              <w:pStyle w:val="841"/>
+              <w:pBdr/>
+              <w:spacing w:after="60"/>
+              <w:ind/>
+              <w:jc w:val="both"/>
+              <w:rPr>
+                <w:bCs/>
+                <w:color w:val="auto"/>
+                <w:sz w:val="18"/>
+                <w:szCs w:val="18"/>
+                <w:vertAlign w:val="superscript"/>
+              </w:rPr>
+            </w:pPr>
+            <w:r>
+              <w:rPr>
+                <w:bCs/>
+                <w:color w:val="auto"/>
+                <w:sz w:val="18"/>
+                <w:szCs w:val="18"/>
+                <w:b/>
+              </w:rPr>
+              <w:t>Poder Judiciário Estadual</w:t>
+            </w:r>
+          </w:p>
+          <w:p ns2:paraId="2667BB09" ns2:textId="2C1623C1">
+            <w:pPr>
+              <w:pStyle w:val="841"/>
+              <w:pBdr/>
+              <w:spacing w:after="80"/>
+              <w:ind w:left="240"/>
+              <w:jc w:val="both"/>
+              <w:rPr>
+                <w:bCs/>
+                <w:color w:val="auto"/>
+                <w:sz w:val="18"/>
+                <w:szCs w:val="18"/>
+                <w:vertAlign w:val="superscript"/>
+              </w:rPr>
+            </w:pPr>
+            <w:r>
+              <w:rPr>
+                <w:bCs/>
+                <w:color w:val="auto"/>
+                <w:sz w:val="18"/>
+                <w:szCs w:val="18"/>
+              </w:rPr>
+              <w:t>C8: Resolução CNJ nº 370/2021, art. 7º, inciso I — o Comitê de Governança de TIC deve apoiar o desenvolvimento e o estabelecimento de estratégias, indicadores e metas institucionais.</w:t>
+            </w:r>
+          </w:p>
+          <w:p ns2:paraId="2667BB09" ns2:textId="2C1623C1">
+            <w:pPr>
+              <w:pStyle w:val="841"/>
+              <w:pBdr/>
+              <w:spacing w:after="60"/>
+              <w:ind/>
+              <w:jc w:val="both"/>
+              <w:rPr>
+                <w:bCs/>
+                <w:color w:val="auto"/>
+                <w:sz w:val="18"/>
+                <w:szCs w:val="18"/>
+                <w:vertAlign w:val="superscript"/>
+              </w:rPr>
+            </w:pPr>
+            <w:r>
+              <w:rPr>
+                <w:bCs/>
+                <w:color w:val="auto"/>
+                <w:sz w:val="18"/>
+                <w:szCs w:val="18"/>
+                <w:b/>
+              </w:rPr>
+              <w:t>Ministério Público Estadual</w:t>
+            </w:r>
+          </w:p>
+          <w:p ns2:paraId="2667BB09" ns2:textId="2C1623C1">
+            <w:pPr>
+              <w:pStyle w:val="841"/>
+              <w:pBdr/>
+              <w:spacing w:after="80"/>
+              <w:ind w:left="240"/>
+              <w:jc w:val="both"/>
+              <w:rPr>
+                <w:bCs/>
+                <w:color w:val="auto"/>
+                <w:sz w:val="18"/>
+                <w:szCs w:val="18"/>
+                <w:vertAlign w:val="superscript"/>
+              </w:rPr>
+            </w:pPr>
+            <w:r>
+              <w:rPr>
+                <w:bCs/>
+                <w:color w:val="auto"/>
+                <w:sz w:val="18"/>
+                <w:szCs w:val="18"/>
+              </w:rPr>
+              <w:t>C9: Resolução CNMP nº 171/2017, art. 11, § 1º — o PETI deve conter contribuições da TI para os objetivos estratégicos, indicadores de resultado e, pelo menos, uma meta para cada indicador.</w:t>
+            </w:r>
+          </w:p>
+          <w:p ns2:paraId="2667BB09" ns2:textId="2C1623C1">
+            <w:pPr>
+              <w:pStyle w:val="841"/>
+              <w:pBdr/>
+              <w:spacing w:after="80"/>
+              <w:ind w:left="240"/>
+              <w:jc w:val="both"/>
+              <w:rPr>
+                <w:bCs/>
+                <w:color w:val="auto"/>
+                <w:sz w:val="18"/>
+                <w:szCs w:val="18"/>
+                <w:vertAlign w:val="superscript"/>
+              </w:rPr>
+            </w:pPr>
+            <w:r>
+              <w:rPr>
+                <w:bCs/>
+                <w:color w:val="auto"/>
+                <w:sz w:val="18"/>
+                <w:szCs w:val="18"/>
+              </w:rPr>
+              <w:t>C10: Resolução CNMP nº 171/2017, art. 14 — o Comitê Estratégico de TI deve exercer as competências de deliberação, acompanhamento e prestação de contas previstas no dispositivo.</w:t>
             </w:r>
           </w:p>
         </w:tc>
@@ -3467,7 +3457,7 @@
                 <w:sz w:val="18"/>
                 <w:szCs w:val="18"/>
               </w:rPr>
-              <w:t>Poder Executivo Estadual: [C2, C5];</w:t>
+              <w:t>Poder Judiciário Estadual: [C2, C8];</w:t>
             </w:r>
           </w:p>
           <w:p ns2:paraId="11118515" ns2:textId="02403B9E">
@@ -3494,7 +3484,7 @@
                 <w:sz w:val="18"/>
                 <w:szCs w:val="18"/>
               </w:rPr>
-              <w:t>Tipo: Recomendação;</w:t>
+              <w:t>Tipo: Determinação;</w:t>
             </w:r>
           </w:p>
           <w:p ns2:paraId="11118515" ns2:textId="02403B9E">
@@ -3548,7 +3538,7 @@
                 <w:sz w:val="18"/>
                 <w:szCs w:val="18"/>
               </w:rPr>
-              <w:t>Poder Judiciário Estadual: [C2, C6];</w:t>
+              <w:t>Ministério Público Estadual: [C2, C9];</w:t>
             </w:r>
           </w:p>
           <w:p ns2:paraId="11118515" ns2:textId="02403B9E">
@@ -3614,22 +3604,22 @@
               </w:numPr>
               <w:pBdr/>
               <w:spacing w:after="40"/>
-              <w:ind w:left="720"/>
-              <w:rPr>
-                <w:rFonts w:ascii="Arial" w:hAnsi="Arial" w:cs="Arial"/>
-                <w:sz w:val="18"/>
-                <w:szCs w:val="18"/>
-              </w:rPr>
-            </w:pPr>
-            <w:r>
-              <w:rPr>
-                <w:rFonts w:ascii="Arial" w:hAnsi="Arial" w:cs="Arial"/>
-                <w:b/>
-                <w:bCs/>
-                <w:sz w:val="18"/>
-                <w:szCs w:val="18"/>
-              </w:rPr>
-              <w:t>Ministério Público Estadual: [C2, C7];</w:t>
+              <w:ind w:left="360"/>
+              <w:rPr>
+                <w:rFonts w:ascii="Arial" w:hAnsi="Arial" w:cs="Arial"/>
+                <w:sz w:val="18"/>
+                <w:szCs w:val="18"/>
+              </w:rPr>
+            </w:pPr>
+            <w:r>
+              <w:rPr>
+                <w:rFonts w:ascii="Arial" w:hAnsi="Arial" w:cs="Arial"/>
+                <w:b/>
+                <w:bCs/>
+                <w:sz w:val="18"/>
+                <w:szCs w:val="18"/>
+              </w:rPr>
+              <w:t>Comitê de TIC ou instância equivalente não instituído formalmente ou sem representação de áreas relevantes da organização.[R2.2, P3, E3, P4, E4, C1, C3, C4];</w:t>
             </w:r>
           </w:p>
           <w:p ns2:paraId="11118515" ns2:textId="02403B9E">
@@ -3641,7 +3631,7 @@
               </w:numPr>
               <w:pBdr/>
               <w:spacing w:after="40"/>
-              <w:ind w:left="1080"/>
+              <w:ind w:left="720"/>
               <w:rPr>
                 <w:rFonts w:ascii="Arial" w:hAnsi="Arial" w:cs="Arial"/>
                 <w:sz w:val="18"/>
@@ -3668,22 +3658,22 @@
               </w:numPr>
               <w:pBdr/>
               <w:spacing w:after="100"/>
-              <w:ind w:left="1080"/>
-              <w:rPr>
-                <w:rFonts w:ascii="Arial" w:hAnsi="Arial" w:cs="Arial"/>
-                <w:sz w:val="18"/>
-                <w:szCs w:val="18"/>
-              </w:rPr>
-            </w:pPr>
-            <w:r>
-              <w:rPr>
-                <w:rFonts w:ascii="Arial" w:hAnsi="Arial" w:cs="Arial"/>
-                <w:b/>
-                <w:bCs/>
-                <w:sz w:val="18"/>
-                <w:szCs w:val="18"/>
-              </w:rPr>
-              <w:t>Encaminhamento: estabeleça objetivos, indicadores e metas para a gestão de TIC, de modo a possibilitar o acompanhamento periódico do desempenho da TIC pela alta administração</w:t>
+              <w:ind w:left="720"/>
+              <w:rPr>
+                <w:rFonts w:ascii="Arial" w:hAnsi="Arial" w:cs="Arial"/>
+                <w:sz w:val="18"/>
+                <w:szCs w:val="18"/>
+              </w:rPr>
+            </w:pPr>
+            <w:r>
+              <w:rPr>
+                <w:rFonts w:ascii="Arial" w:hAnsi="Arial" w:cs="Arial"/>
+                <w:b/>
+                <w:bCs/>
+                <w:sz w:val="18"/>
+                <w:szCs w:val="18"/>
+              </w:rPr>
+              <w:t>Encaminhamento: institua formalmente Comitê de TIC ou instância colegiada equivalente, compatível com o porte e a estrutura decisória da organização, definindo em seu ato constitutivo, minimamente, a participação de representantes de áreas relevantes da organização, suas competências, a periodicidade de reuniões, a forma de registro das deliberações e os mecanismos de acompanhamento dos encaminhamentos</w:t>
             </w:r>
           </w:p>
           <w:p ns2:paraId="11118515" ns2:textId="02403B9E">
@@ -3695,22 +3685,22 @@
               </w:numPr>
               <w:pBdr/>
               <w:spacing w:after="40"/>
-              <w:ind w:left="360"/>
-              <w:rPr>
-                <w:rFonts w:ascii="Arial" w:hAnsi="Arial" w:cs="Arial"/>
-                <w:sz w:val="18"/>
-                <w:szCs w:val="18"/>
-              </w:rPr>
-            </w:pPr>
-            <w:r>
-              <w:rPr>
-                <w:rFonts w:ascii="Arial" w:hAnsi="Arial" w:cs="Arial"/>
-                <w:b/>
-                <w:bCs/>
-                <w:sz w:val="18"/>
-                <w:szCs w:val="18"/>
-              </w:rPr>
-              <w:t>Comitê de TIC ou instância equivalente não instituído formalmente ou sem representação de áreas relevantes da organização.[R2.2, P3, E3, P4, E4, C1, C3, C4];</w:t>
+              <w:ind w:left="720"/>
+              <w:rPr>
+                <w:rFonts w:ascii="Arial" w:hAnsi="Arial" w:cs="Arial"/>
+                <w:sz w:val="18"/>
+                <w:szCs w:val="18"/>
+              </w:rPr>
+            </w:pPr>
+            <w:r>
+              <w:rPr>
+                <w:rFonts w:ascii="Arial" w:hAnsi="Arial" w:cs="Arial"/>
+                <w:b/>
+                <w:bCs/>
+                <w:sz w:val="18"/>
+                <w:szCs w:val="18"/>
+              </w:rPr>
+              <w:t>Poder Executivo Estadual: [C1, C4, C5];</w:t>
             </w:r>
           </w:p>
           <w:p ns2:paraId="11118515" ns2:textId="02403B9E">
@@ -3722,7 +3712,7 @@
               </w:numPr>
               <w:pBdr/>
               <w:spacing w:after="40"/>
-              <w:ind w:left="720"/>
+              <w:ind w:left="1080"/>
               <w:rPr>
                 <w:rFonts w:ascii="Arial" w:hAnsi="Arial" w:cs="Arial"/>
                 <w:sz w:val="18"/>
@@ -3749,7 +3739,7 @@
               </w:numPr>
               <w:pBdr/>
               <w:spacing w:after="100"/>
-              <w:ind w:left="720"/>
+              <w:ind w:left="1080"/>
               <w:rPr>
                 <w:rFonts w:ascii="Arial" w:hAnsi="Arial" w:cs="Arial"/>
                 <w:sz w:val="18"/>
@@ -3791,7 +3781,7 @@
                 <w:sz w:val="18"/>
                 <w:szCs w:val="18"/>
               </w:rPr>
-              <w:t>Poder Executivo Estadual: [C1, C4, C5];</w:t>
+              <w:t>Poder Judiciário Estadual: [C1, C4, C6];</w:t>
             </w:r>
           </w:p>
           <w:p ns2:paraId="11118515" ns2:textId="02403B9E">
@@ -3872,7 +3862,7 @@
                 <w:sz w:val="18"/>
                 <w:szCs w:val="18"/>
               </w:rPr>
-              <w:t>Poder Judiciário Estadual: [C1, C4, C6];</w:t>
+              <w:t>Ministério Público Estadual: [C1, C4, C7];</w:t>
             </w:r>
           </w:p>
           <w:p ns2:paraId="11118515" ns2:textId="02403B9E">
@@ -3938,22 +3928,22 @@
               </w:numPr>
               <w:pBdr/>
               <w:spacing w:after="40"/>
-              <w:ind w:left="720"/>
-              <w:rPr>
-                <w:rFonts w:ascii="Arial" w:hAnsi="Arial" w:cs="Arial"/>
-                <w:sz w:val="18"/>
-                <w:szCs w:val="18"/>
-              </w:rPr>
-            </w:pPr>
-            <w:r>
-              <w:rPr>
-                <w:rFonts w:ascii="Arial" w:hAnsi="Arial" w:cs="Arial"/>
-                <w:b/>
-                <w:bCs/>
-                <w:sz w:val="18"/>
-                <w:szCs w:val="18"/>
-              </w:rPr>
-              <w:t>Ministério Público Estadual: [C1, C4, C7];</w:t>
+              <w:ind w:left="360"/>
+              <w:rPr>
+                <w:rFonts w:ascii="Arial" w:hAnsi="Arial" w:cs="Arial"/>
+                <w:sz w:val="18"/>
+                <w:szCs w:val="18"/>
+              </w:rPr>
+            </w:pPr>
+            <w:r>
+              <w:rPr>
+                <w:rFonts w:ascii="Arial" w:hAnsi="Arial" w:cs="Arial"/>
+                <w:b/>
+                <w:bCs/>
+                <w:sz w:val="18"/>
+                <w:szCs w:val="18"/>
+              </w:rPr>
+              <w:t>Comitê de TIC ou instância equivalente sem atuação efetiva comprovada.[R2.3, P5, E5, P6, E6, C1, C3, C4];</w:t>
             </w:r>
           </w:p>
           <w:p ns2:paraId="11118515" ns2:textId="02403B9E">
@@ -3965,7 +3955,7 @@
               </w:numPr>
               <w:pBdr/>
               <w:spacing w:after="40"/>
-              <w:ind w:left="1080"/>
+              <w:ind w:left="720"/>
               <w:rPr>
                 <w:rFonts w:ascii="Arial" w:hAnsi="Arial" w:cs="Arial"/>
                 <w:sz w:val="18"/>
@@ -3992,22 +3982,22 @@
               </w:numPr>
               <w:pBdr/>
               <w:spacing w:after="100"/>
-              <w:ind w:left="1080"/>
-              <w:rPr>
-                <w:rFonts w:ascii="Arial" w:hAnsi="Arial" w:cs="Arial"/>
-                <w:sz w:val="18"/>
-                <w:szCs w:val="18"/>
-              </w:rPr>
-            </w:pPr>
-            <w:r>
-              <w:rPr>
-                <w:rFonts w:ascii="Arial" w:hAnsi="Arial" w:cs="Arial"/>
-                <w:b/>
-                <w:bCs/>
-                <w:sz w:val="18"/>
-                <w:szCs w:val="18"/>
-              </w:rPr>
-              <w:t>Encaminhamento: institua formalmente Comitê de TIC ou instância colegiada equivalente, compatível com o porte e a estrutura decisória da organização, definindo em seu ato constitutivo, minimamente, a participação de representantes de áreas relevantes da organização, suas competências, a periodicidade de reuniões, a forma de registro das deliberações e os mecanismos de acompanhamento dos encaminhamentos</w:t>
+              <w:ind w:left="720"/>
+              <w:rPr>
+                <w:rFonts w:ascii="Arial" w:hAnsi="Arial" w:cs="Arial"/>
+                <w:sz w:val="18"/>
+                <w:szCs w:val="18"/>
+              </w:rPr>
+            </w:pPr>
+            <w:r>
+              <w:rPr>
+                <w:rFonts w:ascii="Arial" w:hAnsi="Arial" w:cs="Arial"/>
+                <w:b/>
+                <w:bCs/>
+                <w:sz w:val="18"/>
+                <w:szCs w:val="18"/>
+              </w:rPr>
+              <w:t>Encaminhamento: assegure o funcionamento efetivo do Comitê de TIC ou instância colegiada equivalente, mediante o exercício das competências previstas em seu ato constitutivo, com registro das deliberações e acompanhamento dos respectivos encaminhamentos</w:t>
             </w:r>
           </w:p>
           <w:p ns2:paraId="11118515" ns2:textId="02403B9E">
@@ -4019,22 +4009,22 @@
               </w:numPr>
               <w:pBdr/>
               <w:spacing w:after="40"/>
-              <w:ind w:left="360"/>
-              <w:rPr>
-                <w:rFonts w:ascii="Arial" w:hAnsi="Arial" w:cs="Arial"/>
-                <w:sz w:val="18"/>
-                <w:szCs w:val="18"/>
-              </w:rPr>
-            </w:pPr>
-            <w:r>
-              <w:rPr>
-                <w:rFonts w:ascii="Arial" w:hAnsi="Arial" w:cs="Arial"/>
-                <w:b/>
-                <w:bCs/>
-                <w:sz w:val="18"/>
-                <w:szCs w:val="18"/>
-              </w:rPr>
-              <w:t>Comitê de TIC ou instância equivalente sem atuação efetiva comprovada.[R2.3, P5, E5, P6, E6, C1, C3, C4];</w:t>
+              <w:ind w:left="720"/>
+              <w:rPr>
+                <w:rFonts w:ascii="Arial" w:hAnsi="Arial" w:cs="Arial"/>
+                <w:sz w:val="18"/>
+                <w:szCs w:val="18"/>
+              </w:rPr>
+            </w:pPr>
+            <w:r>
+              <w:rPr>
+                <w:rFonts w:ascii="Arial" w:hAnsi="Arial" w:cs="Arial"/>
+                <w:b/>
+                <w:bCs/>
+                <w:sz w:val="18"/>
+                <w:szCs w:val="18"/>
+              </w:rPr>
+              <w:t>Poder Judiciário Estadual: [C1, C4, C6];</w:t>
             </w:r>
           </w:p>
           <w:p ns2:paraId="11118515" ns2:textId="02403B9E">
@@ -4046,7 +4036,7 @@
               </w:numPr>
               <w:pBdr/>
               <w:spacing w:after="40"/>
-              <w:ind w:left="720"/>
+              <w:ind w:left="1080"/>
               <w:rPr>
                 <w:rFonts w:ascii="Arial" w:hAnsi="Arial" w:cs="Arial"/>
                 <w:sz w:val="18"/>
@@ -4073,7 +4063,7 @@
               </w:numPr>
               <w:pBdr/>
               <w:spacing w:after="100"/>
-              <w:ind w:left="720"/>
+              <w:ind w:left="1080"/>
               <w:rPr>
                 <w:rFonts w:ascii="Arial" w:hAnsi="Arial" w:cs="Arial"/>
                 <w:sz w:val="18"/>
@@ -4115,169 +4105,7 @@
                 <w:sz w:val="18"/>
                 <w:szCs w:val="18"/>
               </w:rPr>
-              <w:t>Poder Executivo Estadual: [C1, C4, C5];</w:t>
-            </w:r>
-          </w:p>
-          <w:p ns2:paraId="11118515" ns2:textId="02403B9E">
-            <w:pPr>
-              <w:pStyle w:val="843"/>
-              <w:numPr>
-                <w:ilvl w:val="0"/>
-                <w:numId w:val="11"/>
-              </w:numPr>
-              <w:pBdr/>
-              <w:spacing w:after="40"/>
-              <w:ind w:left="1080"/>
-              <w:rPr>
-                <w:rFonts w:ascii="Arial" w:hAnsi="Arial" w:cs="Arial"/>
-                <w:sz w:val="18"/>
-                <w:szCs w:val="18"/>
-              </w:rPr>
-            </w:pPr>
-            <w:r>
-              <w:rPr>
-                <w:rFonts w:ascii="Arial" w:hAnsi="Arial" w:cs="Arial"/>
-                <w:b/>
-                <w:bCs/>
-                <w:sz w:val="18"/>
-                <w:szCs w:val="18"/>
-              </w:rPr>
-              <w:t>Tipo: Determinação;</w:t>
-            </w:r>
-          </w:p>
-          <w:p ns2:paraId="11118515" ns2:textId="02403B9E">
-            <w:pPr>
-              <w:pStyle w:val="843"/>
-              <w:numPr>
-                <w:ilvl w:val="0"/>
-                <w:numId w:val="11"/>
-              </w:numPr>
-              <w:pBdr/>
-              <w:spacing w:after="100"/>
-              <w:ind w:left="1080"/>
-              <w:rPr>
-                <w:rFonts w:ascii="Arial" w:hAnsi="Arial" w:cs="Arial"/>
-                <w:sz w:val="18"/>
-                <w:szCs w:val="18"/>
-              </w:rPr>
-            </w:pPr>
-            <w:r>
-              <w:rPr>
-                <w:rFonts w:ascii="Arial" w:hAnsi="Arial" w:cs="Arial"/>
-                <w:b/>
-                <w:bCs/>
-                <w:sz w:val="18"/>
-                <w:szCs w:val="18"/>
-              </w:rPr>
-              <w:t>Encaminhamento: assegure o funcionamento efetivo do Comitê de TIC ou instância colegiada equivalente, mediante o exercício das competências previstas em seu ato constitutivo, com registro das deliberações e acompanhamento dos respectivos encaminhamentos</w:t>
-            </w:r>
-          </w:p>
-          <w:p ns2:paraId="11118515" ns2:textId="02403B9E">
-            <w:pPr>
-              <w:pStyle w:val="843"/>
-              <w:numPr>
-                <w:ilvl w:val="0"/>
-                <w:numId w:val="11"/>
-              </w:numPr>
-              <w:pBdr/>
-              <w:spacing w:after="40"/>
-              <w:ind w:left="720"/>
-              <w:rPr>
-                <w:rFonts w:ascii="Arial" w:hAnsi="Arial" w:cs="Arial"/>
-                <w:sz w:val="18"/>
-                <w:szCs w:val="18"/>
-              </w:rPr>
-            </w:pPr>
-            <w:r>
-              <w:rPr>
-                <w:rFonts w:ascii="Arial" w:hAnsi="Arial" w:cs="Arial"/>
-                <w:b/>
-                <w:bCs/>
-                <w:sz w:val="18"/>
-                <w:szCs w:val="18"/>
-              </w:rPr>
-              <w:t>Poder Judiciário Estadual: [C1, C4, C6];</w:t>
-            </w:r>
-          </w:p>
-          <w:p ns2:paraId="11118515" ns2:textId="02403B9E">
-            <w:pPr>
-              <w:pStyle w:val="843"/>
-              <w:numPr>
-                <w:ilvl w:val="0"/>
-                <w:numId w:val="11"/>
-              </w:numPr>
-              <w:pBdr/>
-              <w:spacing w:after="40"/>
-              <w:ind w:left="1080"/>
-              <w:rPr>
-                <w:rFonts w:ascii="Arial" w:hAnsi="Arial" w:cs="Arial"/>
-                <w:sz w:val="18"/>
-                <w:szCs w:val="18"/>
-              </w:rPr>
-            </w:pPr>
-            <w:r>
-              <w:rPr>
-                <w:rFonts w:ascii="Arial" w:hAnsi="Arial" w:cs="Arial"/>
-                <w:b/>
-                <w:bCs/>
-                <w:sz w:val="18"/>
-                <w:szCs w:val="18"/>
-              </w:rPr>
-              <w:t>Tipo: Determinação;</w:t>
-            </w:r>
-          </w:p>
-          <w:p ns2:paraId="11118515" ns2:textId="02403B9E">
-            <w:pPr>
-              <w:pStyle w:val="843"/>
-              <w:numPr>
-                <w:ilvl w:val="0"/>
-                <w:numId w:val="11"/>
-              </w:numPr>
-              <w:pBdr/>
-              <w:spacing w:after="100"/>
-              <w:ind w:left="1080"/>
-              <w:rPr>
-                <w:rFonts w:ascii="Arial" w:hAnsi="Arial" w:cs="Arial"/>
-                <w:sz w:val="18"/>
-                <w:szCs w:val="18"/>
-              </w:rPr>
-            </w:pPr>
-            <w:r>
-              <w:rPr>
-                <w:rFonts w:ascii="Arial" w:hAnsi="Arial" w:cs="Arial"/>
-                <w:b/>
-                <w:bCs/>
-                <w:sz w:val="18"/>
-                <w:szCs w:val="18"/>
-              </w:rPr>
-              <w:t>Encaminhamento: assegure o funcionamento efetivo do Comitê de TIC ou instância colegiada equivalente, mediante o exercício das competências previstas em seu ato constitutivo, com registro das deliberações e acompanhamento dos respectivos encaminhamentos</w:t>
-            </w:r>
-          </w:p>
-          <w:p ns2:paraId="11118515" ns2:textId="02403B9E">
-            <w:pPr>
-              <w:pStyle w:val="843"/>
-              <w:numPr>
-                <w:ilvl w:val="0"/>
-                <w:numId w:val="11"/>
-              </w:numPr>
-              <w:pBdr/>
-              <w:spacing w:after="40"/>
-              <w:ind w:left="720"/>
-              <w:rPr>
-                <w:rFonts w:ascii="Arial" w:hAnsi="Arial" w:cs="Arial"/>
-                <w:sz w:val="18"/>
-                <w:szCs w:val="18"/>
-              </w:rPr>
-            </w:pPr>
-            <w:r>
-              <w:rPr>
-                <w:rFonts w:ascii="Arial" w:hAnsi="Arial" w:cs="Arial"/>
-                <w:b/>
-                <w:bCs/>
-                <w:sz w:val="18"/>
-                <w:szCs w:val="18"/>
-              </w:rPr>
-              <w:t>Ministério Público Estadual: [C1, C4, C7];</w:t>
+              <w:t>Ministério Público Estadual: [C1, C4, C10];</w:t>
             </w:r>
           </w:p>
           <w:p ns2:paraId="11118515" ns2:textId="02403B9E">
@@ -5203,7 +5031,7 @@
                 <w:sz w:val="18"/>
                 <w:szCs w:val="18"/>
               </w:rPr>
-              <w:t>C3: Acórdão 1.411/2014-TCU-Plenário, item 9.1.6 e subitens 9.1.6.1 a 9.1.6.4: necessidade de instituir formalmente plano diretor de TI, contemplando desdobramento de diretrizes estratégicas, vinculação das ações de TI a indicadores e metas de negócio, vinculação das ações de TI a indicadores e metas de serviços ao cidadão e vinculação das ações priorizadas ao orçamento de TI.</w:t>
+              <w:t>C3: Acórdão nº 1.411/2014-TCU-Plenário, item 9.1.6 — precedente quanto à instituição formal de plano diretor de TI que contemple as diretrizes estratégicas e os elementos mínimos indicados no item.</w:t>
             </w:r>
           </w:p>
           <w:p ns2:paraId="2667BB09" ns2:textId="2C1623C1">
@@ -5228,7 +5056,7 @@
                 <w:sz w:val="18"/>
                 <w:szCs w:val="18"/>
               </w:rPr>
-              <w:t>C4: Acórdão TCE-RJ nº 44.490/2024-PLEN, itens II.3 e III.3 e respectivos subitens – Precedentes quanto ao estabelecimento formal de processo estruturado de planejamento de TIC, com participação das áreas relevantes, elaboração, manutenção e revisão periódica de PDTI, contemplando objetivos, indicadores e metas alinhados aos objetivos institucionais, riscos, projetos, aquisições, recursos necessários e ações de monitoramento após aprovação pela alta administração.</w:t>
+              <w:t>C4: Acórdão TCE-RJ nº 44.490/2024-PLEN, item II.3 — precedente quanto ao estabelecimento formal de processo estruturado de planejamento de TIC e à elaboração, aprovação, alinhamento, integração e monitoramento do PDTI nos termos do item.</w:t>
             </w:r>
           </w:p>
           <w:p ns2:paraId="2667BB09" ns2:textId="2C1623C1">
@@ -5279,7 +5107,82 @@
                 <w:sz w:val="18"/>
                 <w:szCs w:val="18"/>
               </w:rPr>
-              <w:t>C5: Portaria PRODERJ/PRE nº 825/2021, arts. 1º a 5º e Anexo C, arts. 1º a 14, e IN PRODERJ/PRE nº 05/2024, art. 5º — obrigatoriedade de elaboração, alinhamento institucional, aprovação pela autoridade máxima, integração com orçamento/PCA e revisão periódica do PEDTIC no Poder Executivo Estadual.</w:t>
+              <w:t>C5: Portaria PRODERJ/PRE nº 825/2021, art. 2º — os níveis setoriais de TIC do Poder Executivo Estadual são responsáveis pela elaboração do PEDTIC.</w:t>
+            </w:r>
+          </w:p>
+          <w:p ns2:paraId="2667BB09" ns2:textId="2C1623C1">
+            <w:pPr>
+              <w:pStyle w:val="841"/>
+              <w:pBdr/>
+              <w:spacing w:after="80"/>
+              <w:ind w:left="240"/>
+              <w:jc w:val="both"/>
+              <w:rPr>
+                <w:bCs/>
+                <w:color w:val="auto"/>
+                <w:sz w:val="18"/>
+                <w:szCs w:val="18"/>
+                <w:vertAlign w:val="superscript"/>
+              </w:rPr>
+            </w:pPr>
+            <w:r>
+              <w:rPr>
+                <w:bCs/>
+                <w:color w:val="auto"/>
+                <w:sz w:val="18"/>
+                <w:szCs w:val="18"/>
+              </w:rPr>
+              <w:t>C6: Portaria PRODERJ/PRE nº 825/2021, Anexo C, art. 11, parágrafo único — o PEDTIC deve ser submetido à aprovação formal da alta direção do órgão ou entidade.</w:t>
+            </w:r>
+          </w:p>
+          <w:p ns2:paraId="2667BB09" ns2:textId="2C1623C1">
+            <w:pPr>
+              <w:pStyle w:val="841"/>
+              <w:pBdr/>
+              <w:spacing w:after="80"/>
+              <w:ind w:left="240"/>
+              <w:jc w:val="both"/>
+              <w:rPr>
+                <w:bCs/>
+                <w:color w:val="auto"/>
+                <w:sz w:val="18"/>
+                <w:szCs w:val="18"/>
+                <w:vertAlign w:val="superscript"/>
+              </w:rPr>
+            </w:pPr>
+            <w:r>
+              <w:rPr>
+                <w:bCs/>
+                <w:color w:val="auto"/>
+                <w:sz w:val="18"/>
+                <w:szCs w:val="18"/>
+              </w:rPr>
+              <w:t>C7: Portaria PRODERJ/PRE nº 825/2021, art. 3º — o PEDTIC deve ser elaborado em conformidade com as diretrizes e metas do governo e com a governança estadual de TIC.</w:t>
+            </w:r>
+          </w:p>
+          <w:p ns2:paraId="2667BB09" ns2:textId="2C1623C1">
+            <w:pPr>
+              <w:pStyle w:val="841"/>
+              <w:pBdr/>
+              <w:spacing w:after="80"/>
+              <w:ind w:left="240"/>
+              <w:jc w:val="both"/>
+              <w:rPr>
+                <w:bCs/>
+                <w:color w:val="auto"/>
+                <w:sz w:val="18"/>
+                <w:szCs w:val="18"/>
+                <w:vertAlign w:val="superscript"/>
+              </w:rPr>
+            </w:pPr>
+            <w:r>
+              <w:rPr>
+                <w:bCs/>
+                <w:color w:val="auto"/>
+                <w:sz w:val="18"/>
+                <w:szCs w:val="18"/>
+              </w:rPr>
+              <w:t>C8: Portaria PRODERJ/PRE nº 825/2021, Anexo C, art. 13 — a execução do PEDTIC deve ser monitorada na forma prevista no dispositivo.</w:t>
             </w:r>
           </w:p>
           <w:p ns2:paraId="2667BB09" ns2:textId="2C1623C1">
@@ -5330,7 +5233,32 @@
                 <w:sz w:val="18"/>
                 <w:szCs w:val="18"/>
               </w:rPr>
-              <w:t>C6: Resolução CNJ nº 370/2021, arts. 6º a 8º, 42, 46 e 48 e Atos Normativos TJ nº 32/2023 e nº 27/2022 — rito de elaboração, alinhamento, aprovação pela Presidência, integração orçamentária e acompanhamento do PDTIC no Poder Judiciário Estadual.</w:t>
+              <w:t>C9: Resolução CNJ nº 370/2021, art. 6º — cada órgão do Poder Judiciário deve elaborar e manter PDTIC alinhado ao planejamento institucional, e sua proposta orçamentária de TIC deve guardar integral harmonia com o plano.</w:t>
+            </w:r>
+          </w:p>
+          <w:p ns2:paraId="2667BB09" ns2:textId="2C1623C1">
+            <w:pPr>
+              <w:pStyle w:val="841"/>
+              <w:pBdr/>
+              <w:spacing w:after="80"/>
+              <w:ind w:left="240"/>
+              <w:jc w:val="both"/>
+              <w:rPr>
+                <w:bCs/>
+                <w:color w:val="auto"/>
+                <w:sz w:val="18"/>
+                <w:szCs w:val="18"/>
+                <w:vertAlign w:val="superscript"/>
+              </w:rPr>
+            </w:pPr>
+            <w:r>
+              <w:rPr>
+                <w:bCs/>
+                <w:color w:val="auto"/>
+                <w:sz w:val="18"/>
+                <w:szCs w:val="18"/>
+              </w:rPr>
+              <w:t>C10: Resolução CNJ nº 370/2021, art. 7º, inciso II — compete ao Comitê de Governança de TIC aprovar projetos e planos estratégicos.</w:t>
             </w:r>
           </w:p>
           <w:p ns2:paraId="2667BB09" ns2:textId="2C1623C1">
@@ -5381,7 +5309,134 @@
                 <w:sz w:val="18"/>
                 <w:szCs w:val="18"/>
               </w:rPr>
-              <w:t>C7: Resolução CNMP nº 171/2017, arts. 9º, 11, 12, 14 e 16, Resolução CNMP nº 283/2024, arts. 4º a 6º e Resoluções GPGJ nº 2.785/2026 e nº 2.540/2023 — rito de elaboração, alinhamento institucional, aprovação pelo PGJ, integração orçamentária/PAC e acompanhamento do PETI/PDTI no Ministério Público Estadual.</w:t>
+              <w:t>C11: Resolução CNMP nº 171/2017, art. 12 — cada unidade ou ramo do Ministério Público deve elaborar PDTI, submetê-lo à instância de governança em TI e acompanhar sua implementação.</w:t>
+            </w:r>
+          </w:p>
+          <w:p ns2:paraId="2667BB09" ns2:textId="2C1623C1">
+            <w:pPr>
+              <w:pStyle w:val="841"/>
+              <w:pBdr/>
+              <w:spacing w:after="80"/>
+              <w:ind w:left="240"/>
+              <w:jc w:val="both"/>
+              <w:rPr>
+                <w:bCs/>
+                <w:color w:val="auto"/>
+                <w:sz w:val="18"/>
+                <w:szCs w:val="18"/>
+                <w:vertAlign w:val="superscript"/>
+              </w:rPr>
+            </w:pPr>
+            <w:r>
+              <w:rPr>
+                <w:bCs/>
+                <w:color w:val="auto"/>
+                <w:sz w:val="18"/>
+                <w:szCs w:val="18"/>
+              </w:rPr>
+              <w:t>C12: Resolução CNMP nº 171/2017, art. 11 — o PETI deve desdobrar o planejamento estratégico institucional e conter as contribuições da TI para os objetivos estratégicos.</w:t>
+            </w:r>
+          </w:p>
+          <w:p ns2:paraId="2667BB09" ns2:textId="2C1623C1">
+            <w:pPr>
+              <w:pStyle w:val="841"/>
+              <w:pBdr/>
+              <w:spacing w:after="60"/>
+              <w:ind/>
+              <w:jc w:val="both"/>
+              <w:rPr>
+                <w:bCs/>
+                <w:color w:val="auto"/>
+                <w:sz w:val="18"/>
+                <w:szCs w:val="18"/>
+                <w:vertAlign w:val="superscript"/>
+              </w:rPr>
+            </w:pPr>
+            <w:r>
+              <w:rPr>
+                <w:bCs/>
+                <w:color w:val="auto"/>
+                <w:sz w:val="18"/>
+                <w:szCs w:val="18"/>
+                <w:b/>
+              </w:rPr>
+              <w:t>Poder Executivo Estadual</w:t>
+            </w:r>
+          </w:p>
+          <w:p ns2:paraId="2667BB09" ns2:textId="2C1623C1">
+            <w:pPr>
+              <w:pStyle w:val="841"/>
+              <w:pBdr/>
+              <w:spacing w:after="80"/>
+              <w:ind w:left="240"/>
+              <w:jc w:val="both"/>
+              <w:rPr>
+                <w:bCs/>
+                <w:color w:val="auto"/>
+                <w:sz w:val="18"/>
+                <w:szCs w:val="18"/>
+                <w:vertAlign w:val="superscript"/>
+              </w:rPr>
+            </w:pPr>
+            <w:r>
+              <w:rPr>
+                <w:bCs/>
+                <w:color w:val="auto"/>
+                <w:sz w:val="18"/>
+                <w:szCs w:val="18"/>
+              </w:rPr>
+              <w:t>C13: IN PRODERJ/PRE nº 5/2024, art. 5º — as contratações de TIC do Poder Executivo Estadual devem estar previstas no PEDTIC e indicadas no Plano de Contratações Anual.</w:t>
+            </w:r>
+          </w:p>
+          <w:p ns2:paraId="2667BB09" ns2:textId="2C1623C1">
+            <w:pPr>
+              <w:pStyle w:val="841"/>
+              <w:pBdr/>
+              <w:spacing w:after="60"/>
+              <w:ind/>
+              <w:jc w:val="both"/>
+              <w:rPr>
+                <w:bCs/>
+                <w:color w:val="auto"/>
+                <w:sz w:val="18"/>
+                <w:szCs w:val="18"/>
+                <w:vertAlign w:val="superscript"/>
+              </w:rPr>
+            </w:pPr>
+            <w:r>
+              <w:rPr>
+                <w:bCs/>
+                <w:color w:val="auto"/>
+                <w:sz w:val="18"/>
+                <w:szCs w:val="18"/>
+                <w:b/>
+              </w:rPr>
+              <w:t>Ministério Público Estadual</w:t>
+            </w:r>
+          </w:p>
+          <w:p ns2:paraId="2667BB09" ns2:textId="2C1623C1">
+            <w:pPr>
+              <w:pStyle w:val="841"/>
+              <w:pBdr/>
+              <w:spacing w:after="80"/>
+              <w:ind w:left="240"/>
+              <w:jc w:val="both"/>
+              <w:rPr>
+                <w:bCs/>
+                <w:color w:val="auto"/>
+                <w:sz w:val="18"/>
+                <w:szCs w:val="18"/>
+                <w:vertAlign w:val="superscript"/>
+              </w:rPr>
+            </w:pPr>
+            <w:r>
+              <w:rPr>
+                <w:bCs/>
+                <w:color w:val="auto"/>
+                <w:sz w:val="18"/>
+                <w:szCs w:val="18"/>
+              </w:rPr>
+              <w:t>C14: Resolução CNMP nº 283/2024, art. 5º — as contratações de TI do Ministério Público devem constar do plano de contratações anual, observado o respectivo PDTI.</w:t>
             </w:r>
           </w:p>
         </w:tc>
@@ -5978,7 +6033,7 @@
                 <w:sz w:val="18"/>
                 <w:szCs w:val="18"/>
               </w:rPr>
-              <w:t>Poder Judiciário Estadual: [C1, C4, C6];</w:t>
+              <w:t>Poder Judiciário Estadual: [C1, C4, C9];</w:t>
             </w:r>
           </w:p>
           <w:p ns2:paraId="11118515" ns2:textId="02403B9E">
@@ -6059,7 +6114,7 @@
                 <w:sz w:val="18"/>
                 <w:szCs w:val="18"/>
               </w:rPr>
-              <w:t>Ministério Público Estadual: [C1, C4, C7];</w:t>
+              <w:t>Ministério Público Estadual: [C1, C4, C11];</w:t>
             </w:r>
           </w:p>
           <w:p ns2:paraId="11118515" ns2:textId="02403B9E">
@@ -6221,7 +6276,7 @@
                 <w:sz w:val="18"/>
                 <w:szCs w:val="18"/>
               </w:rPr>
-              <w:t>Poder Executivo Estadual: [C4, C5];</w:t>
+              <w:t>Poder Executivo Estadual: [C4, C6];</w:t>
             </w:r>
           </w:p>
           <w:p ns2:paraId="11118515" ns2:textId="02403B9E">
@@ -6302,7 +6357,7 @@
                 <w:sz w:val="18"/>
                 <w:szCs w:val="18"/>
               </w:rPr>
-              <w:t>Poder Judiciário Estadual: [C4, C6];</w:t>
+              <w:t>Poder Judiciário Estadual: [C4, C10];</w:t>
             </w:r>
           </w:p>
           <w:p ns2:paraId="11118515" ns2:textId="02403B9E">
@@ -6383,7 +6438,7 @@
                 <w:sz w:val="18"/>
                 <w:szCs w:val="18"/>
               </w:rPr>
-              <w:t>Ministério Público Estadual: [C4, C7];</w:t>
+              <w:t>Ministério Público Estadual: [C4, C11];</w:t>
             </w:r>
           </w:p>
           <w:p ns2:paraId="11118515" ns2:textId="02403B9E">
@@ -6545,7 +6600,7 @@
                 <w:sz w:val="18"/>
                 <w:szCs w:val="18"/>
               </w:rPr>
-              <w:t>Poder Executivo Estadual: [C1, C4, C5];</w:t>
+              <w:t>Poder Executivo Estadual: [C1, C4, C7];</w:t>
             </w:r>
           </w:p>
           <w:p ns2:paraId="11118515" ns2:textId="02403B9E">
@@ -6626,7 +6681,7 @@
                 <w:sz w:val="18"/>
                 <w:szCs w:val="18"/>
               </w:rPr>
-              <w:t>Poder Judiciário Estadual: [C1, C4, C6];</w:t>
+              <w:t>Poder Judiciário Estadual: [C1, C4, C9];</w:t>
             </w:r>
           </w:p>
           <w:p ns2:paraId="11118515" ns2:textId="02403B9E">
@@ -6707,7 +6762,7 @@
                 <w:sz w:val="18"/>
                 <w:szCs w:val="18"/>
               </w:rPr>
-              <w:t>Ministério Público Estadual: [C1, C4, C7];</w:t>
+              <w:t>Ministério Público Estadual: [C1, C4, C12];</w:t>
             </w:r>
           </w:p>
           <w:p ns2:paraId="11118515" ns2:textId="02403B9E">
@@ -6869,7 +6924,7 @@
                 <w:sz w:val="18"/>
                 <w:szCs w:val="18"/>
               </w:rPr>
-              <w:t>Poder Executivo Estadual: [C2, C4, C5];</w:t>
+              <w:t>Poder Executivo Estadual: [C2, C4, C13];</w:t>
             </w:r>
           </w:p>
           <w:p ns2:paraId="11118515" ns2:textId="02403B9E">
@@ -6950,7 +7005,7 @@
                 <w:sz w:val="18"/>
                 <w:szCs w:val="18"/>
               </w:rPr>
-              <w:t>Poder Judiciário Estadual: [C2, C4, C6];</w:t>
+              <w:t>Poder Judiciário Estadual: [C2, C4, C9];</w:t>
             </w:r>
           </w:p>
           <w:p ns2:paraId="11118515" ns2:textId="02403B9E">
@@ -7031,7 +7086,7 @@
                 <w:sz w:val="18"/>
                 <w:szCs w:val="18"/>
               </w:rPr>
-              <w:t>Ministério Público Estadual: [C2, C4, C7];</w:t>
+              <w:t>Ministério Público Estadual: [C2, C4, C14];</w:t>
             </w:r>
           </w:p>
           <w:p ns2:paraId="11118515" ns2:textId="02403B9E">
@@ -7193,7 +7248,7 @@
                 <w:sz w:val="18"/>
                 <w:szCs w:val="18"/>
               </w:rPr>
-              <w:t>Poder Executivo Estadual: [C4, C5];</w:t>
+              <w:t>Poder Executivo Estadual: [C4, C8];</w:t>
             </w:r>
           </w:p>
           <w:p ns2:paraId="11118515" ns2:textId="02403B9E">
@@ -7274,88 +7329,7 @@
                 <w:sz w:val="18"/>
                 <w:szCs w:val="18"/>
               </w:rPr>
-              <w:t>Poder Judiciário Estadual: [C4, C6];</w:t>
-            </w:r>
-          </w:p>
-          <w:p ns2:paraId="11118515" ns2:textId="02403B9E">
-            <w:pPr>
-              <w:pStyle w:val="843"/>
-              <w:numPr>
-                <w:ilvl w:val="0"/>
-                <w:numId w:val="11"/>
-              </w:numPr>
-              <w:pBdr/>
-              <w:spacing w:after="40"/>
-              <w:ind w:left="1080"/>
-              <w:rPr>
-                <w:rFonts w:ascii="Arial" w:hAnsi="Arial" w:cs="Arial"/>
-                <w:sz w:val="18"/>
-                <w:szCs w:val="18"/>
-              </w:rPr>
-            </w:pPr>
-            <w:r>
-              <w:rPr>
-                <w:rFonts w:ascii="Arial" w:hAnsi="Arial" w:cs="Arial"/>
-                <w:b/>
-                <w:bCs/>
-                <w:sz w:val="18"/>
-                <w:szCs w:val="18"/>
-              </w:rPr>
-              <w:t>Tipo: Determinação;</w:t>
-            </w:r>
-          </w:p>
-          <w:p ns2:paraId="11118515" ns2:textId="02403B9E">
-            <w:pPr>
-              <w:pStyle w:val="843"/>
-              <w:numPr>
-                <w:ilvl w:val="0"/>
-                <w:numId w:val="11"/>
-              </w:numPr>
-              <w:pBdr/>
-              <w:spacing w:after="100"/>
-              <w:ind w:left="1080"/>
-              <w:rPr>
-                <w:rFonts w:ascii="Arial" w:hAnsi="Arial" w:cs="Arial"/>
-                <w:sz w:val="18"/>
-                <w:szCs w:val="18"/>
-              </w:rPr>
-            </w:pPr>
-            <w:r>
-              <w:rPr>
-                <w:rFonts w:ascii="Arial" w:hAnsi="Arial" w:cs="Arial"/>
-                <w:b/>
-                <w:bCs/>
-                <w:sz w:val="18"/>
-                <w:szCs w:val="18"/>
-              </w:rPr>
-              <w:t>Encaminhamento: estabeleça e execute rotina periódica de acompanhamento da execução do plano de TIC, promovendo sua revisão periódica e os ajustes ou atualizações necessários, com registro das principais decisões e reprogramações</w:t>
-            </w:r>
-          </w:p>
-          <w:p ns2:paraId="11118515" ns2:textId="02403B9E">
-            <w:pPr>
-              <w:pStyle w:val="843"/>
-              <w:numPr>
-                <w:ilvl w:val="0"/>
-                <w:numId w:val="11"/>
-              </w:numPr>
-              <w:pBdr/>
-              <w:spacing w:after="40"/>
-              <w:ind w:left="720"/>
-              <w:rPr>
-                <w:rFonts w:ascii="Arial" w:hAnsi="Arial" w:cs="Arial"/>
-                <w:sz w:val="18"/>
-                <w:szCs w:val="18"/>
-              </w:rPr>
-            </w:pPr>
-            <w:r>
-              <w:rPr>
-                <w:rFonts w:ascii="Arial" w:hAnsi="Arial" w:cs="Arial"/>
-                <w:b/>
-                <w:bCs/>
-                <w:sz w:val="18"/>
-                <w:szCs w:val="18"/>
-              </w:rPr>
-              <w:t>Ministério Público Estadual: [C4, C7];</w:t>
+              <w:t>Ministério Público Estadual: [C4, C11];</w:t>
             </w:r>
           </w:p>
           <w:p ns2:paraId="11118515" ns2:textId="02403B9E">
@@ -8216,7 +8190,7 @@
                 <w:sz w:val="18"/>
                 <w:szCs w:val="18"/>
               </w:rPr>
-              <w:t>C7: Acórdão TCE-RJ nº 44.490/2024-PLEN, itens I.10.11, III.9.11 e IV.11.3 – Referência para avaliação da estrutura de recursos humanos de TIC quanto à suficiência quantitativa e qualitativa e à preservação de capacidade interna em atividades de planejamento, coordenação, fiscalização e controle.</w:t>
+              <w:t>C7: Acórdão TCE-RJ nº 44.490/2024-PLEN, item I.10.11 — precedente para avaliação da estrutura de recursos humanos de TIC quanto à suficiência e à preservação de capacidade interna em atividades de planejamento, coordenação, fiscalização e controle.</w:t>
             </w:r>
           </w:p>
           <w:p ns2:paraId="2667BB09" ns2:textId="2C1623C1">
@@ -8242,7 +8216,7 @@
                 <w:szCs w:val="18"/>
                 <w:b/>
               </w:rPr>
-              <w:t>Poder Executivo Estadual</w:t>
+              <w:t>Poder Judiciário Estadual</w:t>
             </w:r>
           </w:p>
           <w:p ns2:paraId="2667BB09" ns2:textId="2C1623C1">
@@ -8267,33 +8241,7 @@
                 <w:sz w:val="18"/>
                 <w:szCs w:val="18"/>
               </w:rPr>
-              <w:t>C8: Decreto Estadual nº 47.278/2020, arts. 4º e 6º e IN PRODERJ/PRE nº 07/2025, arts. 11, 17 e 18 — capacidade técnica da área de TIC e designação formal obrigatória de Gestor de Segurança da Informação e responsável por incidentes no Poder Executivo Estadual.</w:t>
-            </w:r>
-          </w:p>
-          <w:p ns2:paraId="2667BB09" ns2:textId="2C1623C1">
-            <w:pPr>
-              <w:pStyle w:val="841"/>
-              <w:pBdr/>
-              <w:spacing w:after="60"/>
-              <w:ind/>
-              <w:jc w:val="both"/>
-              <w:rPr>
-                <w:bCs/>
-                <w:color w:val="auto"/>
-                <w:sz w:val="18"/>
-                <w:szCs w:val="18"/>
-                <w:vertAlign w:val="superscript"/>
-              </w:rPr>
-            </w:pPr>
-            <w:r>
-              <w:rPr>
-                <w:bCs/>
-                <w:color w:val="auto"/>
-                <w:sz w:val="18"/>
-                <w:szCs w:val="18"/>
-                <w:b/>
-              </w:rPr>
-              <w:t>Poder Judiciário Estadual</w:t>
+              <w:t>C8: Resolução CNJ nº 370/2021, art. 24 — cada órgão do Poder Judiciário deve compor quadro permanente de servidores dedicados à área de TIC em quantitativo compatível com a demanda e com o referencial aplicável.</w:t>
             </w:r>
           </w:p>
           <w:p ns2:paraId="2667BB09" ns2:textId="2C1623C1">
@@ -8318,58 +8266,7 @@
                 <w:sz w:val="18"/>
                 <w:szCs w:val="18"/>
               </w:rPr>
-              <w:t>C9: Resolução CNJ nº 370/2021, art. 24, caput e §§ 1º a 3º, Resolução CNJ nº 468/2022, art. 8º, § 1º e Resolução CNJ nº 396/2021, art. 7º — exigência de quadro permanente e exclusivo de servidores de TIC, dimensionamento documentado por guia técnico, vedação de terceirização de gestão e papéis formais de cibersegurança no Poder Judiciário Estadual.</w:t>
-            </w:r>
-          </w:p>
-          <w:p ns2:paraId="2667BB09" ns2:textId="2C1623C1">
-            <w:pPr>
-              <w:pStyle w:val="841"/>
-              <w:pBdr/>
-              <w:spacing w:after="60"/>
-              <w:ind/>
-              <w:jc w:val="both"/>
-              <w:rPr>
-                <w:bCs/>
-                <w:color w:val="auto"/>
-                <w:sz w:val="18"/>
-                <w:szCs w:val="18"/>
-                <w:vertAlign w:val="superscript"/>
-              </w:rPr>
-            </w:pPr>
-            <w:r>
-              <w:rPr>
-                <w:bCs/>
-                <w:color w:val="auto"/>
-                <w:sz w:val="18"/>
-                <w:szCs w:val="18"/>
-                <w:b/>
-              </w:rPr>
-              <w:t>Ministério Público Estadual</w:t>
-            </w:r>
-          </w:p>
-          <w:p ns2:paraId="2667BB09" ns2:textId="2C1623C1">
-            <w:pPr>
-              <w:pStyle w:val="841"/>
-              <w:pBdr/>
-              <w:spacing w:after="80"/>
-              <w:ind w:left="240"/>
-              <w:jc w:val="both"/>
-              <w:rPr>
-                <w:bCs/>
-                <w:color w:val="auto"/>
-                <w:sz w:val="18"/>
-                <w:szCs w:val="18"/>
-                <w:vertAlign w:val="superscript"/>
-              </w:rPr>
-            </w:pPr>
-            <w:r>
-              <w:rPr>
-                <w:bCs/>
-                <w:color w:val="auto"/>
-                <w:sz w:val="18"/>
-                <w:szCs w:val="18"/>
-              </w:rPr>
-              <w:t>C10: Resolução CNMP nº 171/2017, arts. 16 e 33, Resolução CNMP nº 283/2024, art. 9º, § 2º e art. 33 e Resoluções GPGJ nº 2.675/2025 e nº 2.757/2025 — quadro próprio de TIC, vedação de terceirização de atividades exclusivas e atribuição de funções formais de TIC e segurança no Ministério Público Estadual.</w:t>
+              <w:t>C9: Resolução CNJ nº 468/2022, art. 8º, § 1º — a assessoria técnica terceirizada ao planejamento e à avaliação da qualidade de soluções de TIC deve permanecer sob supervisão exclusiva de membro ou servidor do órgão.</w:t>
             </w:r>
           </w:p>
         </w:tc>
@@ -8705,7 +8602,7 @@
                 <w:sz w:val="18"/>
                 <w:szCs w:val="18"/>
               </w:rPr>
-              <w:t>Poder Executivo Estadual: [C2, C8];</w:t>
+              <w:t>Poder Judiciário Estadual: [C2, C8];</w:t>
             </w:r>
           </w:p>
           <w:p ns2:paraId="11118515" ns2:textId="02403B9E">
@@ -8732,7 +8629,7 @@
                 <w:sz w:val="18"/>
                 <w:szCs w:val="18"/>
               </w:rPr>
-              <w:t>Tipo: Recomendação;</w:t>
+              <w:t>Tipo: Determinação;</w:t>
             </w:r>
           </w:p>
           <w:p ns2:paraId="11118515" ns2:textId="02403B9E">
@@ -8771,22 +8668,22 @@
               </w:numPr>
               <w:pBdr/>
               <w:spacing w:after="40"/>
-              <w:ind w:left="720"/>
-              <w:rPr>
-                <w:rFonts w:ascii="Arial" w:hAnsi="Arial" w:cs="Arial"/>
-                <w:sz w:val="18"/>
-                <w:szCs w:val="18"/>
-              </w:rPr>
-            </w:pPr>
-            <w:r>
-              <w:rPr>
-                <w:rFonts w:ascii="Arial" w:hAnsi="Arial" w:cs="Arial"/>
-                <w:b/>
-                <w:bCs/>
-                <w:sz w:val="18"/>
-                <w:szCs w:val="18"/>
-              </w:rPr>
-              <w:t>Poder Judiciário Estadual: [C2, C9];</w:t>
+              <w:ind w:left="360"/>
+              <w:rPr>
+                <w:rFonts w:ascii="Arial" w:hAnsi="Arial" w:cs="Arial"/>
+                <w:sz w:val="18"/>
+                <w:szCs w:val="18"/>
+              </w:rPr>
+            </w:pPr>
+            <w:r>
+              <w:rPr>
+                <w:rFonts w:ascii="Arial" w:hAnsi="Arial" w:cs="Arial"/>
+                <w:b/>
+                <w:bCs/>
+                <w:sz w:val="18"/>
+                <w:szCs w:val="18"/>
+              </w:rPr>
+              <w:t>Ausência ou insuficiência de definição documentada do quantitativo necessário de pessoal de TIC e segurança da informação.[R4.2, P2, E2, C3, C5];</w:t>
             </w:r>
           </w:p>
           <w:p ns2:paraId="11118515" ns2:textId="02403B9E">
@@ -8798,22 +8695,22 @@
               </w:numPr>
               <w:pBdr/>
               <w:spacing w:after="40"/>
-              <w:ind w:left="1080"/>
-              <w:rPr>
-                <w:rFonts w:ascii="Arial" w:hAnsi="Arial" w:cs="Arial"/>
-                <w:sz w:val="18"/>
-                <w:szCs w:val="18"/>
-              </w:rPr>
-            </w:pPr>
-            <w:r>
-              <w:rPr>
-                <w:rFonts w:ascii="Arial" w:hAnsi="Arial" w:cs="Arial"/>
-                <w:b/>
-                <w:bCs/>
-                <w:sz w:val="18"/>
-                <w:szCs w:val="18"/>
-              </w:rPr>
-              <w:t>Tipo: Determinação;</w:t>
+              <w:ind w:left="720"/>
+              <w:rPr>
+                <w:rFonts w:ascii="Arial" w:hAnsi="Arial" w:cs="Arial"/>
+                <w:sz w:val="18"/>
+                <w:szCs w:val="18"/>
+              </w:rPr>
+            </w:pPr>
+            <w:r>
+              <w:rPr>
+                <w:rFonts w:ascii="Arial" w:hAnsi="Arial" w:cs="Arial"/>
+                <w:b/>
+                <w:bCs/>
+                <w:sz w:val="18"/>
+                <w:szCs w:val="18"/>
+              </w:rPr>
+              <w:t>Tipo: Recomendação;</w:t>
             </w:r>
           </w:p>
           <w:p ns2:paraId="11118515" ns2:textId="02403B9E">
@@ -8825,22 +8722,22 @@
               </w:numPr>
               <w:pBdr/>
               <w:spacing w:after="100"/>
-              <w:ind w:left="1080"/>
-              <w:rPr>
-                <w:rFonts w:ascii="Arial" w:hAnsi="Arial" w:cs="Arial"/>
-                <w:sz w:val="18"/>
-                <w:szCs w:val="18"/>
-              </w:rPr>
-            </w:pPr>
-            <w:r>
-              <w:rPr>
-                <w:rFonts w:ascii="Arial" w:hAnsi="Arial" w:cs="Arial"/>
-                <w:b/>
-                <w:bCs/>
-                <w:sz w:val="18"/>
-                <w:szCs w:val="18"/>
-              </w:rPr>
-              <w:t>Encaminhamento: avalie a força de trabalho dedicada à TIC e adote medidas proporcionais para assegurar capacidade mínima de planejamento, gestão, proteção, contratação, fiscalização e sustentação dos serviços e ativos de TIC</w:t>
+              <w:ind w:left="720"/>
+              <w:rPr>
+                <w:rFonts w:ascii="Arial" w:hAnsi="Arial" w:cs="Arial"/>
+                <w:sz w:val="18"/>
+                <w:szCs w:val="18"/>
+              </w:rPr>
+            </w:pPr>
+            <w:r>
+              <w:rPr>
+                <w:rFonts w:ascii="Arial" w:hAnsi="Arial" w:cs="Arial"/>
+                <w:b/>
+                <w:bCs/>
+                <w:sz w:val="18"/>
+                <w:szCs w:val="18"/>
+              </w:rPr>
+              <w:t>Encaminhamento: estime e mantenha atualizado o quantitativo necessário de pessoal de TIC e segurança da informação, considerando o porte e a complexidade da organização, os serviços críticos, os sistemas mantidos, as contratações vigentes e os riscos relevantes</w:t>
             </w:r>
           </w:p>
           <w:p ns2:paraId="11118515" ns2:textId="02403B9E">
@@ -8867,7 +8764,7 @@
                 <w:sz w:val="18"/>
                 <w:szCs w:val="18"/>
               </w:rPr>
-              <w:t>Ministério Público Estadual: [C2, C10];</w:t>
+              <w:t>Poder Judiciário Estadual: [C3, C8];</w:t>
             </w:r>
           </w:p>
           <w:p ns2:paraId="11118515" ns2:textId="02403B9E">
@@ -8894,7 +8791,7 @@
                 <w:sz w:val="18"/>
                 <w:szCs w:val="18"/>
               </w:rPr>
-              <w:t>Tipo: Recomendação;</w:t>
+              <w:t>Tipo: Determinação;</w:t>
             </w:r>
           </w:p>
           <w:p ns2:paraId="11118515" ns2:textId="02403B9E">
@@ -8921,7 +8818,7 @@
                 <w:sz w:val="18"/>
                 <w:szCs w:val="18"/>
               </w:rPr>
-              <w:t>Encaminhamento: avalie a força de trabalho dedicada à TIC e adote medidas proporcionais para assegurar capacidade mínima de planejamento, gestão, proteção, contratação, fiscalização e sustentação dos serviços e ativos de TIC</w:t>
+              <w:t>Encaminhamento: estime e mantenha atualizado o quantitativo necessário de pessoal de TIC e segurança da informação, considerando o porte e a complexidade da organização, os serviços críticos, os sistemas mantidos, as contratações vigentes e os riscos relevantes</w:t>
             </w:r>
           </w:p>
           <w:p ns2:paraId="11118515" ns2:textId="02403B9E">
@@ -8948,7 +8845,7 @@
                 <w:sz w:val="18"/>
                 <w:szCs w:val="18"/>
               </w:rPr>
-              <w:t>Ausência ou insuficiência de definição documentada do quantitativo necessário de pessoal de TIC e segurança da informação.[R4.2, P2, E2, C3, C5];</w:t>
+              <w:t>Ausência de cargos ou funções formalmente atribuídos à TIC ou à segurança da informação.[R4.3, P3, E3, C1, C2];</w:t>
             </w:r>
           </w:p>
           <w:p ns2:paraId="11118515" ns2:textId="02403B9E">
@@ -9002,7 +8899,7 @@
                 <w:sz w:val="18"/>
                 <w:szCs w:val="18"/>
               </w:rPr>
-              <w:t>Encaminhamento: estime e mantenha atualizado o quantitativo necessário de pessoal de TIC e segurança da informação, considerando o porte e a complexidade da organização, os serviços críticos, os sistemas mantidos, as contratações vigentes e os riscos relevantes</w:t>
+              <w:t>Encaminhamento: avalie a necessidade de formalizar a atribuição de cargos ou funções à TIC e à segurança da informação e adote solução compatível com as necessidades institucionais e a capacidade administrativa da organização</w:t>
             </w:r>
           </w:p>
           <w:p ns2:paraId="11118515" ns2:textId="02403B9E">
@@ -9014,22 +8911,22 @@
               </w:numPr>
               <w:pBdr/>
               <w:spacing w:after="40"/>
-              <w:ind w:left="720"/>
-              <w:rPr>
-                <w:rFonts w:ascii="Arial" w:hAnsi="Arial" w:cs="Arial"/>
-                <w:sz w:val="18"/>
-                <w:szCs w:val="18"/>
-              </w:rPr>
-            </w:pPr>
-            <w:r>
-              <w:rPr>
-                <w:rFonts w:ascii="Arial" w:hAnsi="Arial" w:cs="Arial"/>
-                <w:b/>
-                <w:bCs/>
-                <w:sz w:val="18"/>
-                <w:szCs w:val="18"/>
-              </w:rPr>
-              <w:t>Poder Executivo Estadual: [C3, C8];</w:t>
+              <w:ind w:left="360"/>
+              <w:rPr>
+                <w:rFonts w:ascii="Arial" w:hAnsi="Arial" w:cs="Arial"/>
+                <w:sz w:val="18"/>
+                <w:szCs w:val="18"/>
+              </w:rPr>
+            </w:pPr>
+            <w:r>
+              <w:rPr>
+                <w:rFonts w:ascii="Arial" w:hAnsi="Arial" w:cs="Arial"/>
+                <w:b/>
+                <w:bCs/>
+                <w:sz w:val="18"/>
+                <w:szCs w:val="18"/>
+              </w:rPr>
+              <w:t>Operação de TIC predominantemente terceirizada sem profissionais internos de TIC.[R4.4, P4, E4, C4, C7];</w:t>
             </w:r>
           </w:p>
           <w:p ns2:paraId="11118515" ns2:textId="02403B9E">
@@ -9041,7 +8938,7 @@
               </w:numPr>
               <w:pBdr/>
               <w:spacing w:after="40"/>
-              <w:ind w:left="1080"/>
+              <w:ind w:left="720"/>
               <w:rPr>
                 <w:rFonts w:ascii="Arial" w:hAnsi="Arial" w:cs="Arial"/>
                 <w:sz w:val="18"/>
@@ -9068,22 +8965,22 @@
               </w:numPr>
               <w:pBdr/>
               <w:spacing w:after="100"/>
-              <w:ind w:left="1080"/>
-              <w:rPr>
-                <w:rFonts w:ascii="Arial" w:hAnsi="Arial" w:cs="Arial"/>
-                <w:sz w:val="18"/>
-                <w:szCs w:val="18"/>
-              </w:rPr>
-            </w:pPr>
-            <w:r>
-              <w:rPr>
-                <w:rFonts w:ascii="Arial" w:hAnsi="Arial" w:cs="Arial"/>
-                <w:b/>
-                <w:bCs/>
-                <w:sz w:val="18"/>
-                <w:szCs w:val="18"/>
-              </w:rPr>
-              <w:t>Encaminhamento: estime e mantenha atualizado o quantitativo necessário de pessoal de TIC e segurança da informação, considerando o porte e a complexidade da organização, os serviços críticos, os sistemas mantidos, as contratações vigentes e os riscos relevantes</w:t>
+              <w:ind w:left="720"/>
+              <w:rPr>
+                <w:rFonts w:ascii="Arial" w:hAnsi="Arial" w:cs="Arial"/>
+                <w:sz w:val="18"/>
+                <w:szCs w:val="18"/>
+              </w:rPr>
+            </w:pPr>
+            <w:r>
+              <w:rPr>
+                <w:rFonts w:ascii="Arial" w:hAnsi="Arial" w:cs="Arial"/>
+                <w:b/>
+                <w:bCs/>
+                <w:sz w:val="18"/>
+                <w:szCs w:val="18"/>
+              </w:rPr>
+              <w:t>Encaminhamento: avalie o modelo de operação de TIC e adote medidas proporcionais para assegurar capacidade interna suficiente para coordenar, supervisionar e fiscalizar as atividades e os contratos de TIC executados predominantemente por terceiros, preservando responsabilização e retenção de conhecimento</w:t>
             </w:r>
           </w:p>
           <w:p ns2:paraId="11118515" ns2:textId="02403B9E">
@@ -9110,736 +9007,7 @@
                 <w:sz w:val="18"/>
                 <w:szCs w:val="18"/>
               </w:rPr>
-              <w:t>Poder Judiciário Estadual: [C3, C9];</w:t>
-            </w:r>
-          </w:p>
-          <w:p ns2:paraId="11118515" ns2:textId="02403B9E">
-            <w:pPr>
-              <w:pStyle w:val="843"/>
-              <w:numPr>
-                <w:ilvl w:val="0"/>
-                <w:numId w:val="11"/>
-              </w:numPr>
-              <w:pBdr/>
-              <w:spacing w:after="40"/>
-              <w:ind w:left="1080"/>
-              <w:rPr>
-                <w:rFonts w:ascii="Arial" w:hAnsi="Arial" w:cs="Arial"/>
-                <w:sz w:val="18"/>
-                <w:szCs w:val="18"/>
-              </w:rPr>
-            </w:pPr>
-            <w:r>
-              <w:rPr>
-                <w:rFonts w:ascii="Arial" w:hAnsi="Arial" w:cs="Arial"/>
-                <w:b/>
-                <w:bCs/>
-                <w:sz w:val="18"/>
-                <w:szCs w:val="18"/>
-              </w:rPr>
-              <w:t>Tipo: Determinação;</w:t>
-            </w:r>
-          </w:p>
-          <w:p ns2:paraId="11118515" ns2:textId="02403B9E">
-            <w:pPr>
-              <w:pStyle w:val="843"/>
-              <w:numPr>
-                <w:ilvl w:val="0"/>
-                <w:numId w:val="11"/>
-              </w:numPr>
-              <w:pBdr/>
-              <w:spacing w:after="100"/>
-              <w:ind w:left="1080"/>
-              <w:rPr>
-                <w:rFonts w:ascii="Arial" w:hAnsi="Arial" w:cs="Arial"/>
-                <w:sz w:val="18"/>
-                <w:szCs w:val="18"/>
-              </w:rPr>
-            </w:pPr>
-            <w:r>
-              <w:rPr>
-                <w:rFonts w:ascii="Arial" w:hAnsi="Arial" w:cs="Arial"/>
-                <w:b/>
-                <w:bCs/>
-                <w:sz w:val="18"/>
-                <w:szCs w:val="18"/>
-              </w:rPr>
-              <w:t>Encaminhamento: estime e mantenha atualizado o quantitativo necessário de pessoal de TIC e segurança da informação, considerando o porte e a complexidade da organização, os serviços críticos, os sistemas mantidos, as contratações vigentes e os riscos relevantes</w:t>
-            </w:r>
-          </w:p>
-          <w:p ns2:paraId="11118515" ns2:textId="02403B9E">
-            <w:pPr>
-              <w:pStyle w:val="843"/>
-              <w:numPr>
-                <w:ilvl w:val="0"/>
-                <w:numId w:val="11"/>
-              </w:numPr>
-              <w:pBdr/>
-              <w:spacing w:after="40"/>
-              <w:ind w:left="720"/>
-              <w:rPr>
-                <w:rFonts w:ascii="Arial" w:hAnsi="Arial" w:cs="Arial"/>
-                <w:sz w:val="18"/>
-                <w:szCs w:val="18"/>
-              </w:rPr>
-            </w:pPr>
-            <w:r>
-              <w:rPr>
-                <w:rFonts w:ascii="Arial" w:hAnsi="Arial" w:cs="Arial"/>
-                <w:b/>
-                <w:bCs/>
-                <w:sz w:val="18"/>
-                <w:szCs w:val="18"/>
-              </w:rPr>
-              <w:t>Ministério Público Estadual: [C3, C10];</w:t>
-            </w:r>
-          </w:p>
-          <w:p ns2:paraId="11118515" ns2:textId="02403B9E">
-            <w:pPr>
-              <w:pStyle w:val="843"/>
-              <w:numPr>
-                <w:ilvl w:val="0"/>
-                <w:numId w:val="11"/>
-              </w:numPr>
-              <w:pBdr/>
-              <w:spacing w:after="40"/>
-              <w:ind w:left="1080"/>
-              <w:rPr>
-                <w:rFonts w:ascii="Arial" w:hAnsi="Arial" w:cs="Arial"/>
-                <w:sz w:val="18"/>
-                <w:szCs w:val="18"/>
-              </w:rPr>
-            </w:pPr>
-            <w:r>
-              <w:rPr>
-                <w:rFonts w:ascii="Arial" w:hAnsi="Arial" w:cs="Arial"/>
-                <w:b/>
-                <w:bCs/>
-                <w:sz w:val="18"/>
-                <w:szCs w:val="18"/>
-              </w:rPr>
-              <w:t>Tipo: Recomendação;</w:t>
-            </w:r>
-          </w:p>
-          <w:p ns2:paraId="11118515" ns2:textId="02403B9E">
-            <w:pPr>
-              <w:pStyle w:val="843"/>
-              <w:numPr>
-                <w:ilvl w:val="0"/>
-                <w:numId w:val="11"/>
-              </w:numPr>
-              <w:pBdr/>
-              <w:spacing w:after="100"/>
-              <w:ind w:left="1080"/>
-              <w:rPr>
-                <w:rFonts w:ascii="Arial" w:hAnsi="Arial" w:cs="Arial"/>
-                <w:sz w:val="18"/>
-                <w:szCs w:val="18"/>
-              </w:rPr>
-            </w:pPr>
-            <w:r>
-              <w:rPr>
-                <w:rFonts w:ascii="Arial" w:hAnsi="Arial" w:cs="Arial"/>
-                <w:b/>
-                <w:bCs/>
-                <w:sz w:val="18"/>
-                <w:szCs w:val="18"/>
-              </w:rPr>
-              <w:t>Encaminhamento: estime e mantenha atualizado o quantitativo necessário de pessoal de TIC e segurança da informação, considerando o porte e a complexidade da organização, os serviços críticos, os sistemas mantidos, as contratações vigentes e os riscos relevantes</w:t>
-            </w:r>
-          </w:p>
-          <w:p ns2:paraId="11118515" ns2:textId="02403B9E">
-            <w:pPr>
-              <w:pStyle w:val="843"/>
-              <w:numPr>
-                <w:ilvl w:val="0"/>
-                <w:numId w:val="11"/>
-              </w:numPr>
-              <w:pBdr/>
-              <w:spacing w:after="40"/>
-              <w:ind w:left="360"/>
-              <w:rPr>
-                <w:rFonts w:ascii="Arial" w:hAnsi="Arial" w:cs="Arial"/>
-                <w:sz w:val="18"/>
-                <w:szCs w:val="18"/>
-              </w:rPr>
-            </w:pPr>
-            <w:r>
-              <w:rPr>
-                <w:rFonts w:ascii="Arial" w:hAnsi="Arial" w:cs="Arial"/>
-                <w:b/>
-                <w:bCs/>
-                <w:sz w:val="18"/>
-                <w:szCs w:val="18"/>
-              </w:rPr>
-              <w:t>Ausência de cargos ou funções formalmente atribuídos à TIC ou à segurança da informação.[R4.3, P3, E3, C1, C2];</w:t>
-            </w:r>
-          </w:p>
-          <w:p ns2:paraId="11118515" ns2:textId="02403B9E">
-            <w:pPr>
-              <w:pStyle w:val="843"/>
-              <w:numPr>
-                <w:ilvl w:val="0"/>
-                <w:numId w:val="11"/>
-              </w:numPr>
-              <w:pBdr/>
-              <w:spacing w:after="40"/>
-              <w:ind w:left="720"/>
-              <w:rPr>
-                <w:rFonts w:ascii="Arial" w:hAnsi="Arial" w:cs="Arial"/>
-                <w:sz w:val="18"/>
-                <w:szCs w:val="18"/>
-              </w:rPr>
-            </w:pPr>
-            <w:r>
-              <w:rPr>
-                <w:rFonts w:ascii="Arial" w:hAnsi="Arial" w:cs="Arial"/>
-                <w:b/>
-                <w:bCs/>
-                <w:sz w:val="18"/>
-                <w:szCs w:val="18"/>
-              </w:rPr>
-              <w:t>Tipo: Recomendação;</w:t>
-            </w:r>
-          </w:p>
-          <w:p ns2:paraId="11118515" ns2:textId="02403B9E">
-            <w:pPr>
-              <w:pStyle w:val="843"/>
-              <w:numPr>
-                <w:ilvl w:val="0"/>
-                <w:numId w:val="11"/>
-              </w:numPr>
-              <w:pBdr/>
-              <w:spacing w:after="100"/>
-              <w:ind w:left="720"/>
-              <w:rPr>
-                <w:rFonts w:ascii="Arial" w:hAnsi="Arial" w:cs="Arial"/>
-                <w:sz w:val="18"/>
-                <w:szCs w:val="18"/>
-              </w:rPr>
-            </w:pPr>
-            <w:r>
-              <w:rPr>
-                <w:rFonts w:ascii="Arial" w:hAnsi="Arial" w:cs="Arial"/>
-                <w:b/>
-                <w:bCs/>
-                <w:sz w:val="18"/>
-                <w:szCs w:val="18"/>
-              </w:rPr>
-              <w:t>Encaminhamento: avalie a necessidade de formalizar a atribuição de cargos ou funções à TIC e à segurança da informação e adote solução compatível com as necessidades institucionais e a capacidade administrativa da organização</w:t>
-            </w:r>
-          </w:p>
-          <w:p ns2:paraId="11118515" ns2:textId="02403B9E">
-            <w:pPr>
-              <w:pStyle w:val="843"/>
-              <w:numPr>
-                <w:ilvl w:val="0"/>
-                <w:numId w:val="11"/>
-              </w:numPr>
-              <w:pBdr/>
-              <w:spacing w:after="40"/>
-              <w:ind w:left="720"/>
-              <w:rPr>
-                <w:rFonts w:ascii="Arial" w:hAnsi="Arial" w:cs="Arial"/>
-                <w:sz w:val="18"/>
-                <w:szCs w:val="18"/>
-              </w:rPr>
-            </w:pPr>
-            <w:r>
-              <w:rPr>
-                <w:rFonts w:ascii="Arial" w:hAnsi="Arial" w:cs="Arial"/>
-                <w:b/>
-                <w:bCs/>
-                <w:sz w:val="18"/>
-                <w:szCs w:val="18"/>
-              </w:rPr>
-              <w:t>Poder Executivo Estadual: [C1, C8];</w:t>
-            </w:r>
-          </w:p>
-          <w:p ns2:paraId="11118515" ns2:textId="02403B9E">
-            <w:pPr>
-              <w:pStyle w:val="843"/>
-              <w:numPr>
-                <w:ilvl w:val="0"/>
-                <w:numId w:val="11"/>
-              </w:numPr>
-              <w:pBdr/>
-              <w:spacing w:after="40"/>
-              <w:ind w:left="1080"/>
-              <w:rPr>
-                <w:rFonts w:ascii="Arial" w:hAnsi="Arial" w:cs="Arial"/>
-                <w:sz w:val="18"/>
-                <w:szCs w:val="18"/>
-              </w:rPr>
-            </w:pPr>
-            <w:r>
-              <w:rPr>
-                <w:rFonts w:ascii="Arial" w:hAnsi="Arial" w:cs="Arial"/>
-                <w:b/>
-                <w:bCs/>
-                <w:sz w:val="18"/>
-                <w:szCs w:val="18"/>
-              </w:rPr>
-              <w:t>Tipo: Recomendação;</w:t>
-            </w:r>
-          </w:p>
-          <w:p ns2:paraId="11118515" ns2:textId="02403B9E">
-            <w:pPr>
-              <w:pStyle w:val="843"/>
-              <w:numPr>
-                <w:ilvl w:val="0"/>
-                <w:numId w:val="11"/>
-              </w:numPr>
-              <w:pBdr/>
-              <w:spacing w:after="100"/>
-              <w:ind w:left="1080"/>
-              <w:rPr>
-                <w:rFonts w:ascii="Arial" w:hAnsi="Arial" w:cs="Arial"/>
-                <w:sz w:val="18"/>
-                <w:szCs w:val="18"/>
-              </w:rPr>
-            </w:pPr>
-            <w:r>
-              <w:rPr>
-                <w:rFonts w:ascii="Arial" w:hAnsi="Arial" w:cs="Arial"/>
-                <w:b/>
-                <w:bCs/>
-                <w:sz w:val="18"/>
-                <w:szCs w:val="18"/>
-              </w:rPr>
-              <w:t>Encaminhamento: avalie a necessidade de formalizar a atribuição de cargos ou funções à TIC e à segurança da informação e adote solução compatível com as necessidades institucionais e a capacidade administrativa da organização</w:t>
-            </w:r>
-          </w:p>
-          <w:p ns2:paraId="11118515" ns2:textId="02403B9E">
-            <w:pPr>
-              <w:pStyle w:val="843"/>
-              <w:numPr>
-                <w:ilvl w:val="0"/>
-                <w:numId w:val="11"/>
-              </w:numPr>
-              <w:pBdr/>
-              <w:spacing w:after="40"/>
-              <w:ind w:left="720"/>
-              <w:rPr>
-                <w:rFonts w:ascii="Arial" w:hAnsi="Arial" w:cs="Arial"/>
-                <w:sz w:val="18"/>
-                <w:szCs w:val="18"/>
-              </w:rPr>
-            </w:pPr>
-            <w:r>
-              <w:rPr>
-                <w:rFonts w:ascii="Arial" w:hAnsi="Arial" w:cs="Arial"/>
-                <w:b/>
-                <w:bCs/>
-                <w:sz w:val="18"/>
-                <w:szCs w:val="18"/>
-              </w:rPr>
-              <w:t>Poder Judiciário Estadual: [C1, C9];</w:t>
-            </w:r>
-          </w:p>
-          <w:p ns2:paraId="11118515" ns2:textId="02403B9E">
-            <w:pPr>
-              <w:pStyle w:val="843"/>
-              <w:numPr>
-                <w:ilvl w:val="0"/>
-                <w:numId w:val="11"/>
-              </w:numPr>
-              <w:pBdr/>
-              <w:spacing w:after="40"/>
-              <w:ind w:left="1080"/>
-              <w:rPr>
-                <w:rFonts w:ascii="Arial" w:hAnsi="Arial" w:cs="Arial"/>
-                <w:sz w:val="18"/>
-                <w:szCs w:val="18"/>
-              </w:rPr>
-            </w:pPr>
-            <w:r>
-              <w:rPr>
-                <w:rFonts w:ascii="Arial" w:hAnsi="Arial" w:cs="Arial"/>
-                <w:b/>
-                <w:bCs/>
-                <w:sz w:val="18"/>
-                <w:szCs w:val="18"/>
-              </w:rPr>
-              <w:t>Tipo: Recomendação;</w:t>
-            </w:r>
-          </w:p>
-          <w:p ns2:paraId="11118515" ns2:textId="02403B9E">
-            <w:pPr>
-              <w:pStyle w:val="843"/>
-              <w:numPr>
-                <w:ilvl w:val="0"/>
-                <w:numId w:val="11"/>
-              </w:numPr>
-              <w:pBdr/>
-              <w:spacing w:after="100"/>
-              <w:ind w:left="1080"/>
-              <w:rPr>
-                <w:rFonts w:ascii="Arial" w:hAnsi="Arial" w:cs="Arial"/>
-                <w:sz w:val="18"/>
-                <w:szCs w:val="18"/>
-              </w:rPr>
-            </w:pPr>
-            <w:r>
-              <w:rPr>
-                <w:rFonts w:ascii="Arial" w:hAnsi="Arial" w:cs="Arial"/>
-                <w:b/>
-                <w:bCs/>
-                <w:sz w:val="18"/>
-                <w:szCs w:val="18"/>
-              </w:rPr>
-              <w:t>Encaminhamento: avalie a necessidade de formalizar a atribuição de cargos ou funções à TIC e à segurança da informação e adote solução compatível com as necessidades institucionais e a capacidade administrativa da organização</w:t>
-            </w:r>
-          </w:p>
-          <w:p ns2:paraId="11118515" ns2:textId="02403B9E">
-            <w:pPr>
-              <w:pStyle w:val="843"/>
-              <w:numPr>
-                <w:ilvl w:val="0"/>
-                <w:numId w:val="11"/>
-              </w:numPr>
-              <w:pBdr/>
-              <w:spacing w:after="40"/>
-              <w:ind w:left="720"/>
-              <w:rPr>
-                <w:rFonts w:ascii="Arial" w:hAnsi="Arial" w:cs="Arial"/>
-                <w:sz w:val="18"/>
-                <w:szCs w:val="18"/>
-              </w:rPr>
-            </w:pPr>
-            <w:r>
-              <w:rPr>
-                <w:rFonts w:ascii="Arial" w:hAnsi="Arial" w:cs="Arial"/>
-                <w:b/>
-                <w:bCs/>
-                <w:sz w:val="18"/>
-                <w:szCs w:val="18"/>
-              </w:rPr>
-              <w:t>Ministério Público Estadual: [C1, C10];</w:t>
-            </w:r>
-          </w:p>
-          <w:p ns2:paraId="11118515" ns2:textId="02403B9E">
-            <w:pPr>
-              <w:pStyle w:val="843"/>
-              <w:numPr>
-                <w:ilvl w:val="0"/>
-                <w:numId w:val="11"/>
-              </w:numPr>
-              <w:pBdr/>
-              <w:spacing w:after="40"/>
-              <w:ind w:left="1080"/>
-              <w:rPr>
-                <w:rFonts w:ascii="Arial" w:hAnsi="Arial" w:cs="Arial"/>
-                <w:sz w:val="18"/>
-                <w:szCs w:val="18"/>
-              </w:rPr>
-            </w:pPr>
-            <w:r>
-              <w:rPr>
-                <w:rFonts w:ascii="Arial" w:hAnsi="Arial" w:cs="Arial"/>
-                <w:b/>
-                <w:bCs/>
-                <w:sz w:val="18"/>
-                <w:szCs w:val="18"/>
-              </w:rPr>
-              <w:t>Tipo: Recomendação;</w:t>
-            </w:r>
-          </w:p>
-          <w:p ns2:paraId="11118515" ns2:textId="02403B9E">
-            <w:pPr>
-              <w:pStyle w:val="843"/>
-              <w:numPr>
-                <w:ilvl w:val="0"/>
-                <w:numId w:val="11"/>
-              </w:numPr>
-              <w:pBdr/>
-              <w:spacing w:after="100"/>
-              <w:ind w:left="1080"/>
-              <w:rPr>
-                <w:rFonts w:ascii="Arial" w:hAnsi="Arial" w:cs="Arial"/>
-                <w:sz w:val="18"/>
-                <w:szCs w:val="18"/>
-              </w:rPr>
-            </w:pPr>
-            <w:r>
-              <w:rPr>
-                <w:rFonts w:ascii="Arial" w:hAnsi="Arial" w:cs="Arial"/>
-                <w:b/>
-                <w:bCs/>
-                <w:sz w:val="18"/>
-                <w:szCs w:val="18"/>
-              </w:rPr>
-              <w:t>Encaminhamento: avalie a necessidade de formalizar a atribuição de cargos ou funções à TIC e à segurança da informação e adote solução compatível com as necessidades institucionais e a capacidade administrativa da organização</w:t>
-            </w:r>
-          </w:p>
-          <w:p ns2:paraId="11118515" ns2:textId="02403B9E">
-            <w:pPr>
-              <w:pStyle w:val="843"/>
-              <w:numPr>
-                <w:ilvl w:val="0"/>
-                <w:numId w:val="11"/>
-              </w:numPr>
-              <w:pBdr/>
-              <w:spacing w:after="40"/>
-              <w:ind w:left="360"/>
-              <w:rPr>
-                <w:rFonts w:ascii="Arial" w:hAnsi="Arial" w:cs="Arial"/>
-                <w:sz w:val="18"/>
-                <w:szCs w:val="18"/>
-              </w:rPr>
-            </w:pPr>
-            <w:r>
-              <w:rPr>
-                <w:rFonts w:ascii="Arial" w:hAnsi="Arial" w:cs="Arial"/>
-                <w:b/>
-                <w:bCs/>
-                <w:sz w:val="18"/>
-                <w:szCs w:val="18"/>
-              </w:rPr>
-              <w:t>Operação de TIC predominantemente terceirizada sem profissionais internos de TIC.[R4.4, P4, E4, C4, C7];</w:t>
-            </w:r>
-          </w:p>
-          <w:p ns2:paraId="11118515" ns2:textId="02403B9E">
-            <w:pPr>
-              <w:pStyle w:val="843"/>
-              <w:numPr>
-                <w:ilvl w:val="0"/>
-                <w:numId w:val="11"/>
-              </w:numPr>
-              <w:pBdr/>
-              <w:spacing w:after="40"/>
-              <w:ind w:left="720"/>
-              <w:rPr>
-                <w:rFonts w:ascii="Arial" w:hAnsi="Arial" w:cs="Arial"/>
-                <w:sz w:val="18"/>
-                <w:szCs w:val="18"/>
-              </w:rPr>
-            </w:pPr>
-            <w:r>
-              <w:rPr>
-                <w:rFonts w:ascii="Arial" w:hAnsi="Arial" w:cs="Arial"/>
-                <w:b/>
-                <w:bCs/>
-                <w:sz w:val="18"/>
-                <w:szCs w:val="18"/>
-              </w:rPr>
-              <w:t>Tipo: Recomendação;</w:t>
-            </w:r>
-          </w:p>
-          <w:p ns2:paraId="11118515" ns2:textId="02403B9E">
-            <w:pPr>
-              <w:pStyle w:val="843"/>
-              <w:numPr>
-                <w:ilvl w:val="0"/>
-                <w:numId w:val="11"/>
-              </w:numPr>
-              <w:pBdr/>
-              <w:spacing w:after="100"/>
-              <w:ind w:left="720"/>
-              <w:rPr>
-                <w:rFonts w:ascii="Arial" w:hAnsi="Arial" w:cs="Arial"/>
-                <w:sz w:val="18"/>
-                <w:szCs w:val="18"/>
-              </w:rPr>
-            </w:pPr>
-            <w:r>
-              <w:rPr>
-                <w:rFonts w:ascii="Arial" w:hAnsi="Arial" w:cs="Arial"/>
-                <w:b/>
-                <w:bCs/>
-                <w:sz w:val="18"/>
-                <w:szCs w:val="18"/>
-              </w:rPr>
-              <w:t>Encaminhamento: avalie o modelo de operação de TIC e adote medidas proporcionais para assegurar capacidade interna suficiente para coordenar, supervisionar e fiscalizar as atividades e os contratos de TIC executados predominantemente por terceiros, preservando responsabilização e retenção de conhecimento</w:t>
-            </w:r>
-          </w:p>
-          <w:p ns2:paraId="11118515" ns2:textId="02403B9E">
-            <w:pPr>
-              <w:pStyle w:val="843"/>
-              <w:numPr>
-                <w:ilvl w:val="0"/>
-                <w:numId w:val="11"/>
-              </w:numPr>
-              <w:pBdr/>
-              <w:spacing w:after="40"/>
-              <w:ind w:left="720"/>
-              <w:rPr>
-                <w:rFonts w:ascii="Arial" w:hAnsi="Arial" w:cs="Arial"/>
-                <w:sz w:val="18"/>
-                <w:szCs w:val="18"/>
-              </w:rPr>
-            </w:pPr>
-            <w:r>
-              <w:rPr>
-                <w:rFonts w:ascii="Arial" w:hAnsi="Arial" w:cs="Arial"/>
-                <w:b/>
-                <w:bCs/>
-                <w:sz w:val="18"/>
-                <w:szCs w:val="18"/>
-              </w:rPr>
-              <w:t>Poder Executivo Estadual: [C4, C7, C8];</w:t>
-            </w:r>
-          </w:p>
-          <w:p ns2:paraId="11118515" ns2:textId="02403B9E">
-            <w:pPr>
-              <w:pStyle w:val="843"/>
-              <w:numPr>
-                <w:ilvl w:val="0"/>
-                <w:numId w:val="11"/>
-              </w:numPr>
-              <w:pBdr/>
-              <w:spacing w:after="40"/>
-              <w:ind w:left="1080"/>
-              <w:rPr>
-                <w:rFonts w:ascii="Arial" w:hAnsi="Arial" w:cs="Arial"/>
-                <w:sz w:val="18"/>
-                <w:szCs w:val="18"/>
-              </w:rPr>
-            </w:pPr>
-            <w:r>
-              <w:rPr>
-                <w:rFonts w:ascii="Arial" w:hAnsi="Arial" w:cs="Arial"/>
-                <w:b/>
-                <w:bCs/>
-                <w:sz w:val="18"/>
-                <w:szCs w:val="18"/>
-              </w:rPr>
-              <w:t>Tipo: Recomendação;</w:t>
-            </w:r>
-          </w:p>
-          <w:p ns2:paraId="11118515" ns2:textId="02403B9E">
-            <w:pPr>
-              <w:pStyle w:val="843"/>
-              <w:numPr>
-                <w:ilvl w:val="0"/>
-                <w:numId w:val="11"/>
-              </w:numPr>
-              <w:pBdr/>
-              <w:spacing w:after="100"/>
-              <w:ind w:left="1080"/>
-              <w:rPr>
-                <w:rFonts w:ascii="Arial" w:hAnsi="Arial" w:cs="Arial"/>
-                <w:sz w:val="18"/>
-                <w:szCs w:val="18"/>
-              </w:rPr>
-            </w:pPr>
-            <w:r>
-              <w:rPr>
-                <w:rFonts w:ascii="Arial" w:hAnsi="Arial" w:cs="Arial"/>
-                <w:b/>
-                <w:bCs/>
-                <w:sz w:val="18"/>
-                <w:szCs w:val="18"/>
-              </w:rPr>
-              <w:t>Encaminhamento: avalie o modelo de operação de TIC e adote medidas proporcionais para assegurar capacidade interna suficiente para coordenar, supervisionar e fiscalizar as atividades e os contratos de TIC executados predominantemente por terceiros, preservando responsabilização e retenção de conhecimento</w:t>
-            </w:r>
-          </w:p>
-          <w:p ns2:paraId="11118515" ns2:textId="02403B9E">
-            <w:pPr>
-              <w:pStyle w:val="843"/>
-              <w:numPr>
-                <w:ilvl w:val="0"/>
-                <w:numId w:val="11"/>
-              </w:numPr>
-              <w:pBdr/>
-              <w:spacing w:after="40"/>
-              <w:ind w:left="720"/>
-              <w:rPr>
-                <w:rFonts w:ascii="Arial" w:hAnsi="Arial" w:cs="Arial"/>
-                <w:sz w:val="18"/>
-                <w:szCs w:val="18"/>
-              </w:rPr>
-            </w:pPr>
-            <w:r>
-              <w:rPr>
-                <w:rFonts w:ascii="Arial" w:hAnsi="Arial" w:cs="Arial"/>
-                <w:b/>
-                <w:bCs/>
-                <w:sz w:val="18"/>
-                <w:szCs w:val="18"/>
-              </w:rPr>
               <w:t>Poder Judiciário Estadual: [C4, C7, C9];</w:t>
-            </w:r>
-          </w:p>
-          <w:p ns2:paraId="11118515" ns2:textId="02403B9E">
-            <w:pPr>
-              <w:pStyle w:val="843"/>
-              <w:numPr>
-                <w:ilvl w:val="0"/>
-                <w:numId w:val="11"/>
-              </w:numPr>
-              <w:pBdr/>
-              <w:spacing w:after="40"/>
-              <w:ind w:left="1080"/>
-              <w:rPr>
-                <w:rFonts w:ascii="Arial" w:hAnsi="Arial" w:cs="Arial"/>
-                <w:sz w:val="18"/>
-                <w:szCs w:val="18"/>
-              </w:rPr>
-            </w:pPr>
-            <w:r>
-              <w:rPr>
-                <w:rFonts w:ascii="Arial" w:hAnsi="Arial" w:cs="Arial"/>
-                <w:b/>
-                <w:bCs/>
-                <w:sz w:val="18"/>
-                <w:szCs w:val="18"/>
-              </w:rPr>
-              <w:t>Tipo: Determinação;</w:t>
-            </w:r>
-          </w:p>
-          <w:p ns2:paraId="11118515" ns2:textId="02403B9E">
-            <w:pPr>
-              <w:pStyle w:val="843"/>
-              <w:numPr>
-                <w:ilvl w:val="0"/>
-                <w:numId w:val="11"/>
-              </w:numPr>
-              <w:pBdr/>
-              <w:spacing w:after="100"/>
-              <w:ind w:left="1080"/>
-              <w:rPr>
-                <w:rFonts w:ascii="Arial" w:hAnsi="Arial" w:cs="Arial"/>
-                <w:sz w:val="18"/>
-                <w:szCs w:val="18"/>
-              </w:rPr>
-            </w:pPr>
-            <w:r>
-              <w:rPr>
-                <w:rFonts w:ascii="Arial" w:hAnsi="Arial" w:cs="Arial"/>
-                <w:b/>
-                <w:bCs/>
-                <w:sz w:val="18"/>
-                <w:szCs w:val="18"/>
-              </w:rPr>
-              <w:t>Encaminhamento: avalie o modelo de operação de TIC e adote medidas proporcionais para assegurar capacidade interna suficiente para coordenar, supervisionar e fiscalizar as atividades e os contratos de TIC executados predominantemente por terceiros, preservando responsabilização e retenção de conhecimento</w:t>
-            </w:r>
-          </w:p>
-          <w:p ns2:paraId="11118515" ns2:textId="02403B9E">
-            <w:pPr>
-              <w:pStyle w:val="843"/>
-              <w:numPr>
-                <w:ilvl w:val="0"/>
-                <w:numId w:val="11"/>
-              </w:numPr>
-              <w:pBdr/>
-              <w:spacing w:after="40"/>
-              <w:ind w:left="720"/>
-              <w:rPr>
-                <w:rFonts w:ascii="Arial" w:hAnsi="Arial" w:cs="Arial"/>
-                <w:sz w:val="18"/>
-                <w:szCs w:val="18"/>
-              </w:rPr>
-            </w:pPr>
-            <w:r>
-              <w:rPr>
-                <w:rFonts w:ascii="Arial" w:hAnsi="Arial" w:cs="Arial"/>
-                <w:b/>
-                <w:bCs/>
-                <w:sz w:val="18"/>
-                <w:szCs w:val="18"/>
-              </w:rPr>
-              <w:t>Ministério Público Estadual: [C4, C7, C10];</w:t>
             </w:r>
           </w:p>
           <w:p ns2:paraId="11118515" ns2:textId="02403B9E">
@@ -10884,7 +10052,7 @@
                 <w:sz w:val="18"/>
                 <w:szCs w:val="18"/>
               </w:rPr>
-              <w:t>C5: COBIT 2019, DSS02.02, DSS02.04 e DSS02.07 - Requisições de serviço e incidentes gerenciados: registrar, classificar, priorizar, investigar, diagnosticar, resolver, acompanhar e reportar incidentes e requisições de serviço.</w:t>
+              <w:t>C5: COBIT 2019, DSS02.02 - Classificar solicitações e incidentes: registrar, classificar e priorizar incidentes e requisições de serviço conforme critérios definidos.</w:t>
             </w:r>
           </w:p>
           <w:p ns2:paraId="2667BB09" ns2:textId="2C1623C1">
@@ -10909,7 +10077,7 @@
                 <w:sz w:val="18"/>
                 <w:szCs w:val="18"/>
               </w:rPr>
-              <w:t>C6: Acórdão TCE-RJ nº 44.490/2024-PLEN, itens II.7.4, III.9.4 e V.6.1 – Recomendações quanto à estruturação do catálogo de serviços de TIC, incluindo descrição dos serviços, metas, formas de acesso e disponibilidade aos usuários.</w:t>
+              <w:t>C6: Acórdão TCE-RJ nº 44.490/2024-PLEN, item II.7.4 — precedente quanto à estruturação do catálogo de serviços de TIC, incluindo descrição dos serviços, metas, formas de acesso e disponibilidade aos usuários.</w:t>
             </w:r>
           </w:p>
           <w:p ns2:paraId="2667BB09" ns2:textId="2C1623C1">
@@ -10934,7 +10102,7 @@
                 <w:sz w:val="18"/>
                 <w:szCs w:val="18"/>
               </w:rPr>
-              <w:t>C7: Acórdão TCE-RJ nº 44.490/2024-PLEN, itens II.7.5, III.9.5 e V.6.2 – Recomendações quanto à gestão de configuração e ativos de TIC, incluindo formalização do processo e manutenção de base consolidada de ativos e itens de configuração.</w:t>
+              <w:t>C7: Acórdão TCE-RJ nº 44.490/2024-PLEN, item II.7.5 — precedente quanto à gestão de configuração e ativos de TIC, incluindo formalização do processo e manutenção de base consolidada de ativos e itens de configuração.</w:t>
             </w:r>
           </w:p>
           <w:p ns2:paraId="2667BB09" ns2:textId="2C1623C1">
@@ -10959,7 +10127,7 @@
                 <w:sz w:val="18"/>
                 <w:szCs w:val="18"/>
               </w:rPr>
-              <w:t>C8: Acórdão TCE-RJ nº 44.490/2024-PLEN, itens II.7.6, III.9.6 e V.6.3 – Recomendações quanto à formalização e execução do processo de gestão de incidentes, incluindo registros, classificação, escalamento e tratamento.</w:t>
+              <w:t>C8: Acórdão TCE-RJ nº 44.490/2024-PLEN, item II.7.6 — precedente quanto à formalização e à execução do processo de gestão de incidentes, incluindo registros, classificação, escalamento e tratamento.</w:t>
             </w:r>
           </w:p>
           <w:p ns2:paraId="2667BB09" ns2:textId="2C1623C1">
@@ -10984,7 +10152,7 @@
                 <w:sz w:val="18"/>
                 <w:szCs w:val="18"/>
               </w:rPr>
-              <w:t>C9: Acórdão TCE-RJ nº 44.490/2024-PLEN, itens II.7.7, III.9.7 e V.6.4 – Recomendações quanto à definição, pactuação e monitoramento de níveis de serviço.</w:t>
+              <w:t>C9: Acórdão TCE-RJ nº 44.490/2024-PLEN, item II.7.7 — precedente quanto à definição, à pactuação e ao monitoramento de níveis de serviço.</w:t>
             </w:r>
           </w:p>
           <w:p ns2:paraId="2667BB09" ns2:textId="2C1623C1">
@@ -11110,7 +10278,7 @@
                 <w:sz w:val="18"/>
                 <w:szCs w:val="18"/>
               </w:rPr>
-              <w:t>C13: Decreto Estadual nº 47.278/2020, arts. 5º, XI e 6º, V e IN PRODERJ/PRE nº 07/2025, arts. 11 a 13, 17 e 18 e Anexo (itens 7.1, 8.1, 8.9.2.1, 8.14) — obrigatoriedade de inventário permanente de ativos e licenças, gestão de incidentes de segurança e SLA contratual no Poder Executivo Estadual.</w:t>
+              <w:t>C13: Decreto Estadual nº 48.997/2024, art. 4º, inciso V — o nível setorial deve alimentar as bases de dados do nível de Direção Geral com o inventário permanente de equipamentos, licenças e softwares utilizados.</w:t>
             </w:r>
           </w:p>
           <w:p ns2:paraId="2667BB09" ns2:textId="2C1623C1">
@@ -11161,7 +10329,57 @@
                 <w:sz w:val="18"/>
                 <w:szCs w:val="18"/>
               </w:rPr>
-              <w:t>C14: Resolução CNJ nº 370/2021, arts. 18 a 21, 23 e 34, Resolução CNJ nº 396/2021, arts. 6º a 8º e Ato Normativo TJ nº 28/2022 — obrigatoriedade de catálogo de serviços de TIC, acordos de níveis de serviço com metas operacionais, inventário de ativos e gestão de incidentes no Poder Judiciário Estadual.</w:t>
+              <w:t>C14: Resolução CNJ nº 370/2021, art. 21, inciso IV, alínea "d" — a estrutura de infraestrutura e serviços de TIC deve contemplar o macroprocesso de catálogo de serviços.</w:t>
+            </w:r>
+          </w:p>
+          <w:p ns2:paraId="2667BB09" ns2:textId="2C1623C1">
+            <w:pPr>
+              <w:pStyle w:val="841"/>
+              <w:pBdr/>
+              <w:spacing w:after="80"/>
+              <w:ind w:left="240"/>
+              <w:jc w:val="both"/>
+              <w:rPr>
+                <w:bCs/>
+                <w:color w:val="auto"/>
+                <w:sz w:val="18"/>
+                <w:szCs w:val="18"/>
+                <w:vertAlign w:val="superscript"/>
+              </w:rPr>
+            </w:pPr>
+            <w:r>
+              <w:rPr>
+                <w:bCs/>
+                <w:color w:val="auto"/>
+                <w:sz w:val="18"/>
+                <w:szCs w:val="18"/>
+              </w:rPr>
+              <w:t>C15: Resolução CNJ nº 370/2021, art. 34, § 2º — a gestão dos ativos de infraestrutura tecnológica deve ser realizada mediante processos de registro e monitoramento da localização de cada ativo.</w:t>
+            </w:r>
+          </w:p>
+          <w:p ns2:paraId="2667BB09" ns2:textId="2C1623C1">
+            <w:pPr>
+              <w:pStyle w:val="841"/>
+              <w:pBdr/>
+              <w:spacing w:after="80"/>
+              <w:ind w:left="240"/>
+              <w:jc w:val="both"/>
+              <w:rPr>
+                <w:bCs/>
+                <w:color w:val="auto"/>
+                <w:sz w:val="18"/>
+                <w:szCs w:val="18"/>
+                <w:vertAlign w:val="superscript"/>
+              </w:rPr>
+            </w:pPr>
+            <w:r>
+              <w:rPr>
+                <w:bCs/>
+                <w:color w:val="auto"/>
+                <w:sz w:val="18"/>
+                <w:szCs w:val="18"/>
+              </w:rPr>
+              <w:t>C16: Resolução CNJ nº 370/2021, art. 21, inciso IV, alínea "f" — a estrutura de infraestrutura e serviços de TIC deve contemplar o macroprocesso de gestão de incidentes.</w:t>
             </w:r>
           </w:p>
           <w:p ns2:paraId="2667BB09" ns2:textId="2C1623C1">
@@ -11212,7 +10430,32 @@
                 <w:sz w:val="18"/>
                 <w:szCs w:val="18"/>
               </w:rPr>
-              <w:t>C15: Resolução CNMP nº 171/2017, arts. 14, 23, 26, 27 e 28, Resolução CNMP nº 294/2024 e Resoluções GPGJ nº 2.785/2026 e nº 2.757/2025 — obrigatoriedade de catálogo de serviços, ANS, inventário permanente de ativos e gestão de incidentes de serviços e segurança no Ministério Público Estadual.</w:t>
+              <w:t>C17: Resolução CNMP nº 171/2017, art. 23 — a regulamentação da gestão dos serviços de TI deve contemplar catálogo, acordos de nível de serviço e gestão de incidentes, nos termos do dispositivo.</w:t>
+            </w:r>
+          </w:p>
+          <w:p ns2:paraId="2667BB09" ns2:textId="2C1623C1">
+            <w:pPr>
+              <w:pStyle w:val="841"/>
+              <w:pBdr/>
+              <w:spacing w:after="80"/>
+              <w:ind w:left="240"/>
+              <w:jc w:val="both"/>
+              <w:rPr>
+                <w:bCs/>
+                <w:color w:val="auto"/>
+                <w:sz w:val="18"/>
+                <w:szCs w:val="18"/>
+                <w:vertAlign w:val="superscript"/>
+              </w:rPr>
+            </w:pPr>
+            <w:r>
+              <w:rPr>
+                <w:bCs/>
+                <w:color w:val="auto"/>
+                <w:sz w:val="18"/>
+                <w:szCs w:val="18"/>
+              </w:rPr>
+              <w:t>C18: Resolução CNMP nº 171/2017, art. 26, inciso II — a regulamentação da gestão da infraestrutura de TI deve contemplar o controle e a gestão dos itens de configuração e dos ativos de TI.</w:t>
             </w:r>
           </w:p>
         </w:tc>
@@ -11863,7 +11106,7 @@
                 <w:sz w:val="18"/>
                 <w:szCs w:val="18"/>
               </w:rPr>
-              <w:t>Poder Executivo Estadual: [C1, C6, C10, C13];</w:t>
+              <w:t>Poder Judiciário Estadual: [C1, C10, C14];</w:t>
             </w:r>
           </w:p>
           <w:p ns2:paraId="11118515" ns2:textId="02403B9E">
@@ -11890,7 +11133,7 @@
                 <w:sz w:val="18"/>
                 <w:szCs w:val="18"/>
               </w:rPr>
-              <w:t>Tipo: Recomendação;</w:t>
+              <w:t>Tipo: Determinação;</w:t>
             </w:r>
           </w:p>
           <w:p ns2:paraId="11118515" ns2:textId="02403B9E">
@@ -11944,7 +11187,7 @@
                 <w:sz w:val="18"/>
                 <w:szCs w:val="18"/>
               </w:rPr>
-              <w:t>Poder Judiciário Estadual: [C1, C10, C14];</w:t>
+              <w:t>Ministério Público Estadual: [C1, C10, C17];</w:t>
             </w:r>
           </w:p>
           <w:p ns2:paraId="11118515" ns2:textId="02403B9E">
@@ -12010,22 +11253,22 @@
               </w:numPr>
               <w:pBdr/>
               <w:spacing w:after="40"/>
-              <w:ind w:left="720"/>
-              <w:rPr>
-                <w:rFonts w:ascii="Arial" w:hAnsi="Arial" w:cs="Arial"/>
-                <w:sz w:val="18"/>
-                <w:szCs w:val="18"/>
-              </w:rPr>
-            </w:pPr>
-            <w:r>
-              <w:rPr>
-                <w:rFonts w:ascii="Arial" w:hAnsi="Arial" w:cs="Arial"/>
-                <w:b/>
-                <w:bCs/>
-                <w:sz w:val="18"/>
-                <w:szCs w:val="18"/>
-              </w:rPr>
-              <w:t>Ministério Público Estadual: [C1, C10, C15];</w:t>
+              <w:ind w:left="360"/>
+              <w:rPr>
+                <w:rFonts w:ascii="Arial" w:hAnsi="Arial" w:cs="Arial"/>
+                <w:sz w:val="18"/>
+                <w:szCs w:val="18"/>
+              </w:rPr>
+            </w:pPr>
+            <w:r>
+              <w:rPr>
+                <w:rFonts w:ascii="Arial" w:hAnsi="Arial" w:cs="Arial"/>
+                <w:b/>
+                <w:bCs/>
+                <w:sz w:val="18"/>
+                <w:szCs w:val="18"/>
+              </w:rPr>
+              <w:t>Ausência ou fragilidade na definição e no monitoramento de níveis mínimos de serviço de TIC.[R5.2, P3, E3, P4, E4, C2, C9];</w:t>
             </w:r>
           </w:p>
           <w:p ns2:paraId="11118515" ns2:textId="02403B9E">
@@ -12037,22 +11280,22 @@
               </w:numPr>
               <w:pBdr/>
               <w:spacing w:after="40"/>
-              <w:ind w:left="1080"/>
-              <w:rPr>
-                <w:rFonts w:ascii="Arial" w:hAnsi="Arial" w:cs="Arial"/>
-                <w:sz w:val="18"/>
-                <w:szCs w:val="18"/>
-              </w:rPr>
-            </w:pPr>
-            <w:r>
-              <w:rPr>
-                <w:rFonts w:ascii="Arial" w:hAnsi="Arial" w:cs="Arial"/>
-                <w:b/>
-                <w:bCs/>
-                <w:sz w:val="18"/>
-                <w:szCs w:val="18"/>
-              </w:rPr>
-              <w:t>Tipo: Determinação;</w:t>
+              <w:ind w:left="720"/>
+              <w:rPr>
+                <w:rFonts w:ascii="Arial" w:hAnsi="Arial" w:cs="Arial"/>
+                <w:sz w:val="18"/>
+                <w:szCs w:val="18"/>
+              </w:rPr>
+            </w:pPr>
+            <w:r>
+              <w:rPr>
+                <w:rFonts w:ascii="Arial" w:hAnsi="Arial" w:cs="Arial"/>
+                <w:b/>
+                <w:bCs/>
+                <w:sz w:val="18"/>
+                <w:szCs w:val="18"/>
+              </w:rPr>
+              <w:t>Tipo: Recomendação;</w:t>
             </w:r>
           </w:p>
           <w:p ns2:paraId="11118515" ns2:textId="02403B9E">
@@ -12064,22 +11307,22 @@
               </w:numPr>
               <w:pBdr/>
               <w:spacing w:after="100"/>
-              <w:ind w:left="1080"/>
-              <w:rPr>
-                <w:rFonts w:ascii="Arial" w:hAnsi="Arial" w:cs="Arial"/>
-                <w:sz w:val="18"/>
-                <w:szCs w:val="18"/>
-              </w:rPr>
-            </w:pPr>
-            <w:r>
-              <w:rPr>
-                <w:rFonts w:ascii="Arial" w:hAnsi="Arial" w:cs="Arial"/>
-                <w:b/>
-                <w:bCs/>
-                <w:sz w:val="18"/>
-                <w:szCs w:val="18"/>
-              </w:rPr>
-              <w:t>Encaminhamento: institua e mantenha atualizado catálogo de serviços de TIC, atentando-se, minimamente, em identificar os serviços efetivamente prestados, seus responsáveis, usuários, condições de acesso e informações necessárias ao atendimento das áreas demandantes</w:t>
+              <w:ind w:left="720"/>
+              <w:rPr>
+                <w:rFonts w:ascii="Arial" w:hAnsi="Arial" w:cs="Arial"/>
+                <w:sz w:val="18"/>
+                <w:szCs w:val="18"/>
+              </w:rPr>
+            </w:pPr>
+            <w:r>
+              <w:rPr>
+                <w:rFonts w:ascii="Arial" w:hAnsi="Arial" w:cs="Arial"/>
+                <w:b/>
+                <w:bCs/>
+                <w:sz w:val="18"/>
+                <w:szCs w:val="18"/>
+              </w:rPr>
+              <w:t>Encaminhamento: defina, acorde e monitore níveis de serviço para os serviços de TIC relevantes, estabelecendo metas e mecanismos de acompanhamento de seu cumprimento</w:t>
             </w:r>
           </w:p>
           <w:p ns2:paraId="11118515" ns2:textId="02403B9E">
@@ -12091,22 +11334,22 @@
               </w:numPr>
               <w:pBdr/>
               <w:spacing w:after="40"/>
-              <w:ind w:left="360"/>
-              <w:rPr>
-                <w:rFonts w:ascii="Arial" w:hAnsi="Arial" w:cs="Arial"/>
-                <w:sz w:val="18"/>
-                <w:szCs w:val="18"/>
-              </w:rPr>
-            </w:pPr>
-            <w:r>
-              <w:rPr>
-                <w:rFonts w:ascii="Arial" w:hAnsi="Arial" w:cs="Arial"/>
-                <w:b/>
-                <w:bCs/>
-                <w:sz w:val="18"/>
-                <w:szCs w:val="18"/>
-              </w:rPr>
-              <w:t>Ausência ou fragilidade na definição e no monitoramento de níveis mínimos de serviço de TIC.[R5.2, P3, E3, P4, E4, C2, C9];</w:t>
+              <w:ind w:left="720"/>
+              <w:rPr>
+                <w:rFonts w:ascii="Arial" w:hAnsi="Arial" w:cs="Arial"/>
+                <w:sz w:val="18"/>
+                <w:szCs w:val="18"/>
+              </w:rPr>
+            </w:pPr>
+            <w:r>
+              <w:rPr>
+                <w:rFonts w:ascii="Arial" w:hAnsi="Arial" w:cs="Arial"/>
+                <w:b/>
+                <w:bCs/>
+                <w:sz w:val="18"/>
+                <w:szCs w:val="18"/>
+              </w:rPr>
+              <w:t>Ministério Público Estadual: [C2, C17];</w:t>
             </w:r>
           </w:p>
           <w:p ns2:paraId="11118515" ns2:textId="02403B9E">
@@ -12118,22 +11361,22 @@
               </w:numPr>
               <w:pBdr/>
               <w:spacing w:after="40"/>
-              <w:ind w:left="720"/>
-              <w:rPr>
-                <w:rFonts w:ascii="Arial" w:hAnsi="Arial" w:cs="Arial"/>
-                <w:sz w:val="18"/>
-                <w:szCs w:val="18"/>
-              </w:rPr>
-            </w:pPr>
-            <w:r>
-              <w:rPr>
-                <w:rFonts w:ascii="Arial" w:hAnsi="Arial" w:cs="Arial"/>
-                <w:b/>
-                <w:bCs/>
-                <w:sz w:val="18"/>
-                <w:szCs w:val="18"/>
-              </w:rPr>
-              <w:t>Tipo: Recomendação;</w:t>
+              <w:ind w:left="1080"/>
+              <w:rPr>
+                <w:rFonts w:ascii="Arial" w:hAnsi="Arial" w:cs="Arial"/>
+                <w:sz w:val="18"/>
+                <w:szCs w:val="18"/>
+              </w:rPr>
+            </w:pPr>
+            <w:r>
+              <w:rPr>
+                <w:rFonts w:ascii="Arial" w:hAnsi="Arial" w:cs="Arial"/>
+                <w:b/>
+                <w:bCs/>
+                <w:sz w:val="18"/>
+                <w:szCs w:val="18"/>
+              </w:rPr>
+              <w:t>Tipo: Determinação;</w:t>
             </w:r>
           </w:p>
           <w:p ns2:paraId="11118515" ns2:textId="02403B9E">
@@ -12145,7 +11388,7 @@
               </w:numPr>
               <w:pBdr/>
               <w:spacing w:after="100"/>
-              <w:ind w:left="720"/>
+              <w:ind w:left="1080"/>
               <w:rPr>
                 <w:rFonts w:ascii="Arial" w:hAnsi="Arial" w:cs="Arial"/>
                 <w:sz w:val="18"/>
@@ -12172,22 +11415,22 @@
               </w:numPr>
               <w:pBdr/>
               <w:spacing w:after="40"/>
-              <w:ind w:left="720"/>
-              <w:rPr>
-                <w:rFonts w:ascii="Arial" w:hAnsi="Arial" w:cs="Arial"/>
-                <w:sz w:val="18"/>
-                <w:szCs w:val="18"/>
-              </w:rPr>
-            </w:pPr>
-            <w:r>
-              <w:rPr>
-                <w:rFonts w:ascii="Arial" w:hAnsi="Arial" w:cs="Arial"/>
-                <w:b/>
-                <w:bCs/>
-                <w:sz w:val="18"/>
-                <w:szCs w:val="18"/>
-              </w:rPr>
-              <w:t>Poder Executivo Estadual: [C2, C9, C13];</w:t>
+              <w:ind w:left="360"/>
+              <w:rPr>
+                <w:rFonts w:ascii="Arial" w:hAnsi="Arial" w:cs="Arial"/>
+                <w:sz w:val="18"/>
+                <w:szCs w:val="18"/>
+              </w:rPr>
+            </w:pPr>
+            <w:r>
+              <w:rPr>
+                <w:rFonts w:ascii="Arial" w:hAnsi="Arial" w:cs="Arial"/>
+                <w:b/>
+                <w:bCs/>
+                <w:sz w:val="18"/>
+                <w:szCs w:val="18"/>
+              </w:rPr>
+              <w:t>Inventário e controle de dispositivos e softwares de TIC inexistente ou insuficiente.[R5.3, P5, E5, P6, E6, C3, C7];</w:t>
             </w:r>
           </w:p>
           <w:p ns2:paraId="11118515" ns2:textId="02403B9E">
@@ -12199,7 +11442,7 @@
               </w:numPr>
               <w:pBdr/>
               <w:spacing w:after="40"/>
-              <w:ind w:left="1080"/>
+              <w:ind w:left="720"/>
               <w:rPr>
                 <w:rFonts w:ascii="Arial" w:hAnsi="Arial" w:cs="Arial"/>
                 <w:sz w:val="18"/>
@@ -12226,22 +11469,22 @@
               </w:numPr>
               <w:pBdr/>
               <w:spacing w:after="100"/>
-              <w:ind w:left="1080"/>
-              <w:rPr>
-                <w:rFonts w:ascii="Arial" w:hAnsi="Arial" w:cs="Arial"/>
-                <w:sz w:val="18"/>
-                <w:szCs w:val="18"/>
-              </w:rPr>
-            </w:pPr>
-            <w:r>
-              <w:rPr>
-                <w:rFonts w:ascii="Arial" w:hAnsi="Arial" w:cs="Arial"/>
-                <w:b/>
-                <w:bCs/>
-                <w:sz w:val="18"/>
-                <w:szCs w:val="18"/>
-              </w:rPr>
-              <w:t>Encaminhamento: defina, acorde e monitore níveis de serviço para os serviços de TIC relevantes, estabelecendo metas e mecanismos de acompanhamento de seu cumprimento</w:t>
+              <w:ind w:left="720"/>
+              <w:rPr>
+                <w:rFonts w:ascii="Arial" w:hAnsi="Arial" w:cs="Arial"/>
+                <w:sz w:val="18"/>
+                <w:szCs w:val="18"/>
+              </w:rPr>
+            </w:pPr>
+            <w:r>
+              <w:rPr>
+                <w:rFonts w:ascii="Arial" w:hAnsi="Arial" w:cs="Arial"/>
+                <w:b/>
+                <w:bCs/>
+                <w:sz w:val="18"/>
+                <w:szCs w:val="18"/>
+              </w:rPr>
+              <w:t>Encaminhamento: estabeleça e mantenha inventário atualizado dos ativos tecnológicos sob gestão da organização, contemplando, minimamente, os dispositivos e softwares utilizados, com informações suficientes para sua identificação e controle</w:t>
             </w:r>
           </w:p>
           <w:p ns2:paraId="11118515" ns2:textId="02403B9E">
@@ -12268,7 +11511,7 @@
                 <w:sz w:val="18"/>
                 <w:szCs w:val="18"/>
               </w:rPr>
-              <w:t>Poder Judiciário Estadual: [C2, C14];</w:t>
+              <w:t>Poder Executivo Estadual: [C3, C13];</w:t>
             </w:r>
           </w:p>
           <w:p ns2:paraId="11118515" ns2:textId="02403B9E">
@@ -12322,7 +11565,7 @@
                 <w:sz w:val="18"/>
                 <w:szCs w:val="18"/>
               </w:rPr>
-              <w:t>Encaminhamento: defina, acorde e monitore níveis de serviço para os serviços de TIC relevantes, estabelecendo metas e mecanismos de acompanhamento de seu cumprimento</w:t>
+              <w:t>Encaminhamento: estabeleça e mantenha inventário atualizado dos ativos tecnológicos sob gestão da organização, contemplando, minimamente, os dispositivos e softwares utilizados, com informações suficientes para sua identificação e controle</w:t>
             </w:r>
           </w:p>
           <w:p ns2:paraId="11118515" ns2:textId="02403B9E">
@@ -12349,7 +11592,7 @@
                 <w:sz w:val="18"/>
                 <w:szCs w:val="18"/>
               </w:rPr>
-              <w:t>Ministério Público Estadual: [C2, C15];</w:t>
+              <w:t>Poder Judiciário Estadual: [C3, C15];</w:t>
             </w:r>
           </w:p>
           <w:p ns2:paraId="11118515" ns2:textId="02403B9E">
@@ -12403,7 +11646,7 @@
                 <w:sz w:val="18"/>
                 <w:szCs w:val="18"/>
               </w:rPr>
-              <w:t>Encaminhamento: defina, acorde e monitore níveis de serviço para os serviços de TIC relevantes, estabelecendo metas e mecanismos de acompanhamento de seu cumprimento</w:t>
+              <w:t>Encaminhamento: estabeleça e mantenha inventário atualizado dos ativos tecnológicos sob gestão da organização, contemplando, minimamente, os dispositivos e softwares utilizados, com informações suficientes para sua identificação e controle</w:t>
             </w:r>
           </w:p>
           <w:p ns2:paraId="11118515" ns2:textId="02403B9E">
@@ -12415,22 +11658,22 @@
               </w:numPr>
               <w:pBdr/>
               <w:spacing w:after="40"/>
-              <w:ind w:left="360"/>
-              <w:rPr>
-                <w:rFonts w:ascii="Arial" w:hAnsi="Arial" w:cs="Arial"/>
-                <w:sz w:val="18"/>
-                <w:szCs w:val="18"/>
-              </w:rPr>
-            </w:pPr>
-            <w:r>
-              <w:rPr>
-                <w:rFonts w:ascii="Arial" w:hAnsi="Arial" w:cs="Arial"/>
-                <w:b/>
-                <w:bCs/>
-                <w:sz w:val="18"/>
-                <w:szCs w:val="18"/>
-              </w:rPr>
-              <w:t>Inventário e controle de dispositivos e softwares de TIC inexistente ou insuficiente.[R5.3, P5, E5, P6, E6, C3, C7];</w:t>
+              <w:ind w:left="720"/>
+              <w:rPr>
+                <w:rFonts w:ascii="Arial" w:hAnsi="Arial" w:cs="Arial"/>
+                <w:sz w:val="18"/>
+                <w:szCs w:val="18"/>
+              </w:rPr>
+            </w:pPr>
+            <w:r>
+              <w:rPr>
+                <w:rFonts w:ascii="Arial" w:hAnsi="Arial" w:cs="Arial"/>
+                <w:b/>
+                <w:bCs/>
+                <w:sz w:val="18"/>
+                <w:szCs w:val="18"/>
+              </w:rPr>
+              <w:t>Ministério Público Estadual: [C3, C18];</w:t>
             </w:r>
           </w:p>
           <w:p ns2:paraId="11118515" ns2:textId="02403B9E">
@@ -12442,22 +11685,22 @@
               </w:numPr>
               <w:pBdr/>
               <w:spacing w:after="40"/>
-              <w:ind w:left="720"/>
-              <w:rPr>
-                <w:rFonts w:ascii="Arial" w:hAnsi="Arial" w:cs="Arial"/>
-                <w:sz w:val="18"/>
-                <w:szCs w:val="18"/>
-              </w:rPr>
-            </w:pPr>
-            <w:r>
-              <w:rPr>
-                <w:rFonts w:ascii="Arial" w:hAnsi="Arial" w:cs="Arial"/>
-                <w:b/>
-                <w:bCs/>
-                <w:sz w:val="18"/>
-                <w:szCs w:val="18"/>
-              </w:rPr>
-              <w:t>Tipo: Recomendação;</w:t>
+              <w:ind w:left="1080"/>
+              <w:rPr>
+                <w:rFonts w:ascii="Arial" w:hAnsi="Arial" w:cs="Arial"/>
+                <w:sz w:val="18"/>
+                <w:szCs w:val="18"/>
+              </w:rPr>
+            </w:pPr>
+            <w:r>
+              <w:rPr>
+                <w:rFonts w:ascii="Arial" w:hAnsi="Arial" w:cs="Arial"/>
+                <w:b/>
+                <w:bCs/>
+                <w:sz w:val="18"/>
+                <w:szCs w:val="18"/>
+              </w:rPr>
+              <w:t>Tipo: Determinação;</w:t>
             </w:r>
           </w:p>
           <w:p ns2:paraId="11118515" ns2:textId="02403B9E">
@@ -12469,7 +11712,7 @@
               </w:numPr>
               <w:pBdr/>
               <w:spacing w:after="100"/>
-              <w:ind w:left="720"/>
+              <w:ind w:left="1080"/>
               <w:rPr>
                 <w:rFonts w:ascii="Arial" w:hAnsi="Arial" w:cs="Arial"/>
                 <w:sz w:val="18"/>
@@ -12496,22 +11739,22 @@
               </w:numPr>
               <w:pBdr/>
               <w:spacing w:after="40"/>
-              <w:ind w:left="720"/>
-              <w:rPr>
-                <w:rFonts w:ascii="Arial" w:hAnsi="Arial" w:cs="Arial"/>
-                <w:sz w:val="18"/>
-                <w:szCs w:val="18"/>
-              </w:rPr>
-            </w:pPr>
-            <w:r>
-              <w:rPr>
-                <w:rFonts w:ascii="Arial" w:hAnsi="Arial" w:cs="Arial"/>
-                <w:b/>
-                <w:bCs/>
-                <w:sz w:val="18"/>
-                <w:szCs w:val="18"/>
-              </w:rPr>
-              <w:t>Poder Executivo Estadual: [C3, C13];</w:t>
+              <w:ind w:left="360"/>
+              <w:rPr>
+                <w:rFonts w:ascii="Arial" w:hAnsi="Arial" w:cs="Arial"/>
+                <w:sz w:val="18"/>
+                <w:szCs w:val="18"/>
+              </w:rPr>
+            </w:pPr>
+            <w:r>
+              <w:rPr>
+                <w:rFonts w:ascii="Arial" w:hAnsi="Arial" w:cs="Arial"/>
+                <w:b/>
+                <w:bCs/>
+                <w:sz w:val="18"/>
+                <w:szCs w:val="18"/>
+              </w:rPr>
+              <w:t>Ausência ou fragilidade do processo de gestão de configuração.[R5.3, P7, E7, P8, E8, C4, C7, C11];</w:t>
             </w:r>
           </w:p>
           <w:p ns2:paraId="11118515" ns2:textId="02403B9E">
@@ -12523,22 +11766,22 @@
               </w:numPr>
               <w:pBdr/>
               <w:spacing w:after="40"/>
-              <w:ind w:left="1080"/>
-              <w:rPr>
-                <w:rFonts w:ascii="Arial" w:hAnsi="Arial" w:cs="Arial"/>
-                <w:sz w:val="18"/>
-                <w:szCs w:val="18"/>
-              </w:rPr>
-            </w:pPr>
-            <w:r>
-              <w:rPr>
-                <w:rFonts w:ascii="Arial" w:hAnsi="Arial" w:cs="Arial"/>
-                <w:b/>
-                <w:bCs/>
-                <w:sz w:val="18"/>
-                <w:szCs w:val="18"/>
-              </w:rPr>
-              <w:t>Tipo: Determinação;</w:t>
+              <w:ind w:left="720"/>
+              <w:rPr>
+                <w:rFonts w:ascii="Arial" w:hAnsi="Arial" w:cs="Arial"/>
+                <w:sz w:val="18"/>
+                <w:szCs w:val="18"/>
+              </w:rPr>
+            </w:pPr>
+            <w:r>
+              <w:rPr>
+                <w:rFonts w:ascii="Arial" w:hAnsi="Arial" w:cs="Arial"/>
+                <w:b/>
+                <w:bCs/>
+                <w:sz w:val="18"/>
+                <w:szCs w:val="18"/>
+              </w:rPr>
+              <w:t>Tipo: Recomendação;</w:t>
             </w:r>
           </w:p>
           <w:p ns2:paraId="11118515" ns2:textId="02403B9E">
@@ -12550,22 +11793,22 @@
               </w:numPr>
               <w:pBdr/>
               <w:spacing w:after="100"/>
-              <w:ind w:left="1080"/>
-              <w:rPr>
-                <w:rFonts w:ascii="Arial" w:hAnsi="Arial" w:cs="Arial"/>
-                <w:sz w:val="18"/>
-                <w:szCs w:val="18"/>
-              </w:rPr>
-            </w:pPr>
-            <w:r>
-              <w:rPr>
-                <w:rFonts w:ascii="Arial" w:hAnsi="Arial" w:cs="Arial"/>
-                <w:b/>
-                <w:bCs/>
-                <w:sz w:val="18"/>
-                <w:szCs w:val="18"/>
-              </w:rPr>
-              <w:t>Encaminhamento: estabeleça e mantenha inventário atualizado dos ativos tecnológicos sob gestão da organização, contemplando, minimamente, os dispositivos e softwares utilizados, com informações suficientes para sua identificação e controle</w:t>
+              <w:ind w:left="720"/>
+              <w:rPr>
+                <w:rFonts w:ascii="Arial" w:hAnsi="Arial" w:cs="Arial"/>
+                <w:sz w:val="18"/>
+                <w:szCs w:val="18"/>
+              </w:rPr>
+            </w:pPr>
+            <w:r>
+              <w:rPr>
+                <w:rFonts w:ascii="Arial" w:hAnsi="Arial" w:cs="Arial"/>
+                <w:b/>
+                <w:bCs/>
+                <w:sz w:val="18"/>
+                <w:szCs w:val="18"/>
+              </w:rPr>
+              <w:t>Encaminhamento: formalize e execute processo de gestão de configuração, atentando-se, minimamente, em manter base, ferramenta ou registro equivalente com os itens de configuração relevantes, seus responsáveis e os relacionamentos entre ativos</w:t>
             </w:r>
           </w:p>
           <w:p ns2:paraId="11118515" ns2:textId="02403B9E">
@@ -12577,22 +11820,22 @@
               </w:numPr>
               <w:pBdr/>
               <w:spacing w:after="40"/>
-              <w:ind w:left="720"/>
-              <w:rPr>
-                <w:rFonts w:ascii="Arial" w:hAnsi="Arial" w:cs="Arial"/>
-                <w:sz w:val="18"/>
-                <w:szCs w:val="18"/>
-              </w:rPr>
-            </w:pPr>
-            <w:r>
-              <w:rPr>
-                <w:rFonts w:ascii="Arial" w:hAnsi="Arial" w:cs="Arial"/>
-                <w:b/>
-                <w:bCs/>
-                <w:sz w:val="18"/>
-                <w:szCs w:val="18"/>
-              </w:rPr>
-              <w:t>Poder Judiciário Estadual: [C3, C14];</w:t>
+              <w:ind w:left="360"/>
+              <w:rPr>
+                <w:rFonts w:ascii="Arial" w:hAnsi="Arial" w:cs="Arial"/>
+                <w:sz w:val="18"/>
+                <w:szCs w:val="18"/>
+              </w:rPr>
+            </w:pPr>
+            <w:r>
+              <w:rPr>
+                <w:rFonts w:ascii="Arial" w:hAnsi="Arial" w:cs="Arial"/>
+                <w:b/>
+                <w:bCs/>
+                <w:sz w:val="18"/>
+                <w:szCs w:val="18"/>
+              </w:rPr>
+              <w:t>Inexistência ou fragilidade do processo de gestão de incidentes de TIC.[R5.4, P9, E9, P10, E10, P11, E11, C5, C8, C12];</w:t>
             </w:r>
           </w:p>
           <w:p ns2:paraId="11118515" ns2:textId="02403B9E">
@@ -12604,22 +11847,22 @@
               </w:numPr>
               <w:pBdr/>
               <w:spacing w:after="40"/>
-              <w:ind w:left="1080"/>
-              <w:rPr>
-                <w:rFonts w:ascii="Arial" w:hAnsi="Arial" w:cs="Arial"/>
-                <w:sz w:val="18"/>
-                <w:szCs w:val="18"/>
-              </w:rPr>
-            </w:pPr>
-            <w:r>
-              <w:rPr>
-                <w:rFonts w:ascii="Arial" w:hAnsi="Arial" w:cs="Arial"/>
-                <w:b/>
-                <w:bCs/>
-                <w:sz w:val="18"/>
-                <w:szCs w:val="18"/>
-              </w:rPr>
-              <w:t>Tipo: Determinação;</w:t>
+              <w:ind w:left="720"/>
+              <w:rPr>
+                <w:rFonts w:ascii="Arial" w:hAnsi="Arial" w:cs="Arial"/>
+                <w:sz w:val="18"/>
+                <w:szCs w:val="18"/>
+              </w:rPr>
+            </w:pPr>
+            <w:r>
+              <w:rPr>
+                <w:rFonts w:ascii="Arial" w:hAnsi="Arial" w:cs="Arial"/>
+                <w:b/>
+                <w:bCs/>
+                <w:sz w:val="18"/>
+                <w:szCs w:val="18"/>
+              </w:rPr>
+              <w:t>Tipo: Recomendação;</w:t>
             </w:r>
           </w:p>
           <w:p ns2:paraId="11118515" ns2:textId="02403B9E">
@@ -12631,22 +11874,22 @@
               </w:numPr>
               <w:pBdr/>
               <w:spacing w:after="100"/>
-              <w:ind w:left="1080"/>
-              <w:rPr>
-                <w:rFonts w:ascii="Arial" w:hAnsi="Arial" w:cs="Arial"/>
-                <w:sz w:val="18"/>
-                <w:szCs w:val="18"/>
-              </w:rPr>
-            </w:pPr>
-            <w:r>
-              <w:rPr>
-                <w:rFonts w:ascii="Arial" w:hAnsi="Arial" w:cs="Arial"/>
-                <w:b/>
-                <w:bCs/>
-                <w:sz w:val="18"/>
-                <w:szCs w:val="18"/>
-              </w:rPr>
-              <w:t>Encaminhamento: estabeleça e mantenha inventário atualizado dos ativos tecnológicos sob gestão da organização, contemplando, minimamente, os dispositivos e softwares utilizados, com informações suficientes para sua identificação e controle</w:t>
+              <w:ind w:left="720"/>
+              <w:rPr>
+                <w:rFonts w:ascii="Arial" w:hAnsi="Arial" w:cs="Arial"/>
+                <w:sz w:val="18"/>
+                <w:szCs w:val="18"/>
+              </w:rPr>
+            </w:pPr>
+            <w:r>
+              <w:rPr>
+                <w:rFonts w:ascii="Arial" w:hAnsi="Arial" w:cs="Arial"/>
+                <w:b/>
+                <w:bCs/>
+                <w:sz w:val="18"/>
+                <w:szCs w:val="18"/>
+              </w:rPr>
+              <w:t>Encaminhamento: formalize e execute processo de gestão de incidentes de TIC, atentando-se, minimamente, em definir papéis, critérios de priorização e escalamento, tratamento de incidentes de serviços e de segurança da informação e registro sistemático e rastreável das ocorrências</w:t>
             </w:r>
           </w:p>
           <w:p ns2:paraId="11118515" ns2:textId="02403B9E">
@@ -12673,7 +11916,7 @@
                 <w:sz w:val="18"/>
                 <w:szCs w:val="18"/>
               </w:rPr>
-              <w:t>Ministério Público Estadual: [C3, C15];</w:t>
+              <w:t>Poder Judiciário Estadual: [C5, C12, C16];</w:t>
             </w:r>
           </w:p>
           <w:p ns2:paraId="11118515" ns2:textId="02403B9E">
@@ -12727,7 +11970,7 @@
                 <w:sz w:val="18"/>
                 <w:szCs w:val="18"/>
               </w:rPr>
-              <w:t>Encaminhamento: estabeleça e mantenha inventário atualizado dos ativos tecnológicos sob gestão da organização, contemplando, minimamente, os dispositivos e softwares utilizados, com informações suficientes para sua identificação e controle</w:t>
+              <w:t>Encaminhamento: formalize e execute processo de gestão de incidentes de TIC, atentando-se, minimamente, em definir papéis, critérios de priorização e escalamento, tratamento de incidentes de serviços e de segurança da informação e registro sistemático e rastreável das ocorrências</w:t>
             </w:r>
           </w:p>
           <w:p ns2:paraId="11118515" ns2:textId="02403B9E">
@@ -12739,33 +11982,6 @@
               </w:numPr>
               <w:pBdr/>
               <w:spacing w:after="40"/>
-              <w:ind w:left="360"/>
-              <w:rPr>
-                <w:rFonts w:ascii="Arial" w:hAnsi="Arial" w:cs="Arial"/>
-                <w:sz w:val="18"/>
-                <w:szCs w:val="18"/>
-              </w:rPr>
-            </w:pPr>
-            <w:r>
-              <w:rPr>
-                <w:rFonts w:ascii="Arial" w:hAnsi="Arial" w:cs="Arial"/>
-                <w:b/>
-                <w:bCs/>
-                <w:sz w:val="18"/>
-                <w:szCs w:val="18"/>
-              </w:rPr>
-              <w:t>Ausência ou fragilidade do processo de gestão de configuração.[R5.3, P7, E7, P8, E8, C4, C7, C11];</w:t>
-            </w:r>
-          </w:p>
-          <w:p ns2:paraId="11118515" ns2:textId="02403B9E">
-            <w:pPr>
-              <w:pStyle w:val="843"/>
-              <w:numPr>
-                <w:ilvl w:val="0"/>
-                <w:numId w:val="11"/>
-              </w:numPr>
-              <w:pBdr/>
-              <w:spacing w:after="40"/>
               <w:ind w:left="720"/>
               <w:rPr>
                 <w:rFonts w:ascii="Arial" w:hAnsi="Arial" w:cs="Arial"/>
@@ -12781,547 +11997,7 @@
                 <w:sz w:val="18"/>
                 <w:szCs w:val="18"/>
               </w:rPr>
-              <w:t>Tipo: Recomendação;</w:t>
-            </w:r>
-          </w:p>
-          <w:p ns2:paraId="11118515" ns2:textId="02403B9E">
-            <w:pPr>
-              <w:pStyle w:val="843"/>
-              <w:numPr>
-                <w:ilvl w:val="0"/>
-                <w:numId w:val="11"/>
-              </w:numPr>
-              <w:pBdr/>
-              <w:spacing w:after="100"/>
-              <w:ind w:left="720"/>
-              <w:rPr>
-                <w:rFonts w:ascii="Arial" w:hAnsi="Arial" w:cs="Arial"/>
-                <w:sz w:val="18"/>
-                <w:szCs w:val="18"/>
-              </w:rPr>
-            </w:pPr>
-            <w:r>
-              <w:rPr>
-                <w:rFonts w:ascii="Arial" w:hAnsi="Arial" w:cs="Arial"/>
-                <w:b/>
-                <w:bCs/>
-                <w:sz w:val="18"/>
-                <w:szCs w:val="18"/>
-              </w:rPr>
-              <w:t>Encaminhamento: formalize e execute processo de gestão de configuração, atentando-se, minimamente, em manter base, ferramenta ou registro equivalente com os itens de configuração relevantes, seus responsáveis e os relacionamentos entre ativos</w:t>
-            </w:r>
-          </w:p>
-          <w:p ns2:paraId="11118515" ns2:textId="02403B9E">
-            <w:pPr>
-              <w:pStyle w:val="843"/>
-              <w:numPr>
-                <w:ilvl w:val="0"/>
-                <w:numId w:val="11"/>
-              </w:numPr>
-              <w:pBdr/>
-              <w:spacing w:after="40"/>
-              <w:ind w:left="720"/>
-              <w:rPr>
-                <w:rFonts w:ascii="Arial" w:hAnsi="Arial" w:cs="Arial"/>
-                <w:sz w:val="18"/>
-                <w:szCs w:val="18"/>
-              </w:rPr>
-            </w:pPr>
-            <w:r>
-              <w:rPr>
-                <w:rFonts w:ascii="Arial" w:hAnsi="Arial" w:cs="Arial"/>
-                <w:b/>
-                <w:bCs/>
-                <w:sz w:val="18"/>
-                <w:szCs w:val="18"/>
-              </w:rPr>
-              <w:t>Poder Executivo Estadual: [C4, C11, C13];</w:t>
-            </w:r>
-          </w:p>
-          <w:p ns2:paraId="11118515" ns2:textId="02403B9E">
-            <w:pPr>
-              <w:pStyle w:val="843"/>
-              <w:numPr>
-                <w:ilvl w:val="0"/>
-                <w:numId w:val="11"/>
-              </w:numPr>
-              <w:pBdr/>
-              <w:spacing w:after="40"/>
-              <w:ind w:left="1080"/>
-              <w:rPr>
-                <w:rFonts w:ascii="Arial" w:hAnsi="Arial" w:cs="Arial"/>
-                <w:sz w:val="18"/>
-                <w:szCs w:val="18"/>
-              </w:rPr>
-            </w:pPr>
-            <w:r>
-              <w:rPr>
-                <w:rFonts w:ascii="Arial" w:hAnsi="Arial" w:cs="Arial"/>
-                <w:b/>
-                <w:bCs/>
-                <w:sz w:val="18"/>
-                <w:szCs w:val="18"/>
-              </w:rPr>
-              <w:t>Tipo: Recomendação;</w:t>
-            </w:r>
-          </w:p>
-          <w:p ns2:paraId="11118515" ns2:textId="02403B9E">
-            <w:pPr>
-              <w:pStyle w:val="843"/>
-              <w:numPr>
-                <w:ilvl w:val="0"/>
-                <w:numId w:val="11"/>
-              </w:numPr>
-              <w:pBdr/>
-              <w:spacing w:after="100"/>
-              <w:ind w:left="1080"/>
-              <w:rPr>
-                <w:rFonts w:ascii="Arial" w:hAnsi="Arial" w:cs="Arial"/>
-                <w:sz w:val="18"/>
-                <w:szCs w:val="18"/>
-              </w:rPr>
-            </w:pPr>
-            <w:r>
-              <w:rPr>
-                <w:rFonts w:ascii="Arial" w:hAnsi="Arial" w:cs="Arial"/>
-                <w:b/>
-                <w:bCs/>
-                <w:sz w:val="18"/>
-                <w:szCs w:val="18"/>
-              </w:rPr>
-              <w:t>Encaminhamento: formalize e execute processo de gestão de configuração, atentando-se, minimamente, em manter base, ferramenta ou registro equivalente com os itens de configuração relevantes, seus responsáveis e os relacionamentos entre ativos</w:t>
-            </w:r>
-          </w:p>
-          <w:p ns2:paraId="11118515" ns2:textId="02403B9E">
-            <w:pPr>
-              <w:pStyle w:val="843"/>
-              <w:numPr>
-                <w:ilvl w:val="0"/>
-                <w:numId w:val="11"/>
-              </w:numPr>
-              <w:pBdr/>
-              <w:spacing w:after="40"/>
-              <w:ind w:left="720"/>
-              <w:rPr>
-                <w:rFonts w:ascii="Arial" w:hAnsi="Arial" w:cs="Arial"/>
-                <w:sz w:val="18"/>
-                <w:szCs w:val="18"/>
-              </w:rPr>
-            </w:pPr>
-            <w:r>
-              <w:rPr>
-                <w:rFonts w:ascii="Arial" w:hAnsi="Arial" w:cs="Arial"/>
-                <w:b/>
-                <w:bCs/>
-                <w:sz w:val="18"/>
-                <w:szCs w:val="18"/>
-              </w:rPr>
-              <w:t>Poder Judiciário Estadual: [C4, C11, C14];</w:t>
-            </w:r>
-          </w:p>
-          <w:p ns2:paraId="11118515" ns2:textId="02403B9E">
-            <w:pPr>
-              <w:pStyle w:val="843"/>
-              <w:numPr>
-                <w:ilvl w:val="0"/>
-                <w:numId w:val="11"/>
-              </w:numPr>
-              <w:pBdr/>
-              <w:spacing w:after="40"/>
-              <w:ind w:left="1080"/>
-              <w:rPr>
-                <w:rFonts w:ascii="Arial" w:hAnsi="Arial" w:cs="Arial"/>
-                <w:sz w:val="18"/>
-                <w:szCs w:val="18"/>
-              </w:rPr>
-            </w:pPr>
-            <w:r>
-              <w:rPr>
-                <w:rFonts w:ascii="Arial" w:hAnsi="Arial" w:cs="Arial"/>
-                <w:b/>
-                <w:bCs/>
-                <w:sz w:val="18"/>
-                <w:szCs w:val="18"/>
-              </w:rPr>
-              <w:t>Tipo: Recomendação;</w:t>
-            </w:r>
-          </w:p>
-          <w:p ns2:paraId="11118515" ns2:textId="02403B9E">
-            <w:pPr>
-              <w:pStyle w:val="843"/>
-              <w:numPr>
-                <w:ilvl w:val="0"/>
-                <w:numId w:val="11"/>
-              </w:numPr>
-              <w:pBdr/>
-              <w:spacing w:after="100"/>
-              <w:ind w:left="1080"/>
-              <w:rPr>
-                <w:rFonts w:ascii="Arial" w:hAnsi="Arial" w:cs="Arial"/>
-                <w:sz w:val="18"/>
-                <w:szCs w:val="18"/>
-              </w:rPr>
-            </w:pPr>
-            <w:r>
-              <w:rPr>
-                <w:rFonts w:ascii="Arial" w:hAnsi="Arial" w:cs="Arial"/>
-                <w:b/>
-                <w:bCs/>
-                <w:sz w:val="18"/>
-                <w:szCs w:val="18"/>
-              </w:rPr>
-              <w:t>Encaminhamento: formalize e execute processo de gestão de configuração, atentando-se, minimamente, em manter base, ferramenta ou registro equivalente com os itens de configuração relevantes, seus responsáveis e os relacionamentos entre ativos</w:t>
-            </w:r>
-          </w:p>
-          <w:p ns2:paraId="11118515" ns2:textId="02403B9E">
-            <w:pPr>
-              <w:pStyle w:val="843"/>
-              <w:numPr>
-                <w:ilvl w:val="0"/>
-                <w:numId w:val="11"/>
-              </w:numPr>
-              <w:pBdr/>
-              <w:spacing w:after="40"/>
-              <w:ind w:left="720"/>
-              <w:rPr>
-                <w:rFonts w:ascii="Arial" w:hAnsi="Arial" w:cs="Arial"/>
-                <w:sz w:val="18"/>
-                <w:szCs w:val="18"/>
-              </w:rPr>
-            </w:pPr>
-            <w:r>
-              <w:rPr>
-                <w:rFonts w:ascii="Arial" w:hAnsi="Arial" w:cs="Arial"/>
-                <w:b/>
-                <w:bCs/>
-                <w:sz w:val="18"/>
-                <w:szCs w:val="18"/>
-              </w:rPr>
-              <w:t>Ministério Público Estadual: [C4, C11, C15];</w:t>
-            </w:r>
-          </w:p>
-          <w:p ns2:paraId="11118515" ns2:textId="02403B9E">
-            <w:pPr>
-              <w:pStyle w:val="843"/>
-              <w:numPr>
-                <w:ilvl w:val="0"/>
-                <w:numId w:val="11"/>
-              </w:numPr>
-              <w:pBdr/>
-              <w:spacing w:after="40"/>
-              <w:ind w:left="1080"/>
-              <w:rPr>
-                <w:rFonts w:ascii="Arial" w:hAnsi="Arial" w:cs="Arial"/>
-                <w:sz w:val="18"/>
-                <w:szCs w:val="18"/>
-              </w:rPr>
-            </w:pPr>
-            <w:r>
-              <w:rPr>
-                <w:rFonts w:ascii="Arial" w:hAnsi="Arial" w:cs="Arial"/>
-                <w:b/>
-                <w:bCs/>
-                <w:sz w:val="18"/>
-                <w:szCs w:val="18"/>
-              </w:rPr>
-              <w:t>Tipo: Recomendação;</w:t>
-            </w:r>
-          </w:p>
-          <w:p ns2:paraId="11118515" ns2:textId="02403B9E">
-            <w:pPr>
-              <w:pStyle w:val="843"/>
-              <w:numPr>
-                <w:ilvl w:val="0"/>
-                <w:numId w:val="11"/>
-              </w:numPr>
-              <w:pBdr/>
-              <w:spacing w:after="100"/>
-              <w:ind w:left="1080"/>
-              <w:rPr>
-                <w:rFonts w:ascii="Arial" w:hAnsi="Arial" w:cs="Arial"/>
-                <w:sz w:val="18"/>
-                <w:szCs w:val="18"/>
-              </w:rPr>
-            </w:pPr>
-            <w:r>
-              <w:rPr>
-                <w:rFonts w:ascii="Arial" w:hAnsi="Arial" w:cs="Arial"/>
-                <w:b/>
-                <w:bCs/>
-                <w:sz w:val="18"/>
-                <w:szCs w:val="18"/>
-              </w:rPr>
-              <w:t>Encaminhamento: formalize e execute processo de gestão de configuração, atentando-se, minimamente, em manter base, ferramenta ou registro equivalente com os itens de configuração relevantes, seus responsáveis e os relacionamentos entre ativos</w:t>
-            </w:r>
-          </w:p>
-          <w:p ns2:paraId="11118515" ns2:textId="02403B9E">
-            <w:pPr>
-              <w:pStyle w:val="843"/>
-              <w:numPr>
-                <w:ilvl w:val="0"/>
-                <w:numId w:val="11"/>
-              </w:numPr>
-              <w:pBdr/>
-              <w:spacing w:after="40"/>
-              <w:ind w:left="360"/>
-              <w:rPr>
-                <w:rFonts w:ascii="Arial" w:hAnsi="Arial" w:cs="Arial"/>
-                <w:sz w:val="18"/>
-                <w:szCs w:val="18"/>
-              </w:rPr>
-            </w:pPr>
-            <w:r>
-              <w:rPr>
-                <w:rFonts w:ascii="Arial" w:hAnsi="Arial" w:cs="Arial"/>
-                <w:b/>
-                <w:bCs/>
-                <w:sz w:val="18"/>
-                <w:szCs w:val="18"/>
-              </w:rPr>
-              <w:t>Inexistência ou fragilidade do processo de gestão de incidentes de TIC.[R5.4, P9, E9, P10, E10, P11, E11, C5, C8, C12];</w:t>
-            </w:r>
-          </w:p>
-          <w:p ns2:paraId="11118515" ns2:textId="02403B9E">
-            <w:pPr>
-              <w:pStyle w:val="843"/>
-              <w:numPr>
-                <w:ilvl w:val="0"/>
-                <w:numId w:val="11"/>
-              </w:numPr>
-              <w:pBdr/>
-              <w:spacing w:after="40"/>
-              <w:ind w:left="720"/>
-              <w:rPr>
-                <w:rFonts w:ascii="Arial" w:hAnsi="Arial" w:cs="Arial"/>
-                <w:sz w:val="18"/>
-                <w:szCs w:val="18"/>
-              </w:rPr>
-            </w:pPr>
-            <w:r>
-              <w:rPr>
-                <w:rFonts w:ascii="Arial" w:hAnsi="Arial" w:cs="Arial"/>
-                <w:b/>
-                <w:bCs/>
-                <w:sz w:val="18"/>
-                <w:szCs w:val="18"/>
-              </w:rPr>
-              <w:t>Tipo: Recomendação;</w:t>
-            </w:r>
-          </w:p>
-          <w:p ns2:paraId="11118515" ns2:textId="02403B9E">
-            <w:pPr>
-              <w:pStyle w:val="843"/>
-              <w:numPr>
-                <w:ilvl w:val="0"/>
-                <w:numId w:val="11"/>
-              </w:numPr>
-              <w:pBdr/>
-              <w:spacing w:after="100"/>
-              <w:ind w:left="720"/>
-              <w:rPr>
-                <w:rFonts w:ascii="Arial" w:hAnsi="Arial" w:cs="Arial"/>
-                <w:sz w:val="18"/>
-                <w:szCs w:val="18"/>
-              </w:rPr>
-            </w:pPr>
-            <w:r>
-              <w:rPr>
-                <w:rFonts w:ascii="Arial" w:hAnsi="Arial" w:cs="Arial"/>
-                <w:b/>
-                <w:bCs/>
-                <w:sz w:val="18"/>
-                <w:szCs w:val="18"/>
-              </w:rPr>
-              <w:t>Encaminhamento: formalize e execute processo de gestão de incidentes de TIC, atentando-se, minimamente, em definir papéis, critérios de priorização e escalamento, tratamento de incidentes de serviços e de segurança da informação e registro sistemático e rastreável das ocorrências</w:t>
-            </w:r>
-          </w:p>
-          <w:p ns2:paraId="11118515" ns2:textId="02403B9E">
-            <w:pPr>
-              <w:pStyle w:val="843"/>
-              <w:numPr>
-                <w:ilvl w:val="0"/>
-                <w:numId w:val="11"/>
-              </w:numPr>
-              <w:pBdr/>
-              <w:spacing w:after="40"/>
-              <w:ind w:left="720"/>
-              <w:rPr>
-                <w:rFonts w:ascii="Arial" w:hAnsi="Arial" w:cs="Arial"/>
-                <w:sz w:val="18"/>
-                <w:szCs w:val="18"/>
-              </w:rPr>
-            </w:pPr>
-            <w:r>
-              <w:rPr>
-                <w:rFonts w:ascii="Arial" w:hAnsi="Arial" w:cs="Arial"/>
-                <w:b/>
-                <w:bCs/>
-                <w:sz w:val="18"/>
-                <w:szCs w:val="18"/>
-              </w:rPr>
-              <w:t>Poder Executivo Estadual: [C5, C12, C13];</w:t>
-            </w:r>
-          </w:p>
-          <w:p ns2:paraId="11118515" ns2:textId="02403B9E">
-            <w:pPr>
-              <w:pStyle w:val="843"/>
-              <w:numPr>
-                <w:ilvl w:val="0"/>
-                <w:numId w:val="11"/>
-              </w:numPr>
-              <w:pBdr/>
-              <w:spacing w:after="40"/>
-              <w:ind w:left="1080"/>
-              <w:rPr>
-                <w:rFonts w:ascii="Arial" w:hAnsi="Arial" w:cs="Arial"/>
-                <w:sz w:val="18"/>
-                <w:szCs w:val="18"/>
-              </w:rPr>
-            </w:pPr>
-            <w:r>
-              <w:rPr>
-                <w:rFonts w:ascii="Arial" w:hAnsi="Arial" w:cs="Arial"/>
-                <w:b/>
-                <w:bCs/>
-                <w:sz w:val="18"/>
-                <w:szCs w:val="18"/>
-              </w:rPr>
-              <w:t>Tipo: Determinação;</w:t>
-            </w:r>
-          </w:p>
-          <w:p ns2:paraId="11118515" ns2:textId="02403B9E">
-            <w:pPr>
-              <w:pStyle w:val="843"/>
-              <w:numPr>
-                <w:ilvl w:val="0"/>
-                <w:numId w:val="11"/>
-              </w:numPr>
-              <w:pBdr/>
-              <w:spacing w:after="100"/>
-              <w:ind w:left="1080"/>
-              <w:rPr>
-                <w:rFonts w:ascii="Arial" w:hAnsi="Arial" w:cs="Arial"/>
-                <w:sz w:val="18"/>
-                <w:szCs w:val="18"/>
-              </w:rPr>
-            </w:pPr>
-            <w:r>
-              <w:rPr>
-                <w:rFonts w:ascii="Arial" w:hAnsi="Arial" w:cs="Arial"/>
-                <w:b/>
-                <w:bCs/>
-                <w:sz w:val="18"/>
-                <w:szCs w:val="18"/>
-              </w:rPr>
-              <w:t>Encaminhamento: formalize e execute processo de gestão de incidentes de TIC, atentando-se, minimamente, em definir papéis, critérios de priorização e escalamento, tratamento de incidentes de serviços e de segurança da informação e registro sistemático e rastreável das ocorrências</w:t>
-            </w:r>
-          </w:p>
-          <w:p ns2:paraId="11118515" ns2:textId="02403B9E">
-            <w:pPr>
-              <w:pStyle w:val="843"/>
-              <w:numPr>
-                <w:ilvl w:val="0"/>
-                <w:numId w:val="11"/>
-              </w:numPr>
-              <w:pBdr/>
-              <w:spacing w:after="40"/>
-              <w:ind w:left="720"/>
-              <w:rPr>
-                <w:rFonts w:ascii="Arial" w:hAnsi="Arial" w:cs="Arial"/>
-                <w:sz w:val="18"/>
-                <w:szCs w:val="18"/>
-              </w:rPr>
-            </w:pPr>
-            <w:r>
-              <w:rPr>
-                <w:rFonts w:ascii="Arial" w:hAnsi="Arial" w:cs="Arial"/>
-                <w:b/>
-                <w:bCs/>
-                <w:sz w:val="18"/>
-                <w:szCs w:val="18"/>
-              </w:rPr>
-              <w:t>Poder Judiciário Estadual: [C5, C12, C14];</w:t>
-            </w:r>
-          </w:p>
-          <w:p ns2:paraId="11118515" ns2:textId="02403B9E">
-            <w:pPr>
-              <w:pStyle w:val="843"/>
-              <w:numPr>
-                <w:ilvl w:val="0"/>
-                <w:numId w:val="11"/>
-              </w:numPr>
-              <w:pBdr/>
-              <w:spacing w:after="40"/>
-              <w:ind w:left="1080"/>
-              <w:rPr>
-                <w:rFonts w:ascii="Arial" w:hAnsi="Arial" w:cs="Arial"/>
-                <w:sz w:val="18"/>
-                <w:szCs w:val="18"/>
-              </w:rPr>
-            </w:pPr>
-            <w:r>
-              <w:rPr>
-                <w:rFonts w:ascii="Arial" w:hAnsi="Arial" w:cs="Arial"/>
-                <w:b/>
-                <w:bCs/>
-                <w:sz w:val="18"/>
-                <w:szCs w:val="18"/>
-              </w:rPr>
-              <w:t>Tipo: Determinação;</w:t>
-            </w:r>
-          </w:p>
-          <w:p ns2:paraId="11118515" ns2:textId="02403B9E">
-            <w:pPr>
-              <w:pStyle w:val="843"/>
-              <w:numPr>
-                <w:ilvl w:val="0"/>
-                <w:numId w:val="11"/>
-              </w:numPr>
-              <w:pBdr/>
-              <w:spacing w:after="100"/>
-              <w:ind w:left="1080"/>
-              <w:rPr>
-                <w:rFonts w:ascii="Arial" w:hAnsi="Arial" w:cs="Arial"/>
-                <w:sz w:val="18"/>
-                <w:szCs w:val="18"/>
-              </w:rPr>
-            </w:pPr>
-            <w:r>
-              <w:rPr>
-                <w:rFonts w:ascii="Arial" w:hAnsi="Arial" w:cs="Arial"/>
-                <w:b/>
-                <w:bCs/>
-                <w:sz w:val="18"/>
-                <w:szCs w:val="18"/>
-              </w:rPr>
-              <w:t>Encaminhamento: formalize e execute processo de gestão de incidentes de TIC, atentando-se, minimamente, em definir papéis, critérios de priorização e escalamento, tratamento de incidentes de serviços e de segurança da informação e registro sistemático e rastreável das ocorrências</w:t>
-            </w:r>
-          </w:p>
-          <w:p ns2:paraId="11118515" ns2:textId="02403B9E">
-            <w:pPr>
-              <w:pStyle w:val="843"/>
-              <w:numPr>
-                <w:ilvl w:val="0"/>
-                <w:numId w:val="11"/>
-              </w:numPr>
-              <w:pBdr/>
-              <w:spacing w:after="40"/>
-              <w:ind w:left="720"/>
-              <w:rPr>
-                <w:rFonts w:ascii="Arial" w:hAnsi="Arial" w:cs="Arial"/>
-                <w:sz w:val="18"/>
-                <w:szCs w:val="18"/>
-              </w:rPr>
-            </w:pPr>
-            <w:r>
-              <w:rPr>
-                <w:rFonts w:ascii="Arial" w:hAnsi="Arial" w:cs="Arial"/>
-                <w:b/>
-                <w:bCs/>
-                <w:sz w:val="18"/>
-                <w:szCs w:val="18"/>
-              </w:rPr>
-              <w:t>Ministério Público Estadual: [C5, C12, C15];</w:t>
+              <w:t>Ministério Público Estadual: [C5, C12, C17];</w:t>
             </w:r>
           </w:p>
           <w:p ns2:paraId="11118515" ns2:textId="02403B9E">
@@ -14176,7 +12852,7 @@
                 <w:sz w:val="18"/>
                 <w:szCs w:val="18"/>
               </w:rPr>
-              <w:t>C2: Lei nº 14.133/2021, arts. 12, VII e §1º, e 18, caput e §1º, II – a fase preparatória deve compatibilizar-se com o Plano de Contratações Anual, quando elaborado, e deve ser demonstrado o alinhamento da contratação com o planejamento da Administração.</w:t>
+              <w:t>C2: Lei nº 14.133/2021, art. 12, inciso VII — as contratações devem observar o plano de contratações anual, quando elaborado, nos termos do dispositivo.</w:t>
             </w:r>
           </w:p>
           <w:p ns2:paraId="2667BB09" ns2:textId="2C1623C1">
@@ -14226,7 +12902,7 @@
                 <w:sz w:val="18"/>
                 <w:szCs w:val="18"/>
               </w:rPr>
-              <w:t>C4: Lei nº 14.133/2021, art. 7º, caput, incisos I a III e §1º: designação de agentes públicos para funções essenciais, observados atribuições, formação, segregação de funções e inexistência de vínculos que comprometam a atuação.</w:t>
+              <w:t>C4: Lei nº 14.133/2021, art. 7º, caput — a autoridade máxima deve promover a gestão por competências e designar agentes públicos para o desempenho das funções essenciais à execução da Lei.</w:t>
             </w:r>
           </w:p>
           <w:p ns2:paraId="2667BB09" ns2:textId="2C1623C1">
@@ -14276,7 +12952,7 @@
                 <w:sz w:val="18"/>
                 <w:szCs w:val="18"/>
               </w:rPr>
-              <w:t>C6: Instrução Normativa SGD/ME nº 94/2022, arts. 2º, IV, 9º, 10, 11 e 12, §6º – referência de boa prática para estruturação da fase de planejamento das contratações de TIC, instituição da Equipe de Planejamento da Contratação e participação do integrante técnico da área de TIC, observada sua aplicação direta aos integrantes do SISP e as hipóteses de simplificação de procedimentos previstas na norma.</w:t>
+              <w:t>C6: Instrução Normativa SGD/ME nº 94/2022, art. 12, § 6º — referência de boa prática quanto à assinatura do termo de referência pela Equipe de Planejamento da Contratação e pela autoridade máxima da área de TIC, seguida da aprovação pela autoridade competente.</w:t>
             </w:r>
           </w:p>
           <w:p ns2:paraId="2667BB09" ns2:textId="2C1623C1">
@@ -14301,7 +12977,7 @@
                 <w:sz w:val="18"/>
                 <w:szCs w:val="18"/>
               </w:rPr>
-              <w:t>C7: Acórdão TCE-RJ nº 44.490/2024-PLEN, itens III.7 e IV.9 – Determinações para estruturação do processo de planejamento anual das contratações, contemplando consolidação das demandas, participação das áreas, aprovação e publicidade do plano.</w:t>
+              <w:t>C7: Acórdão TCE-RJ nº 44.490/2024-PLEN, item III.7 — precedente quanto à estruturação do processo de planejamento anual das contratações, contemplando consolidação das demandas, participação das áreas, aprovação e publicidade do plano.</w:t>
             </w:r>
           </w:p>
           <w:p ns2:paraId="2667BB09" ns2:textId="2C1623C1">
@@ -14377,7 +13053,32 @@
                 <w:sz w:val="18"/>
                 <w:szCs w:val="18"/>
               </w:rPr>
-              <w:t>C9: Decreto Estadual nº 48.816/2023, no âmbito de aplicação do ato — referência específica para a fase preparatória das contratações; não é considerado, isoladamente, fundamento suficiente para determinar a composição mínima da equipe de planejamento.</w:t>
+              <w:t>C9: IN PRODERJ/PRE nº 5/2024, art. 4º — os pedidos de contratação de soluções de TIC do Poder Executivo Estadual devem ser instruídos com os documentos de planejamento definidos no dispositivo.</w:t>
+            </w:r>
+          </w:p>
+          <w:p ns2:paraId="2667BB09" ns2:textId="2C1623C1">
+            <w:pPr>
+              <w:pStyle w:val="841"/>
+              <w:pBdr/>
+              <w:spacing w:after="80"/>
+              <w:ind w:left="240"/>
+              <w:jc w:val="both"/>
+              <w:rPr>
+                <w:bCs/>
+                <w:color w:val="auto"/>
+                <w:sz w:val="18"/>
+                <w:szCs w:val="18"/>
+                <w:vertAlign w:val="superscript"/>
+              </w:rPr>
+            </w:pPr>
+            <w:r>
+              <w:rPr>
+                <w:bCs/>
+                <w:color w:val="auto"/>
+                <w:sz w:val="18"/>
+                <w:szCs w:val="18"/>
+              </w:rPr>
+              <w:t>C10: IN PRODERJ/PRE nº 5/2024, art. 5º — as contratações de TIC do Poder Executivo Estadual devem estar previstas no PEDTIC e indicadas no Plano de Contratações Anual.</w:t>
             </w:r>
           </w:p>
           <w:p ns2:paraId="2667BB09" ns2:textId="2C1623C1">
@@ -14428,7 +13129,57 @@
                 <w:sz w:val="18"/>
                 <w:szCs w:val="18"/>
               </w:rPr>
-              <w:t>C10: Resolução CNJ nº 468/2022, art. 7º — a equipe de planejamento da contratação de solução de TIC deve ser formalmente instituída e conter integrantes demandante, técnico e administrativo.</w:t>
+              <w:t>C11: Resolução CNJ nº 468/2022, art. 10 — a execução da fase de planejamento da contratação de TIC é obrigatória nas hipóteses definidas no dispositivo.</w:t>
+            </w:r>
+          </w:p>
+          <w:p ns2:paraId="2667BB09" ns2:textId="2C1623C1">
+            <w:pPr>
+              <w:pStyle w:val="841"/>
+              <w:pBdr/>
+              <w:spacing w:after="80"/>
+              <w:ind w:left="240"/>
+              <w:jc w:val="both"/>
+              <w:rPr>
+                <w:bCs/>
+                <w:color w:val="auto"/>
+                <w:sz w:val="18"/>
+                <w:szCs w:val="18"/>
+                <w:vertAlign w:val="superscript"/>
+              </w:rPr>
+            </w:pPr>
+            <w:r>
+              <w:rPr>
+                <w:bCs/>
+                <w:color w:val="auto"/>
+                <w:sz w:val="18"/>
+                <w:szCs w:val="18"/>
+              </w:rPr>
+              <w:t>C12: Resolução CNJ nº 468/2022, art. 4º — as contratações de TIC devem ser precedidas de Plano de Contratações de STIC alinhado ao PDTIC e aos planejamentos estratégicos aplicáveis.</w:t>
+            </w:r>
+          </w:p>
+          <w:p ns2:paraId="2667BB09" ns2:textId="2C1623C1">
+            <w:pPr>
+              <w:pStyle w:val="841"/>
+              <w:pBdr/>
+              <w:spacing w:after="80"/>
+              <w:ind w:left="240"/>
+              <w:jc w:val="both"/>
+              <w:rPr>
+                <w:bCs/>
+                <w:color w:val="auto"/>
+                <w:sz w:val="18"/>
+                <w:szCs w:val="18"/>
+                <w:vertAlign w:val="superscript"/>
+              </w:rPr>
+            </w:pPr>
+            <w:r>
+              <w:rPr>
+                <w:bCs/>
+                <w:color w:val="auto"/>
+                <w:sz w:val="18"/>
+                <w:szCs w:val="18"/>
+              </w:rPr>
+              <w:t>C13: Resolução CNJ nº 468/2022, art. 7º — a fase de planejamento da contratação deve ser coordenada por equipe formalmente designada e composta pelos setores demandante, técnico e administrativo.</w:t>
             </w:r>
           </w:p>
           <w:p ns2:paraId="2667BB09" ns2:textId="2C1623C1">
@@ -14479,33 +13230,7 @@
                 <w:sz w:val="18"/>
                 <w:szCs w:val="18"/>
               </w:rPr>
-              <w:t>C11: Resolução CNMP nº 283/2024, arts. 8º e 9º — a equipe de planejamento da contratação de solução de TIC deve ser instituída com integrante técnico, integrante requisitante e integrante administrativo.</w:t>
-            </w:r>
-          </w:p>
-          <w:p ns2:paraId="2667BB09" ns2:textId="2C1623C1">
-            <w:pPr>
-              <w:pStyle w:val="841"/>
-              <w:pBdr/>
-              <w:spacing w:after="60"/>
-              <w:ind/>
-              <w:jc w:val="both"/>
-              <w:rPr>
-                <w:bCs/>
-                <w:color w:val="auto"/>
-                <w:sz w:val="18"/>
-                <w:szCs w:val="18"/>
-                <w:vertAlign w:val="superscript"/>
-              </w:rPr>
-            </w:pPr>
-            <w:r>
-              <w:rPr>
-                <w:bCs/>
-                <w:color w:val="auto"/>
-                <w:sz w:val="18"/>
-                <w:szCs w:val="18"/>
-                <w:b/>
-              </w:rPr>
-              <w:t>Poder Executivo Estadual</w:t>
+              <w:t>C14: Resolução CNMP nº 283/2024, art. 8º — a etapa de planejamento da solução deve compreender, no mínimo, a instituição da equipe de planejamento, o estudo técnico preliminar e o termo de referência.</w:t>
             </w:r>
           </w:p>
           <w:p ns2:paraId="2667BB09" ns2:textId="2C1623C1">
@@ -14530,33 +13255,7 @@
                 <w:sz w:val="18"/>
                 <w:szCs w:val="18"/>
               </w:rPr>
-              <w:t>C12: IN PRODERJ/PRE nº 05/2024, arts. 1º, 4º a 8º, 11 e 28, Decreto Estadual nº 47.278/2020, art. 7º e Decreto Estadual nº 48.749/2023 — rito de planejamento com DOD, ETP, Riscos e TR, aprovação prévia técnica da área de TIC, anuência do PRODERJ e vedação de contratação fora do PEDTIC e PCA no Poder Executivo Estadual.</w:t>
-            </w:r>
-          </w:p>
-          <w:p ns2:paraId="2667BB09" ns2:textId="2C1623C1">
-            <w:pPr>
-              <w:pStyle w:val="841"/>
-              <w:pBdr/>
-              <w:spacing w:after="60"/>
-              <w:ind/>
-              <w:jc w:val="both"/>
-              <w:rPr>
-                <w:bCs/>
-                <w:color w:val="auto"/>
-                <w:sz w:val="18"/>
-                <w:szCs w:val="18"/>
-                <w:vertAlign w:val="superscript"/>
-              </w:rPr>
-            </w:pPr>
-            <w:r>
-              <w:rPr>
-                <w:bCs/>
-                <w:color w:val="auto"/>
-                <w:sz w:val="18"/>
-                <w:szCs w:val="18"/>
-                <w:b/>
-              </w:rPr>
-              <w:t>Poder Judiciário Estadual</w:t>
+              <w:t>C15: Resolução CNMP nº 283/2024, art. 5º — as contratações de TI devem constar do plano de contratações anual, observado o respectivo PDTI.</w:t>
             </w:r>
           </w:p>
           <w:p ns2:paraId="2667BB09" ns2:textId="2C1623C1">
@@ -14581,58 +13280,7 @@
                 <w:sz w:val="18"/>
                 <w:szCs w:val="18"/>
               </w:rPr>
-              <w:t>C13: Resolução CNJ nº 468/2022, arts. 4º a 7º, 10, 11, 14, 15 e 29 e Ato Normativo TJ nº 27/2022, arts. 5º e 6º — rito de planejamento das contratações de TIC, alinhamento ao PDTIC/PAC e assinatura técnica obrigatória da área de TIC no Poder Judiciário Estadual.</w:t>
-            </w:r>
-          </w:p>
-          <w:p ns2:paraId="2667BB09" ns2:textId="2C1623C1">
-            <w:pPr>
-              <w:pStyle w:val="841"/>
-              <w:pBdr/>
-              <w:spacing w:after="60"/>
-              <w:ind/>
-              <w:jc w:val="both"/>
-              <w:rPr>
-                <w:bCs/>
-                <w:color w:val="auto"/>
-                <w:sz w:val="18"/>
-                <w:szCs w:val="18"/>
-                <w:vertAlign w:val="superscript"/>
-              </w:rPr>
-            </w:pPr>
-            <w:r>
-              <w:rPr>
-                <w:bCs/>
-                <w:color w:val="auto"/>
-                <w:sz w:val="18"/>
-                <w:szCs w:val="18"/>
-                <w:b/>
-              </w:rPr>
-              <w:t>Ministério Público Estadual</w:t>
-            </w:r>
-          </w:p>
-          <w:p ns2:paraId="2667BB09" ns2:textId="2C1623C1">
-            <w:pPr>
-              <w:pStyle w:val="841"/>
-              <w:pBdr/>
-              <w:spacing w:after="80"/>
-              <w:ind w:left="240"/>
-              <w:jc w:val="both"/>
-              <w:rPr>
-                <w:bCs/>
-                <w:color w:val="auto"/>
-                <w:sz w:val="18"/>
-                <w:szCs w:val="18"/>
-                <w:vertAlign w:val="superscript"/>
-              </w:rPr>
-            </w:pPr>
-            <w:r>
-              <w:rPr>
-                <w:bCs/>
-                <w:color w:val="auto"/>
-                <w:sz w:val="18"/>
-                <w:szCs w:val="18"/>
-              </w:rPr>
-              <w:t>C14: Resolução CNMP nº 283/2024, arts. 2º, 4º a 6º, 8º a 10, 16, 17, 20 e 33 e Resolução GPGJ nº 2.785/2026, art. 13, III — rito padronizado de contratação de TI, alinhamento ao PDTI/PAC e validação/subscrição técnica compulsória no Ministério Público Estadual.</w:t>
+              <w:t>C16: Resolução CNMP nº 283/2024, art. 9º — a Equipe de Planejamento da Solução deve ser formalmente designada e conter representantes das áreas requisitante, de TI e administrativa.</w:t>
             </w:r>
           </w:p>
         </w:tc>
@@ -15034,7 +13682,7 @@
                 <w:sz w:val="18"/>
                 <w:szCs w:val="18"/>
               </w:rPr>
-              <w:t>Poder Executivo Estadual: [C1, C3, C12];</w:t>
+              <w:t>Poder Executivo Estadual: [C1, C3, C9];</w:t>
             </w:r>
           </w:p>
           <w:p ns2:paraId="11118515" ns2:textId="02403B9E">
@@ -15115,7 +13763,7 @@
                 <w:sz w:val="18"/>
                 <w:szCs w:val="18"/>
               </w:rPr>
-              <w:t>Poder Judiciário Estadual: [C1, C3, C13];</w:t>
+              <w:t>Poder Judiciário Estadual: [C1, C3, C11];</w:t>
             </w:r>
           </w:p>
           <w:p ns2:paraId="11118515" ns2:textId="02403B9E">
@@ -15343,22 +13991,22 @@
               </w:numPr>
               <w:pBdr/>
               <w:spacing w:after="40"/>
-              <w:ind w:left="720"/>
-              <w:rPr>
-                <w:rFonts w:ascii="Arial" w:hAnsi="Arial" w:cs="Arial"/>
-                <w:sz w:val="18"/>
-                <w:szCs w:val="18"/>
-              </w:rPr>
-            </w:pPr>
-            <w:r>
-              <w:rPr>
-                <w:rFonts w:ascii="Arial" w:hAnsi="Arial" w:cs="Arial"/>
-                <w:b/>
-                <w:bCs/>
-                <w:sz w:val="18"/>
-                <w:szCs w:val="18"/>
-              </w:rPr>
-              <w:t>Poder Executivo Estadual: [C1, C12];</w:t>
+              <w:ind w:left="360"/>
+              <w:rPr>
+                <w:rFonts w:ascii="Arial" w:hAnsi="Arial" w:cs="Arial"/>
+                <w:sz w:val="18"/>
+                <w:szCs w:val="18"/>
+              </w:rPr>
+            </w:pPr>
+            <w:r>
+              <w:rPr>
+                <w:rFonts w:ascii="Arial" w:hAnsi="Arial" w:cs="Arial"/>
+                <w:b/>
+                <w:bCs/>
+                <w:sz w:val="18"/>
+                <w:szCs w:val="18"/>
+              </w:rPr>
+              <w:t>Contratações de TIC sem alinhamento ao planejamento de TIC e ao Plano de Contratações Anual.[R6.3, P4, E5, C1, C2, C7];</w:t>
             </w:r>
           </w:p>
           <w:p ns2:paraId="11118515" ns2:textId="02403B9E">
@@ -15370,7 +14018,7 @@
               </w:numPr>
               <w:pBdr/>
               <w:spacing w:after="40"/>
-              <w:ind w:left="1080"/>
+              <w:ind w:left="720"/>
               <w:rPr>
                 <w:rFonts w:ascii="Arial" w:hAnsi="Arial" w:cs="Arial"/>
                 <w:sz w:val="18"/>
@@ -15397,22 +14045,22 @@
               </w:numPr>
               <w:pBdr/>
               <w:spacing w:after="100"/>
-              <w:ind w:left="1080"/>
-              <w:rPr>
-                <w:rFonts w:ascii="Arial" w:hAnsi="Arial" w:cs="Arial"/>
-                <w:sz w:val="18"/>
-                <w:szCs w:val="18"/>
-              </w:rPr>
-            </w:pPr>
-            <w:r>
-              <w:rPr>
-                <w:rFonts w:ascii="Arial" w:hAnsi="Arial" w:cs="Arial"/>
-                <w:b/>
-                <w:bCs/>
-                <w:sz w:val="18"/>
-                <w:szCs w:val="18"/>
-              </w:rPr>
-              <w:t>Encaminhamento: estabeleça a submissão das contratações de TIC à análise prévia da área de TIC, de modo a verificar a compatibilidade da solução com os padrões tecnológicos, os requisitos institucionais e a arquitetura existente, admitindo procedimentos simplificados e proporcionais à natureza, ao risco e ao valor da contratação, preservada análise técnica compatível</w:t>
+              <w:ind w:left="720"/>
+              <w:rPr>
+                <w:rFonts w:ascii="Arial" w:hAnsi="Arial" w:cs="Arial"/>
+                <w:sz w:val="18"/>
+                <w:szCs w:val="18"/>
+              </w:rPr>
+            </w:pPr>
+            <w:r>
+              <w:rPr>
+                <w:rFonts w:ascii="Arial" w:hAnsi="Arial" w:cs="Arial"/>
+                <w:b/>
+                <w:bCs/>
+                <w:sz w:val="18"/>
+                <w:szCs w:val="18"/>
+              </w:rPr>
+              <w:t>Encaminhamento: assegure que as contratações de TIC sejam compatíveis com os instrumentos de planejamento de TIC e, quando elaborado, com o Plano de Contratações Anual, promovendo os ajustes ou justificativas cabíveis nos casos excepcionais</w:t>
             </w:r>
           </w:p>
           <w:p ns2:paraId="11118515" ns2:textId="02403B9E">
@@ -15439,7 +14087,7 @@
                 <w:sz w:val="18"/>
                 <w:szCs w:val="18"/>
               </w:rPr>
-              <w:t>Poder Judiciário Estadual: [C1, C13];</w:t>
+              <w:t>Poder Executivo Estadual: [C1, C2, C10];</w:t>
             </w:r>
           </w:p>
           <w:p ns2:paraId="11118515" ns2:textId="02403B9E">
@@ -15493,7 +14141,7 @@
                 <w:sz w:val="18"/>
                 <w:szCs w:val="18"/>
               </w:rPr>
-              <w:t>Encaminhamento: estabeleça a submissão das contratações de TIC à análise prévia da área de TIC, de modo a verificar a compatibilidade da solução com os padrões tecnológicos, os requisitos institucionais e a arquitetura existente, admitindo procedimentos simplificados e proporcionais à natureza, ao risco e ao valor da contratação, preservada análise técnica compatível</w:t>
+              <w:t>Encaminhamento: assegure que as contratações de TIC sejam compatíveis com os instrumentos de planejamento de TIC e, quando elaborado, com o Plano de Contratações Anual, promovendo os ajustes ou justificativas cabíveis nos casos excepcionais</w:t>
             </w:r>
           </w:p>
           <w:p ns2:paraId="11118515" ns2:textId="02403B9E">
@@ -15520,7 +14168,7 @@
                 <w:sz w:val="18"/>
                 <w:szCs w:val="18"/>
               </w:rPr>
-              <w:t>Ministério Público Estadual: [C1, C14];</w:t>
+              <w:t>Poder Judiciário Estadual: [C1, C2, C12];</w:t>
             </w:r>
           </w:p>
           <w:p ns2:paraId="11118515" ns2:textId="02403B9E">
@@ -15574,7 +14222,7 @@
                 <w:sz w:val="18"/>
                 <w:szCs w:val="18"/>
               </w:rPr>
-              <w:t>Encaminhamento: estabeleça a submissão das contratações de TIC à análise prévia da área de TIC, de modo a verificar a compatibilidade da solução com os padrões tecnológicos, os requisitos institucionais e a arquitetura existente, admitindo procedimentos simplificados e proporcionais à natureza, ao risco e ao valor da contratação, preservada análise técnica compatível</w:t>
+              <w:t>Encaminhamento: assegure que as contratações de TIC sejam compatíveis com os instrumentos de planejamento de TIC e, quando elaborado, com o Plano de Contratações Anual, promovendo os ajustes ou justificativas cabíveis nos casos excepcionais</w:t>
             </w:r>
           </w:p>
           <w:p ns2:paraId="11118515" ns2:textId="02403B9E">
@@ -15586,22 +14234,22 @@
               </w:numPr>
               <w:pBdr/>
               <w:spacing w:after="40"/>
-              <w:ind w:left="360"/>
-              <w:rPr>
-                <w:rFonts w:ascii="Arial" w:hAnsi="Arial" w:cs="Arial"/>
-                <w:sz w:val="18"/>
-                <w:szCs w:val="18"/>
-              </w:rPr>
-            </w:pPr>
-            <w:r>
-              <w:rPr>
-                <w:rFonts w:ascii="Arial" w:hAnsi="Arial" w:cs="Arial"/>
-                <w:b/>
-                <w:bCs/>
-                <w:sz w:val="18"/>
-                <w:szCs w:val="18"/>
-              </w:rPr>
-              <w:t>Contratações de TIC sem alinhamento ao planejamento de TIC e ao Plano de Contratações Anual.[R6.3, P4, E5, C1, C2, C7];</w:t>
+              <w:ind w:left="720"/>
+              <w:rPr>
+                <w:rFonts w:ascii="Arial" w:hAnsi="Arial" w:cs="Arial"/>
+                <w:sz w:val="18"/>
+                <w:szCs w:val="18"/>
+              </w:rPr>
+            </w:pPr>
+            <w:r>
+              <w:rPr>
+                <w:rFonts w:ascii="Arial" w:hAnsi="Arial" w:cs="Arial"/>
+                <w:b/>
+                <w:bCs/>
+                <w:sz w:val="18"/>
+                <w:szCs w:val="18"/>
+              </w:rPr>
+              <w:t>Ministério Público Estadual: [C1, C2, C15];</w:t>
             </w:r>
           </w:p>
           <w:p ns2:paraId="11118515" ns2:textId="02403B9E">
@@ -15613,7 +14261,7 @@
               </w:numPr>
               <w:pBdr/>
               <w:spacing w:after="40"/>
-              <w:ind w:left="720"/>
+              <w:ind w:left="1080"/>
               <w:rPr>
                 <w:rFonts w:ascii="Arial" w:hAnsi="Arial" w:cs="Arial"/>
                 <w:sz w:val="18"/>
@@ -15640,7 +14288,7 @@
               </w:numPr>
               <w:pBdr/>
               <w:spacing w:after="100"/>
-              <w:ind w:left="720"/>
+              <w:ind w:left="1080"/>
               <w:rPr>
                 <w:rFonts w:ascii="Arial" w:hAnsi="Arial" w:cs="Arial"/>
                 <w:sz w:val="18"/>
@@ -15667,22 +14315,22 @@
               </w:numPr>
               <w:pBdr/>
               <w:spacing w:after="40"/>
-              <w:ind w:left="720"/>
-              <w:rPr>
-                <w:rFonts w:ascii="Arial" w:hAnsi="Arial" w:cs="Arial"/>
-                <w:sz w:val="18"/>
-                <w:szCs w:val="18"/>
-              </w:rPr>
-            </w:pPr>
-            <w:r>
-              <w:rPr>
-                <w:rFonts w:ascii="Arial" w:hAnsi="Arial" w:cs="Arial"/>
-                <w:b/>
-                <w:bCs/>
-                <w:sz w:val="18"/>
-                <w:szCs w:val="18"/>
-              </w:rPr>
-              <w:t>Poder Executivo Estadual: [C1, C2, C7, C12];</w:t>
+              <w:ind w:left="360"/>
+              <w:rPr>
+                <w:rFonts w:ascii="Arial" w:hAnsi="Arial" w:cs="Arial"/>
+                <w:sz w:val="18"/>
+                <w:szCs w:val="18"/>
+              </w:rPr>
+            </w:pPr>
+            <w:r>
+              <w:rPr>
+                <w:rFonts w:ascii="Arial" w:hAnsi="Arial" w:cs="Arial"/>
+                <w:b/>
+                <w:bCs/>
+                <w:sz w:val="18"/>
+                <w:szCs w:val="18"/>
+              </w:rPr>
+              <w:t>Contratações de TIC sem designação de equipe de planejamento com integrante técnico da área de TIC.[R6.4, P5, E6, C1, C4, C6];</w:t>
             </w:r>
           </w:p>
           <w:p ns2:paraId="11118515" ns2:textId="02403B9E">
@@ -15694,22 +14342,22 @@
               </w:numPr>
               <w:pBdr/>
               <w:spacing w:after="40"/>
-              <w:ind w:left="1080"/>
-              <w:rPr>
-                <w:rFonts w:ascii="Arial" w:hAnsi="Arial" w:cs="Arial"/>
-                <w:sz w:val="18"/>
-                <w:szCs w:val="18"/>
-              </w:rPr>
-            </w:pPr>
-            <w:r>
-              <w:rPr>
-                <w:rFonts w:ascii="Arial" w:hAnsi="Arial" w:cs="Arial"/>
-                <w:b/>
-                <w:bCs/>
-                <w:sz w:val="18"/>
-                <w:szCs w:val="18"/>
-              </w:rPr>
-              <w:t>Tipo: Determinação;</w:t>
+              <w:ind w:left="720"/>
+              <w:rPr>
+                <w:rFonts w:ascii="Arial" w:hAnsi="Arial" w:cs="Arial"/>
+                <w:sz w:val="18"/>
+                <w:szCs w:val="18"/>
+              </w:rPr>
+            </w:pPr>
+            <w:r>
+              <w:rPr>
+                <w:rFonts w:ascii="Arial" w:hAnsi="Arial" w:cs="Arial"/>
+                <w:b/>
+                <w:bCs/>
+                <w:sz w:val="18"/>
+                <w:szCs w:val="18"/>
+              </w:rPr>
+              <w:t>Tipo: Recomendação;</w:t>
             </w:r>
           </w:p>
           <w:p ns2:paraId="11118515" ns2:textId="02403B9E">
@@ -15721,22 +14369,22 @@
               </w:numPr>
               <w:pBdr/>
               <w:spacing w:after="100"/>
-              <w:ind w:left="1080"/>
-              <w:rPr>
-                <w:rFonts w:ascii="Arial" w:hAnsi="Arial" w:cs="Arial"/>
-                <w:sz w:val="18"/>
-                <w:szCs w:val="18"/>
-              </w:rPr>
-            </w:pPr>
-            <w:r>
-              <w:rPr>
-                <w:rFonts w:ascii="Arial" w:hAnsi="Arial" w:cs="Arial"/>
-                <w:b/>
-                <w:bCs/>
-                <w:sz w:val="18"/>
-                <w:szCs w:val="18"/>
-              </w:rPr>
-              <w:t>Encaminhamento: assegure que as contratações de TIC sejam compatíveis com os instrumentos de planejamento de TIC e, quando elaborado, com o Plano de Contratações Anual, promovendo os ajustes ou justificativas cabíveis nos casos excepcionais</w:t>
+              <w:ind w:left="720"/>
+              <w:rPr>
+                <w:rFonts w:ascii="Arial" w:hAnsi="Arial" w:cs="Arial"/>
+                <w:sz w:val="18"/>
+                <w:szCs w:val="18"/>
+              </w:rPr>
+            </w:pPr>
+            <w:r>
+              <w:rPr>
+                <w:rFonts w:ascii="Arial" w:hAnsi="Arial" w:cs="Arial"/>
+                <w:b/>
+                <w:bCs/>
+                <w:sz w:val="18"/>
+                <w:szCs w:val="18"/>
+              </w:rPr>
+              <w:t>Encaminhamento: designe formalmente equipe de planejamento para as contratações de TIC, atentando-se, minimamente, em assegurar a participação de integrante da área requisitante e da área técnica de TIC, com definição das responsabilidades de seus integrantes</w:t>
             </w:r>
           </w:p>
           <w:p ns2:paraId="11118515" ns2:textId="02403B9E">
@@ -15763,7 +14411,7 @@
                 <w:sz w:val="18"/>
                 <w:szCs w:val="18"/>
               </w:rPr>
-              <w:t>Poder Judiciário Estadual: [C1, C2, C7, C13];</w:t>
+              <w:t>Poder Judiciário Estadual: [C1, C4, C13];</w:t>
             </w:r>
           </w:p>
           <w:p ns2:paraId="11118515" ns2:textId="02403B9E">
@@ -15817,7 +14465,7 @@
                 <w:sz w:val="18"/>
                 <w:szCs w:val="18"/>
               </w:rPr>
-              <w:t>Encaminhamento: assegure que as contratações de TIC sejam compatíveis com os instrumentos de planejamento de TIC e, quando elaborado, com o Plano de Contratações Anual, promovendo os ajustes ou justificativas cabíveis nos casos excepcionais</w:t>
+              <w:t>Encaminhamento: designe formalmente equipe de planejamento para as contratações de TIC, atentando-se, minimamente, em assegurar a participação de integrante da área requisitante e da área técnica de TIC, com definição das responsabilidades de seus integrantes</w:t>
             </w:r>
           </w:p>
           <w:p ns2:paraId="11118515" ns2:textId="02403B9E">
@@ -15844,331 +14492,7 @@
                 <w:sz w:val="18"/>
                 <w:szCs w:val="18"/>
               </w:rPr>
-              <w:t>Ministério Público Estadual: [C1, C2, C7, C14];</w:t>
-            </w:r>
-          </w:p>
-          <w:p ns2:paraId="11118515" ns2:textId="02403B9E">
-            <w:pPr>
-              <w:pStyle w:val="843"/>
-              <w:numPr>
-                <w:ilvl w:val="0"/>
-                <w:numId w:val="11"/>
-              </w:numPr>
-              <w:pBdr/>
-              <w:spacing w:after="40"/>
-              <w:ind w:left="1080"/>
-              <w:rPr>
-                <w:rFonts w:ascii="Arial" w:hAnsi="Arial" w:cs="Arial"/>
-                <w:sz w:val="18"/>
-                <w:szCs w:val="18"/>
-              </w:rPr>
-            </w:pPr>
-            <w:r>
-              <w:rPr>
-                <w:rFonts w:ascii="Arial" w:hAnsi="Arial" w:cs="Arial"/>
-                <w:b/>
-                <w:bCs/>
-                <w:sz w:val="18"/>
-                <w:szCs w:val="18"/>
-              </w:rPr>
-              <w:t>Tipo: Determinação;</w:t>
-            </w:r>
-          </w:p>
-          <w:p ns2:paraId="11118515" ns2:textId="02403B9E">
-            <w:pPr>
-              <w:pStyle w:val="843"/>
-              <w:numPr>
-                <w:ilvl w:val="0"/>
-                <w:numId w:val="11"/>
-              </w:numPr>
-              <w:pBdr/>
-              <w:spacing w:after="100"/>
-              <w:ind w:left="1080"/>
-              <w:rPr>
-                <w:rFonts w:ascii="Arial" w:hAnsi="Arial" w:cs="Arial"/>
-                <w:sz w:val="18"/>
-                <w:szCs w:val="18"/>
-              </w:rPr>
-            </w:pPr>
-            <w:r>
-              <w:rPr>
-                <w:rFonts w:ascii="Arial" w:hAnsi="Arial" w:cs="Arial"/>
-                <w:b/>
-                <w:bCs/>
-                <w:sz w:val="18"/>
-                <w:szCs w:val="18"/>
-              </w:rPr>
-              <w:t>Encaminhamento: assegure que as contratações de TIC sejam compatíveis com os instrumentos de planejamento de TIC e, quando elaborado, com o Plano de Contratações Anual, promovendo os ajustes ou justificativas cabíveis nos casos excepcionais</w:t>
-            </w:r>
-          </w:p>
-          <w:p ns2:paraId="11118515" ns2:textId="02403B9E">
-            <w:pPr>
-              <w:pStyle w:val="843"/>
-              <w:numPr>
-                <w:ilvl w:val="0"/>
-                <w:numId w:val="11"/>
-              </w:numPr>
-              <w:pBdr/>
-              <w:spacing w:after="40"/>
-              <w:ind w:left="360"/>
-              <w:rPr>
-                <w:rFonts w:ascii="Arial" w:hAnsi="Arial" w:cs="Arial"/>
-                <w:sz w:val="18"/>
-                <w:szCs w:val="18"/>
-              </w:rPr>
-            </w:pPr>
-            <w:r>
-              <w:rPr>
-                <w:rFonts w:ascii="Arial" w:hAnsi="Arial" w:cs="Arial"/>
-                <w:b/>
-                <w:bCs/>
-                <w:sz w:val="18"/>
-                <w:szCs w:val="18"/>
-              </w:rPr>
-              <w:t>Contratações de TIC sem designação de equipe de planejamento com integrante técnico da área de TIC.[R6.4, P5, E6, C1, C4, C6];</w:t>
-            </w:r>
-          </w:p>
-          <w:p ns2:paraId="11118515" ns2:textId="02403B9E">
-            <w:pPr>
-              <w:pStyle w:val="843"/>
-              <w:numPr>
-                <w:ilvl w:val="0"/>
-                <w:numId w:val="11"/>
-              </w:numPr>
-              <w:pBdr/>
-              <w:spacing w:after="40"/>
-              <w:ind w:left="720"/>
-              <w:rPr>
-                <w:rFonts w:ascii="Arial" w:hAnsi="Arial" w:cs="Arial"/>
-                <w:sz w:val="18"/>
-                <w:szCs w:val="18"/>
-              </w:rPr>
-            </w:pPr>
-            <w:r>
-              <w:rPr>
-                <w:rFonts w:ascii="Arial" w:hAnsi="Arial" w:cs="Arial"/>
-                <w:b/>
-                <w:bCs/>
-                <w:sz w:val="18"/>
-                <w:szCs w:val="18"/>
-              </w:rPr>
-              <w:t>Tipo: Recomendação;</w:t>
-            </w:r>
-          </w:p>
-          <w:p ns2:paraId="11118515" ns2:textId="02403B9E">
-            <w:pPr>
-              <w:pStyle w:val="843"/>
-              <w:numPr>
-                <w:ilvl w:val="0"/>
-                <w:numId w:val="11"/>
-              </w:numPr>
-              <w:pBdr/>
-              <w:spacing w:after="100"/>
-              <w:ind w:left="720"/>
-              <w:rPr>
-                <w:rFonts w:ascii="Arial" w:hAnsi="Arial" w:cs="Arial"/>
-                <w:sz w:val="18"/>
-                <w:szCs w:val="18"/>
-              </w:rPr>
-            </w:pPr>
-            <w:r>
-              <w:rPr>
-                <w:rFonts w:ascii="Arial" w:hAnsi="Arial" w:cs="Arial"/>
-                <w:b/>
-                <w:bCs/>
-                <w:sz w:val="18"/>
-                <w:szCs w:val="18"/>
-              </w:rPr>
-              <w:t>Encaminhamento: designe formalmente equipe de planejamento para as contratações de TIC, atentando-se, minimamente, em assegurar a participação de integrante da área requisitante e da área técnica de TIC, com definição das responsabilidades de seus integrantes</w:t>
-            </w:r>
-          </w:p>
-          <w:p ns2:paraId="11118515" ns2:textId="02403B9E">
-            <w:pPr>
-              <w:pStyle w:val="843"/>
-              <w:numPr>
-                <w:ilvl w:val="0"/>
-                <w:numId w:val="11"/>
-              </w:numPr>
-              <w:pBdr/>
-              <w:spacing w:after="40"/>
-              <w:ind w:left="720"/>
-              <w:rPr>
-                <w:rFonts w:ascii="Arial" w:hAnsi="Arial" w:cs="Arial"/>
-                <w:sz w:val="18"/>
-                <w:szCs w:val="18"/>
-              </w:rPr>
-            </w:pPr>
-            <w:r>
-              <w:rPr>
-                <w:rFonts w:ascii="Arial" w:hAnsi="Arial" w:cs="Arial"/>
-                <w:b/>
-                <w:bCs/>
-                <w:sz w:val="18"/>
-                <w:szCs w:val="18"/>
-              </w:rPr>
-              <w:t>Poder Executivo Estadual: [C1, C4, C9];</w:t>
-            </w:r>
-          </w:p>
-          <w:p ns2:paraId="11118515" ns2:textId="02403B9E">
-            <w:pPr>
-              <w:pStyle w:val="843"/>
-              <w:numPr>
-                <w:ilvl w:val="0"/>
-                <w:numId w:val="11"/>
-              </w:numPr>
-              <w:pBdr/>
-              <w:spacing w:after="40"/>
-              <w:ind w:left="1080"/>
-              <w:rPr>
-                <w:rFonts w:ascii="Arial" w:hAnsi="Arial" w:cs="Arial"/>
-                <w:sz w:val="18"/>
-                <w:szCs w:val="18"/>
-              </w:rPr>
-            </w:pPr>
-            <w:r>
-              <w:rPr>
-                <w:rFonts w:ascii="Arial" w:hAnsi="Arial" w:cs="Arial"/>
-                <w:b/>
-                <w:bCs/>
-                <w:sz w:val="18"/>
-                <w:szCs w:val="18"/>
-              </w:rPr>
-              <w:t>Tipo: Recomendação;</w:t>
-            </w:r>
-          </w:p>
-          <w:p ns2:paraId="11118515" ns2:textId="02403B9E">
-            <w:pPr>
-              <w:pStyle w:val="843"/>
-              <w:numPr>
-                <w:ilvl w:val="0"/>
-                <w:numId w:val="11"/>
-              </w:numPr>
-              <w:pBdr/>
-              <w:spacing w:after="100"/>
-              <w:ind w:left="1080"/>
-              <w:rPr>
-                <w:rFonts w:ascii="Arial" w:hAnsi="Arial" w:cs="Arial"/>
-                <w:sz w:val="18"/>
-                <w:szCs w:val="18"/>
-              </w:rPr>
-            </w:pPr>
-            <w:r>
-              <w:rPr>
-                <w:rFonts w:ascii="Arial" w:hAnsi="Arial" w:cs="Arial"/>
-                <w:b/>
-                <w:bCs/>
-                <w:sz w:val="18"/>
-                <w:szCs w:val="18"/>
-              </w:rPr>
-              <w:t>Encaminhamento: designe formalmente equipe de planejamento para as contratações de TIC, atentando-se, minimamente, em assegurar a participação de integrante da área requisitante e da área técnica de TIC, com definição das responsabilidades de seus integrantes</w:t>
-            </w:r>
-          </w:p>
-          <w:p ns2:paraId="11118515" ns2:textId="02403B9E">
-            <w:pPr>
-              <w:pStyle w:val="843"/>
-              <w:numPr>
-                <w:ilvl w:val="0"/>
-                <w:numId w:val="11"/>
-              </w:numPr>
-              <w:pBdr/>
-              <w:spacing w:after="40"/>
-              <w:ind w:left="720"/>
-              <w:rPr>
-                <w:rFonts w:ascii="Arial" w:hAnsi="Arial" w:cs="Arial"/>
-                <w:sz w:val="18"/>
-                <w:szCs w:val="18"/>
-              </w:rPr>
-            </w:pPr>
-            <w:r>
-              <w:rPr>
-                <w:rFonts w:ascii="Arial" w:hAnsi="Arial" w:cs="Arial"/>
-                <w:b/>
-                <w:bCs/>
-                <w:sz w:val="18"/>
-                <w:szCs w:val="18"/>
-              </w:rPr>
-              <w:t>Poder Judiciário Estadual: [C1, C4, C10];</w:t>
-            </w:r>
-          </w:p>
-          <w:p ns2:paraId="11118515" ns2:textId="02403B9E">
-            <w:pPr>
-              <w:pStyle w:val="843"/>
-              <w:numPr>
-                <w:ilvl w:val="0"/>
-                <w:numId w:val="11"/>
-              </w:numPr>
-              <w:pBdr/>
-              <w:spacing w:after="40"/>
-              <w:ind w:left="1080"/>
-              <w:rPr>
-                <w:rFonts w:ascii="Arial" w:hAnsi="Arial" w:cs="Arial"/>
-                <w:sz w:val="18"/>
-                <w:szCs w:val="18"/>
-              </w:rPr>
-            </w:pPr>
-            <w:r>
-              <w:rPr>
-                <w:rFonts w:ascii="Arial" w:hAnsi="Arial" w:cs="Arial"/>
-                <w:b/>
-                <w:bCs/>
-                <w:sz w:val="18"/>
-                <w:szCs w:val="18"/>
-              </w:rPr>
-              <w:t>Tipo: Determinação;</w:t>
-            </w:r>
-          </w:p>
-          <w:p ns2:paraId="11118515" ns2:textId="02403B9E">
-            <w:pPr>
-              <w:pStyle w:val="843"/>
-              <w:numPr>
-                <w:ilvl w:val="0"/>
-                <w:numId w:val="11"/>
-              </w:numPr>
-              <w:pBdr/>
-              <w:spacing w:after="100"/>
-              <w:ind w:left="1080"/>
-              <w:rPr>
-                <w:rFonts w:ascii="Arial" w:hAnsi="Arial" w:cs="Arial"/>
-                <w:sz w:val="18"/>
-                <w:szCs w:val="18"/>
-              </w:rPr>
-            </w:pPr>
-            <w:r>
-              <w:rPr>
-                <w:rFonts w:ascii="Arial" w:hAnsi="Arial" w:cs="Arial"/>
-                <w:b/>
-                <w:bCs/>
-                <w:sz w:val="18"/>
-                <w:szCs w:val="18"/>
-              </w:rPr>
-              <w:t>Encaminhamento: designe formalmente equipe de planejamento para as contratações de TIC, atentando-se, minimamente, em assegurar a participação de integrante da área requisitante e da área técnica de TIC, com definição das responsabilidades de seus integrantes</w:t>
-            </w:r>
-          </w:p>
-          <w:p ns2:paraId="11118515" ns2:textId="02403B9E">
-            <w:pPr>
-              <w:pStyle w:val="843"/>
-              <w:numPr>
-                <w:ilvl w:val="0"/>
-                <w:numId w:val="11"/>
-              </w:numPr>
-              <w:pBdr/>
-              <w:spacing w:after="40"/>
-              <w:ind w:left="720"/>
-              <w:rPr>
-                <w:rFonts w:ascii="Arial" w:hAnsi="Arial" w:cs="Arial"/>
-                <w:sz w:val="18"/>
-                <w:szCs w:val="18"/>
-              </w:rPr>
-            </w:pPr>
-            <w:r>
-              <w:rPr>
-                <w:rFonts w:ascii="Arial" w:hAnsi="Arial" w:cs="Arial"/>
-                <w:b/>
-                <w:bCs/>
-                <w:sz w:val="18"/>
-                <w:szCs w:val="18"/>
-              </w:rPr>
-              <w:t>Ministério Público Estadual: [C1, C4, C11];</w:t>
+              <w:t>Ministério Público Estadual: [C1, C4, C16];</w:t>
             </w:r>
           </w:p>
           <w:p ns2:paraId="11118515" ns2:textId="02403B9E">

</xml_diff>